<commit_message>
0.0.1 - MVP 1 - Batch 1: Phaser setup and documentation updates
- Created base HTML, CSS, and main.js with Phaser 3 CDN and a simple test scene.
- Updated TECHNICAL.md:
  - Section 5.6: added step-by-step explanation requirements for non-technical users.
  - Section 5.7: added end-of-batch test checklist guidelines.
  - Section 5.8: added documentation update reminders at the end of each session.
</commit_message>
<xml_diff>
--- a/Docs/Technical.docx
+++ b/Docs/Technical.docx
@@ -7,13 +7,8 @@
         <w:pStyle w:val="Heading1"/>
       </w:pPr>
       <w:r>
-        <w:t xml:space="preserve">Stack </w:t>
-      </w:r>
-      <w:proofErr w:type="spellStart"/>
-      <w:r>
-        <w:t>tecnologico</w:t>
-      </w:r>
-      <w:proofErr w:type="spellEnd"/>
+        <w:t>Stack tecnologico</w:t>
+      </w:r>
     </w:p>
     <w:p>
       <w:pPr>
@@ -22,21 +17,12 @@
           <w:numId w:val="1"/>
         </w:numPr>
       </w:pPr>
-      <w:proofErr w:type="spellStart"/>
       <w:r>
         <w:rPr>
           <w:b/>
           <w:bCs/>
         </w:rPr>
-        <w:t>Linguaggio</w:t>
-      </w:r>
-      <w:proofErr w:type="spellEnd"/>
-      <w:r>
-        <w:rPr>
-          <w:b/>
-          <w:bCs/>
-        </w:rPr>
-        <w:t>:</w:t>
+        <w:t>Linguaggio:</w:t>
       </w:r>
       <w:r>
         <w:t> JavaScript (ES6+)</w:t>
@@ -64,21 +50,7 @@
         <w:rPr>
           <w:lang w:val="it-IT"/>
         </w:rPr>
-        <w:t> </w:t>
-      </w:r>
-      <w:proofErr w:type="spellStart"/>
-      <w:r>
-        <w:rPr>
-          <w:lang w:val="it-IT"/>
-        </w:rPr>
-        <w:t>Phaser</w:t>
-      </w:r>
-      <w:proofErr w:type="spellEnd"/>
-      <w:r>
-        <w:rPr>
-          <w:lang w:val="it-IT"/>
-        </w:rPr>
-        <w:t xml:space="preserve"> 3 (caricato da CDN)</w:t>
+        <w:t> Phaser 3 (caricato da CDN)</w:t>
       </w:r>
     </w:p>
     <w:p>
@@ -113,21 +85,12 @@
           <w:numId w:val="1"/>
         </w:numPr>
       </w:pPr>
-      <w:proofErr w:type="spellStart"/>
       <w:r>
         <w:rPr>
           <w:b/>
           <w:bCs/>
         </w:rPr>
-        <w:t>Struttura</w:t>
-      </w:r>
-      <w:proofErr w:type="spellEnd"/>
-      <w:r>
-        <w:rPr>
-          <w:b/>
-          <w:bCs/>
-        </w:rPr>
-        <w:t xml:space="preserve"> file:</w:t>
+        <w:t>Struttura file:</w:t>
       </w:r>
     </w:p>
     <w:p>
@@ -144,21 +107,7 @@
         <w:rPr>
           <w:lang w:val="it-IT"/>
         </w:rPr>
-        <w:t xml:space="preserve">index.html – punto di ingresso, carica </w:t>
-      </w:r>
-      <w:proofErr w:type="spellStart"/>
-      <w:r>
-        <w:rPr>
-          <w:lang w:val="it-IT"/>
-        </w:rPr>
-        <w:t>Phaser</w:t>
-      </w:r>
-      <w:proofErr w:type="spellEnd"/>
-      <w:r>
-        <w:rPr>
-          <w:lang w:val="it-IT"/>
-        </w:rPr>
-        <w:t xml:space="preserve"> e gli script</w:t>
+        <w:t>index.html – punto di ingresso, carica Phaser e gli script</w:t>
       </w:r>
     </w:p>
     <w:p>
@@ -171,19 +120,11 @@
           <w:lang w:val="it-IT"/>
         </w:rPr>
       </w:pPr>
-      <w:proofErr w:type="spellStart"/>
-      <w:r>
-        <w:rPr>
-          <w:lang w:val="it-IT"/>
-        </w:rPr>
-        <w:t>css</w:t>
-      </w:r>
-      <w:proofErr w:type="spellEnd"/>
-      <w:r>
-        <w:rPr>
-          <w:lang w:val="it-IT"/>
-        </w:rPr>
-        <w:t>/style.css – stili per UI HTML sovrapposta</w:t>
+      <w:r>
+        <w:rPr>
+          <w:lang w:val="it-IT"/>
+        </w:rPr>
+        <w:t>css/style.css – stili per UI HTML sovrapposta</w:t>
       </w:r>
     </w:p>
     <w:p>
@@ -196,33 +137,11 @@
           <w:lang w:val="it-IT"/>
         </w:rPr>
       </w:pPr>
-      <w:proofErr w:type="spellStart"/>
-      <w:r>
-        <w:rPr>
-          <w:lang w:val="it-IT"/>
-        </w:rPr>
-        <w:t>js</w:t>
-      </w:r>
-      <w:proofErr w:type="spellEnd"/>
-      <w:r>
-        <w:rPr>
-          <w:lang w:val="it-IT"/>
-        </w:rPr>
-        <w:t xml:space="preserve">/main.js – inizializzazione di </w:t>
-      </w:r>
-      <w:proofErr w:type="spellStart"/>
-      <w:r>
-        <w:rPr>
-          <w:lang w:val="it-IT"/>
-        </w:rPr>
-        <w:t>Phaser</w:t>
-      </w:r>
-      <w:proofErr w:type="spellEnd"/>
-      <w:r>
-        <w:rPr>
-          <w:lang w:val="it-IT"/>
-        </w:rPr>
-        <w:t xml:space="preserve"> e configurazione globale</w:t>
+      <w:r>
+        <w:rPr>
+          <w:lang w:val="it-IT"/>
+        </w:rPr>
+        <w:t>js/main.js – inizializzazione di Phaser e configurazione globale</w:t>
       </w:r>
     </w:p>
     <w:p>
@@ -235,33 +154,11 @@
           <w:lang w:val="it-IT"/>
         </w:rPr>
       </w:pPr>
-      <w:proofErr w:type="spellStart"/>
-      <w:r>
-        <w:rPr>
-          <w:lang w:val="it-IT"/>
-        </w:rPr>
-        <w:t>js</w:t>
-      </w:r>
-      <w:proofErr w:type="spellEnd"/>
-      <w:r>
-        <w:rPr>
-          <w:lang w:val="it-IT"/>
-        </w:rPr>
-        <w:t xml:space="preserve">/world.js – griglia spaziale, </w:t>
-      </w:r>
-      <w:proofErr w:type="spellStart"/>
-      <w:r>
-        <w:rPr>
-          <w:lang w:val="it-IT"/>
-        </w:rPr>
-        <w:t>layer</w:t>
-      </w:r>
-      <w:proofErr w:type="spellEnd"/>
-      <w:r>
-        <w:rPr>
-          <w:lang w:val="it-IT"/>
-        </w:rPr>
-        <w:t xml:space="preserve"> di densità, query spaziali</w:t>
+      <w:r>
+        <w:rPr>
+          <w:lang w:val="it-IT"/>
+        </w:rPr>
+        <w:t>js/world.js – griglia spaziale, layer di densità, query spaziali</w:t>
       </w:r>
     </w:p>
     <w:p>
@@ -274,19 +171,11 @@
           <w:lang w:val="it-IT"/>
         </w:rPr>
       </w:pPr>
-      <w:proofErr w:type="spellStart"/>
-      <w:r>
-        <w:rPr>
-          <w:lang w:val="it-IT"/>
-        </w:rPr>
-        <w:t>js</w:t>
-      </w:r>
-      <w:proofErr w:type="spellEnd"/>
-      <w:r>
-        <w:rPr>
-          <w:lang w:val="it-IT"/>
-        </w:rPr>
-        <w:t>/units.js – classi per pop, unità, branchi</w:t>
+      <w:r>
+        <w:rPr>
+          <w:lang w:val="it-IT"/>
+        </w:rPr>
+        <w:t>js/units.js – classi per pop, unità, branchi</w:t>
       </w:r>
     </w:p>
     <w:p>
@@ -299,19 +188,11 @@
           <w:lang w:val="it-IT"/>
         </w:rPr>
       </w:pPr>
-      <w:proofErr w:type="spellStart"/>
-      <w:r>
-        <w:rPr>
-          <w:lang w:val="it-IT"/>
-        </w:rPr>
-        <w:t>js</w:t>
-      </w:r>
-      <w:proofErr w:type="spellEnd"/>
-      <w:r>
-        <w:rPr>
-          <w:lang w:val="it-IT"/>
-        </w:rPr>
-        <w:t>/resources.js – logica di raccolta, consumo, deterioramento (futuro)</w:t>
+      <w:r>
+        <w:rPr>
+          <w:lang w:val="it-IT"/>
+        </w:rPr>
+        <w:t>js/resources.js – logica di raccolta, consumo, deterioramento (futuro)</w:t>
       </w:r>
     </w:p>
     <w:p>
@@ -324,33 +205,11 @@
           <w:lang w:val="it-IT"/>
         </w:rPr>
       </w:pPr>
-      <w:proofErr w:type="spellStart"/>
-      <w:r>
-        <w:rPr>
-          <w:lang w:val="it-IT"/>
-        </w:rPr>
-        <w:t>js</w:t>
-      </w:r>
-      <w:proofErr w:type="spellEnd"/>
-      <w:r>
-        <w:rPr>
-          <w:lang w:val="it-IT"/>
-        </w:rPr>
-        <w:t xml:space="preserve">/ui.js – interfaccia utente, pannelli, </w:t>
-      </w:r>
-      <w:proofErr w:type="spellStart"/>
-      <w:r>
-        <w:rPr>
-          <w:lang w:val="it-IT"/>
-        </w:rPr>
-        <w:t>tooltip</w:t>
-      </w:r>
-      <w:proofErr w:type="spellEnd"/>
-      <w:r>
-        <w:rPr>
-          <w:lang w:val="it-IT"/>
-        </w:rPr>
-        <w:t xml:space="preserve"> (futuro)</w:t>
+      <w:r>
+        <w:rPr>
+          <w:lang w:val="it-IT"/>
+        </w:rPr>
+        <w:t>js/ui.js – interfaccia utente, pannelli, tooltip (futuro)</w:t>
       </w:r>
     </w:p>
     <w:p>
@@ -363,19 +222,11 @@
           <w:lang w:val="it-IT"/>
         </w:rPr>
       </w:pPr>
-      <w:proofErr w:type="spellStart"/>
-      <w:r>
-        <w:rPr>
-          <w:lang w:val="it-IT"/>
-        </w:rPr>
-        <w:t>js</w:t>
-      </w:r>
-      <w:proofErr w:type="spellEnd"/>
-      <w:r>
-        <w:rPr>
-          <w:lang w:val="it-IT"/>
-        </w:rPr>
-        <w:t>/time.js – gestione pausa/play/velocità (futuro)</w:t>
+      <w:r>
+        <w:rPr>
+          <w:lang w:val="it-IT"/>
+        </w:rPr>
+        <w:t>js/time.js – gestione pausa/play/velocità (futuro)</w:t>
       </w:r>
     </w:p>
     <w:p>
@@ -437,14 +288,12 @@
           <w:lang w:val="it-IT"/>
         </w:rPr>
       </w:pPr>
-      <w:proofErr w:type="spellStart"/>
       <w:r>
         <w:rPr>
           <w:lang w:val="it-IT"/>
         </w:rPr>
         <w:t>javascript</w:t>
       </w:r>
-      <w:proofErr w:type="spellEnd"/>
     </w:p>
     <w:p>
       <w:pPr>
@@ -469,21 +318,7 @@
         <w:rPr>
           <w:lang w:val="it-IT"/>
         </w:rPr>
-        <w:t xml:space="preserve">  cx, </w:t>
-      </w:r>
-      <w:proofErr w:type="spellStart"/>
-      <w:r>
-        <w:rPr>
-          <w:lang w:val="it-IT"/>
-        </w:rPr>
-        <w:t>cy</w:t>
-      </w:r>
-      <w:proofErr w:type="spellEnd"/>
-      <w:r>
-        <w:rPr>
-          <w:lang w:val="it-IT"/>
-        </w:rPr>
-        <w:t xml:space="preserve">,                   </w:t>
+        <w:t xml:space="preserve">  cx, cy,                   </w:t>
       </w:r>
       <w:r>
         <w:rPr>
@@ -504,21 +339,7 @@
         <w:rPr>
           <w:lang w:val="it-IT"/>
         </w:rPr>
-        <w:t xml:space="preserve">  </w:t>
-      </w:r>
-      <w:proofErr w:type="spellStart"/>
-      <w:r>
-        <w:rPr>
-          <w:lang w:val="it-IT"/>
-        </w:rPr>
-        <w:t>entities</w:t>
-      </w:r>
-      <w:proofErr w:type="spellEnd"/>
-      <w:r>
-        <w:rPr>
-          <w:lang w:val="it-IT"/>
-        </w:rPr>
-        <w:t xml:space="preserve">: [],             </w:t>
+        <w:t xml:space="preserve">  entities: [],             </w:t>
       </w:r>
       <w:r>
         <w:rPr>
@@ -540,21 +361,7 @@
           <w:lang w:val="it-IT"/>
         </w:rPr>
         <w:lastRenderedPageBreak/>
-        <w:t xml:space="preserve">  </w:t>
-      </w:r>
-      <w:proofErr w:type="spellStart"/>
-      <w:r>
-        <w:rPr>
-          <w:lang w:val="it-IT"/>
-        </w:rPr>
-        <w:t>forestDensity</w:t>
-      </w:r>
-      <w:proofErr w:type="spellEnd"/>
-      <w:r>
-        <w:rPr>
-          <w:lang w:val="it-IT"/>
-        </w:rPr>
-        <w:t xml:space="preserve">: 0.0,       </w:t>
+        <w:t xml:space="preserve">  forestDensity: 0.0,       </w:t>
       </w:r>
       <w:r>
         <w:rPr>
@@ -575,21 +382,7 @@
         <w:rPr>
           <w:lang w:val="it-IT"/>
         </w:rPr>
-        <w:t xml:space="preserve">  </w:t>
-      </w:r>
-      <w:proofErr w:type="spellStart"/>
-      <w:r>
-        <w:rPr>
-          <w:lang w:val="it-IT"/>
-        </w:rPr>
-        <w:t>forageDensity</w:t>
-      </w:r>
-      <w:proofErr w:type="spellEnd"/>
-      <w:r>
-        <w:rPr>
-          <w:lang w:val="it-IT"/>
-        </w:rPr>
-        <w:t xml:space="preserve">: 0.0,       </w:t>
+        <w:t xml:space="preserve">  forageDensity: 0.0,       </w:t>
       </w:r>
       <w:r>
         <w:rPr>
@@ -610,21 +403,7 @@
         <w:rPr>
           <w:lang w:val="it-IT"/>
         </w:rPr>
-        <w:t xml:space="preserve">  </w:t>
-      </w:r>
-      <w:proofErr w:type="spellStart"/>
-      <w:r>
-        <w:rPr>
-          <w:lang w:val="it-IT"/>
-        </w:rPr>
-        <w:t>smallGameDensity</w:t>
-      </w:r>
-      <w:proofErr w:type="spellEnd"/>
-      <w:r>
-        <w:rPr>
-          <w:lang w:val="it-IT"/>
-        </w:rPr>
-        <w:t xml:space="preserve">: 0.0,    </w:t>
+        <w:t xml:space="preserve">  smallGameDensity: 0.0,    </w:t>
       </w:r>
       <w:r>
         <w:rPr>
@@ -645,21 +424,7 @@
         <w:rPr>
           <w:lang w:val="it-IT"/>
         </w:rPr>
-        <w:t xml:space="preserve">  </w:t>
-      </w:r>
-      <w:proofErr w:type="spellStart"/>
-      <w:r>
-        <w:rPr>
-          <w:lang w:val="it-IT"/>
-        </w:rPr>
-        <w:t>fishDensity</w:t>
-      </w:r>
-      <w:proofErr w:type="spellEnd"/>
-      <w:r>
-        <w:rPr>
-          <w:lang w:val="it-IT"/>
-        </w:rPr>
-        <w:t xml:space="preserve">: 0.0,         </w:t>
+        <w:t xml:space="preserve">  fishDensity: 0.0,         </w:t>
       </w:r>
       <w:r>
         <w:rPr>
@@ -680,21 +445,7 @@
         <w:rPr>
           <w:lang w:val="it-IT"/>
         </w:rPr>
-        <w:t xml:space="preserve">  </w:t>
-      </w:r>
-      <w:proofErr w:type="spellStart"/>
-      <w:r>
-        <w:rPr>
-          <w:lang w:val="it-IT"/>
-        </w:rPr>
-        <w:t>fertility</w:t>
-      </w:r>
-      <w:proofErr w:type="spellEnd"/>
-      <w:r>
-        <w:rPr>
-          <w:lang w:val="it-IT"/>
-        </w:rPr>
-        <w:t xml:space="preserve">: 0.5            </w:t>
+        <w:t xml:space="preserve">  fertility: 0.5            </w:t>
       </w:r>
       <w:r>
         <w:rPr>
@@ -728,35 +479,7 @@
         <w:rPr>
           <w:lang w:val="it-IT"/>
         </w:rPr>
-        <w:t>La griglia è memorizzata in un array 2D o in una </w:t>
-      </w:r>
-      <w:proofErr w:type="spellStart"/>
-      <w:r>
-        <w:rPr>
-          <w:lang w:val="it-IT"/>
-        </w:rPr>
-        <w:t>Map</w:t>
-      </w:r>
-      <w:proofErr w:type="spellEnd"/>
-      <w:r>
-        <w:rPr>
-          <w:lang w:val="it-IT"/>
-        </w:rPr>
-        <w:t> con chiave "</w:t>
-      </w:r>
-      <w:proofErr w:type="spellStart"/>
-      <w:r>
-        <w:rPr>
-          <w:lang w:val="it-IT"/>
-        </w:rPr>
-        <w:t>cx,cy</w:t>
-      </w:r>
-      <w:proofErr w:type="spellEnd"/>
-      <w:r>
-        <w:rPr>
-          <w:lang w:val="it-IT"/>
-        </w:rPr>
-        <w:t>".</w:t>
+        <w:t>La griglia è memorizzata in un array 2D o in una Map con chiave "cx,cy".</w:t>
       </w:r>
     </w:p>
     <w:p>
@@ -777,33 +500,11 @@
           <w:lang w:val="it-IT"/>
         </w:rPr>
       </w:pPr>
-      <w:proofErr w:type="spellStart"/>
-      <w:r>
-        <w:rPr>
-          <w:lang w:val="it-IT"/>
-        </w:rPr>
-        <w:t>worldToCell</w:t>
-      </w:r>
-      <w:proofErr w:type="spellEnd"/>
-      <w:r>
-        <w:rPr>
-          <w:lang w:val="it-IT"/>
-        </w:rPr>
-        <w:t xml:space="preserve">(x, y) → {cx, </w:t>
-      </w:r>
-      <w:proofErr w:type="spellStart"/>
-      <w:r>
-        <w:rPr>
-          <w:lang w:val="it-IT"/>
-        </w:rPr>
-        <w:t>cy</w:t>
-      </w:r>
-      <w:proofErr w:type="spellEnd"/>
-      <w:r>
-        <w:rPr>
-          <w:lang w:val="it-IT"/>
-        </w:rPr>
-        <w:t>}: converte coordinate mondo in coordinate cella.</w:t>
+      <w:r>
+        <w:rPr>
+          <w:lang w:val="it-IT"/>
+        </w:rPr>
+        <w:t>worldToCell(x, y) → {cx, cy}: converte coordinate mondo in coordinate cella.</w:t>
       </w:r>
     </w:p>
     <w:p>
@@ -816,33 +517,11 @@
           <w:lang w:val="it-IT"/>
         </w:rPr>
       </w:pPr>
-      <w:proofErr w:type="spellStart"/>
-      <w:r>
-        <w:rPr>
-          <w:lang w:val="it-IT"/>
-        </w:rPr>
-        <w:t>getCell</w:t>
-      </w:r>
-      <w:proofErr w:type="spellEnd"/>
-      <w:r>
-        <w:rPr>
-          <w:lang w:val="it-IT"/>
-        </w:rPr>
-        <w:t xml:space="preserve">(cx, </w:t>
-      </w:r>
-      <w:proofErr w:type="spellStart"/>
-      <w:r>
-        <w:rPr>
-          <w:lang w:val="it-IT"/>
-        </w:rPr>
-        <w:t>cy</w:t>
-      </w:r>
-      <w:proofErr w:type="spellEnd"/>
-      <w:r>
-        <w:rPr>
-          <w:lang w:val="it-IT"/>
-        </w:rPr>
-        <w:t>) → oggetto cella (crea la cella se non esiste).</w:t>
+      <w:r>
+        <w:rPr>
+          <w:lang w:val="it-IT"/>
+        </w:rPr>
+        <w:t>getCell(cx, cy) → oggetto cella (crea la cella se non esiste).</w:t>
       </w:r>
     </w:p>
     <w:p>
@@ -855,33 +534,11 @@
           <w:lang w:val="it-IT"/>
         </w:rPr>
       </w:pPr>
-      <w:proofErr w:type="spellStart"/>
-      <w:r>
-        <w:rPr>
-          <w:lang w:val="it-IT"/>
-        </w:rPr>
-        <w:t>getEntitiesInRadius</w:t>
-      </w:r>
-      <w:proofErr w:type="spellEnd"/>
-      <w:r>
-        <w:rPr>
-          <w:lang w:val="it-IT"/>
-        </w:rPr>
-        <w:t xml:space="preserve">(x, y, </w:t>
-      </w:r>
-      <w:proofErr w:type="spellStart"/>
-      <w:r>
-        <w:rPr>
-          <w:lang w:val="it-IT"/>
-        </w:rPr>
-        <w:t>radius</w:t>
-      </w:r>
-      <w:proofErr w:type="spellEnd"/>
-      <w:r>
-        <w:rPr>
-          <w:lang w:val="it-IT"/>
-        </w:rPr>
-        <w:t>) → array di entità: interroga le celle nel raggio e filtra per distanza esatta.</w:t>
+      <w:r>
+        <w:rPr>
+          <w:lang w:val="it-IT"/>
+        </w:rPr>
+        <w:t>getEntitiesInRadius(x, y, radius) → array di entità: interroga le celle nel raggio e filtra per distanza esatta.</w:t>
       </w:r>
     </w:p>
     <w:p>
@@ -894,75 +551,11 @@
           <w:lang w:val="it-IT"/>
         </w:rPr>
       </w:pPr>
-      <w:proofErr w:type="spellStart"/>
-      <w:r>
-        <w:rPr>
-          <w:lang w:val="it-IT"/>
-        </w:rPr>
-        <w:t>modifyDensity</w:t>
-      </w:r>
-      <w:proofErr w:type="spellEnd"/>
-      <w:r>
-        <w:rPr>
-          <w:lang w:val="it-IT"/>
-        </w:rPr>
-        <w:t xml:space="preserve">(x, y, </w:t>
-      </w:r>
-      <w:proofErr w:type="spellStart"/>
-      <w:r>
-        <w:rPr>
-          <w:lang w:val="it-IT"/>
-        </w:rPr>
-        <w:t>layer</w:t>
-      </w:r>
-      <w:proofErr w:type="spellEnd"/>
-      <w:r>
-        <w:rPr>
-          <w:lang w:val="it-IT"/>
-        </w:rPr>
-        <w:t xml:space="preserve">, </w:t>
-      </w:r>
-      <w:proofErr w:type="spellStart"/>
-      <w:r>
-        <w:rPr>
-          <w:lang w:val="it-IT"/>
-        </w:rPr>
-        <w:t>amount</w:t>
-      </w:r>
-      <w:proofErr w:type="spellEnd"/>
-      <w:r>
-        <w:rPr>
-          <w:lang w:val="it-IT"/>
-        </w:rPr>
-        <w:t xml:space="preserve">, </w:t>
-      </w:r>
-      <w:proofErr w:type="spellStart"/>
-      <w:r>
-        <w:rPr>
-          <w:lang w:val="it-IT"/>
-        </w:rPr>
-        <w:t>impactRadius</w:t>
-      </w:r>
-      <w:proofErr w:type="spellEnd"/>
-      <w:r>
-        <w:rPr>
-          <w:lang w:val="it-IT"/>
-        </w:rPr>
-        <w:t xml:space="preserve">): modifica la densità del </w:t>
-      </w:r>
-      <w:proofErr w:type="spellStart"/>
-      <w:r>
-        <w:rPr>
-          <w:lang w:val="it-IT"/>
-        </w:rPr>
-        <w:t>layer</w:t>
-      </w:r>
-      <w:proofErr w:type="spellEnd"/>
-      <w:r>
-        <w:rPr>
-          <w:lang w:val="it-IT"/>
-        </w:rPr>
-        <w:t xml:space="preserve"> indicato nelle celle intorno alla posizione, con decadimento radiale.</w:t>
+      <w:r>
+        <w:rPr>
+          <w:lang w:val="it-IT"/>
+        </w:rPr>
+        <w:t>modifyDensity(x, y, layer, amount, impactRadius): modifica la densità del layer indicato nelle celle intorno alla posizione, con decadimento radiale.</w:t>
       </w:r>
     </w:p>
     <w:p>
@@ -1030,11 +623,9 @@
             <w:hideMark/>
           </w:tcPr>
           <w:p>
-            <w:proofErr w:type="spellStart"/>
             <w:r>
               <w:t>Proprietà</w:t>
             </w:r>
-            <w:proofErr w:type="spellEnd"/>
           </w:p>
         </w:tc>
         <w:tc>
@@ -1053,11 +644,9 @@
             <w:hideMark/>
           </w:tcPr>
           <w:p>
-            <w:proofErr w:type="spellStart"/>
             <w:r>
               <w:t>Descrizione</w:t>
             </w:r>
-            <w:proofErr w:type="spellEnd"/>
           </w:p>
         </w:tc>
       </w:tr>
@@ -1093,11 +682,9 @@
             <w:hideMark/>
           </w:tcPr>
           <w:p>
-            <w:proofErr w:type="spellStart"/>
             <w:r>
               <w:t>forestDensity</w:t>
             </w:r>
-            <w:proofErr w:type="spellEnd"/>
           </w:p>
         </w:tc>
         <w:tc>
@@ -1141,19 +728,9 @@
             <w:hideMark/>
           </w:tcPr>
           <w:p>
-            <w:proofErr w:type="spellStart"/>
             <w:r>
-              <w:t>Vegetazione</w:t>
+              <w:t>Vegetazione raccoglibile</w:t>
             </w:r>
-            <w:proofErr w:type="spellEnd"/>
-            <w:r>
-              <w:t xml:space="preserve"> </w:t>
-            </w:r>
-            <w:proofErr w:type="spellStart"/>
-            <w:r>
-              <w:t>raccoglibile</w:t>
-            </w:r>
-            <w:proofErr w:type="spellEnd"/>
           </w:p>
         </w:tc>
         <w:tc>
@@ -1169,11 +746,9 @@
             <w:hideMark/>
           </w:tcPr>
           <w:p>
-            <w:proofErr w:type="spellStart"/>
             <w:r>
               <w:t>forageDensity</w:t>
             </w:r>
-            <w:proofErr w:type="spellEnd"/>
           </w:p>
         </w:tc>
         <w:tc>
@@ -1218,13 +793,8 @@
           </w:tcPr>
           <w:p>
             <w:r>
-              <w:t xml:space="preserve">Piccola fauna </w:t>
+              <w:t>Piccola fauna terrestre</w:t>
             </w:r>
-            <w:proofErr w:type="spellStart"/>
-            <w:r>
-              <w:t>terrestre</w:t>
-            </w:r>
-            <w:proofErr w:type="spellEnd"/>
           </w:p>
         </w:tc>
         <w:tc>
@@ -1240,11 +810,9 @@
             <w:hideMark/>
           </w:tcPr>
           <w:p>
-            <w:proofErr w:type="spellStart"/>
             <w:r>
               <w:t>smallGameDensity</w:t>
             </w:r>
-            <w:proofErr w:type="spellEnd"/>
           </w:p>
         </w:tc>
         <w:tc>
@@ -1306,11 +874,9 @@
             <w:hideMark/>
           </w:tcPr>
           <w:p>
-            <w:proofErr w:type="spellStart"/>
             <w:r>
               <w:t>fishDensity</w:t>
             </w:r>
-            <w:proofErr w:type="spellEnd"/>
           </w:p>
         </w:tc>
         <w:tc>
@@ -1333,23 +899,7 @@
               <w:t xml:space="preserve">Disponibile solo in celle d'acqua. </w:t>
             </w:r>
             <w:r>
-              <w:t xml:space="preserve">Ridotto </w:t>
-            </w:r>
-            <w:proofErr w:type="spellStart"/>
-            <w:r>
-              <w:t>dalla</w:t>
-            </w:r>
-            <w:proofErr w:type="spellEnd"/>
-            <w:r>
-              <w:t xml:space="preserve"> </w:t>
-            </w:r>
-            <w:proofErr w:type="spellStart"/>
-            <w:r>
-              <w:t>pesca</w:t>
-            </w:r>
-            <w:proofErr w:type="spellEnd"/>
-            <w:r>
-              <w:t>.</w:t>
+              <w:t>Ridotto dalla pesca.</w:t>
             </w:r>
           </w:p>
         </w:tc>
@@ -1368,11 +918,9 @@
             <w:hideMark/>
           </w:tcPr>
           <w:p>
-            <w:proofErr w:type="spellStart"/>
             <w:r>
               <w:t>Fertilità</w:t>
             </w:r>
-            <w:proofErr w:type="spellEnd"/>
           </w:p>
         </w:tc>
         <w:tc>
@@ -1407,31 +955,7 @@
           </w:tcPr>
           <w:p>
             <w:r>
-              <w:t xml:space="preserve">Per </w:t>
-            </w:r>
-            <w:proofErr w:type="spellStart"/>
-            <w:r>
-              <w:t>uso</w:t>
-            </w:r>
-            <w:proofErr w:type="spellEnd"/>
-            <w:r>
-              <w:t xml:space="preserve"> </w:t>
-            </w:r>
-            <w:proofErr w:type="spellStart"/>
-            <w:r>
-              <w:t>futuro</w:t>
-            </w:r>
-            <w:proofErr w:type="spellEnd"/>
-            <w:r>
-              <w:t xml:space="preserve"> (</w:t>
-            </w:r>
-            <w:proofErr w:type="spellStart"/>
-            <w:r>
-              <w:t>agricoltura</w:t>
-            </w:r>
-            <w:proofErr w:type="spellEnd"/>
-            <w:r>
-              <w:t>).</w:t>
+              <w:t>Per uso futuro (agricoltura).</w:t>
             </w:r>
           </w:p>
         </w:tc>
@@ -1474,11 +998,9 @@
       </w:r>
     </w:p>
     <w:p>
-      <w:proofErr w:type="spellStart"/>
       <w:r>
         <w:t>javascript</w:t>
       </w:r>
-      <w:proofErr w:type="spellEnd"/>
     </w:p>
     <w:p>
       <w:r>
@@ -1529,35 +1051,7 @@
         <w:rPr>
           <w:lang w:val="it-IT"/>
         </w:rPr>
-        <w:t xml:space="preserve">  </w:t>
-      </w:r>
-      <w:proofErr w:type="spellStart"/>
-      <w:r>
-        <w:rPr>
-          <w:lang w:val="it-IT"/>
-        </w:rPr>
-        <w:t>targetX</w:t>
-      </w:r>
-      <w:proofErr w:type="spellEnd"/>
-      <w:r>
-        <w:rPr>
-          <w:lang w:val="it-IT"/>
-        </w:rPr>
-        <w:t xml:space="preserve">, </w:t>
-      </w:r>
-      <w:proofErr w:type="spellStart"/>
-      <w:r>
-        <w:rPr>
-          <w:lang w:val="it-IT"/>
-        </w:rPr>
-        <w:t>targetY</w:t>
-      </w:r>
-      <w:proofErr w:type="spellEnd"/>
-      <w:r>
-        <w:rPr>
-          <w:lang w:val="it-IT"/>
-        </w:rPr>
-        <w:t xml:space="preserve">,         </w:t>
+        <w:t xml:space="preserve">  targetX, targetY,         </w:t>
       </w:r>
       <w:r>
         <w:rPr>
@@ -1599,35 +1093,7 @@
         <w:rPr>
           <w:lang w:val="it-IT"/>
         </w:rPr>
-        <w:t xml:space="preserve">  state: '</w:t>
-      </w:r>
-      <w:proofErr w:type="spellStart"/>
-      <w:r>
-        <w:rPr>
-          <w:lang w:val="it-IT"/>
-        </w:rPr>
-        <w:t>idle</w:t>
-      </w:r>
-      <w:proofErr w:type="spellEnd"/>
-      <w:r>
-        <w:rPr>
-          <w:lang w:val="it-IT"/>
-        </w:rPr>
-        <w:t>' | '</w:t>
-      </w:r>
-      <w:proofErr w:type="spellStart"/>
-      <w:r>
-        <w:rPr>
-          <w:lang w:val="it-IT"/>
-        </w:rPr>
-        <w:t>moving</w:t>
-      </w:r>
-      <w:proofErr w:type="spellEnd"/>
-      <w:r>
-        <w:rPr>
-          <w:lang w:val="it-IT"/>
-        </w:rPr>
-        <w:t>' | 'working'</w:t>
+        <w:t xml:space="preserve">  state: 'idle' | 'moving' | 'working'</w:t>
       </w:r>
     </w:p>
     <w:p>
@@ -1652,29 +1118,8 @@
       </w:r>
     </w:p>
     <w:p>
-      <w:proofErr w:type="spellStart"/>
-      <w:r>
-        <w:t>Estende</w:t>
-      </w:r>
-      <w:proofErr w:type="spellEnd"/>
-      <w:r>
-        <w:t xml:space="preserve"> </w:t>
-      </w:r>
-      <w:proofErr w:type="spellStart"/>
-      <w:r>
-        <w:t>l'unità</w:t>
-      </w:r>
-      <w:proofErr w:type="spellEnd"/>
-      <w:r>
-        <w:t xml:space="preserve"> </w:t>
-      </w:r>
-      <w:proofErr w:type="spellStart"/>
-      <w:r>
-        <w:t>generica</w:t>
-      </w:r>
-      <w:proofErr w:type="spellEnd"/>
-      <w:r>
-        <w:t xml:space="preserve"> con:</w:t>
+      <w:r>
+        <w:t>Estende l'unità generica con:</w:t>
       </w:r>
     </w:p>
     <w:p>
@@ -1687,19 +1132,11 @@
           <w:lang w:val="it-IT"/>
         </w:rPr>
       </w:pPr>
-      <w:proofErr w:type="spellStart"/>
-      <w:r>
-        <w:rPr>
-          <w:lang w:val="it-IT"/>
-        </w:rPr>
-        <w:t>population</w:t>
-      </w:r>
-      <w:proofErr w:type="spellEnd"/>
-      <w:r>
-        <w:rPr>
-          <w:lang w:val="it-IT"/>
-        </w:rPr>
-        <w:t>: numero di individui nel gruppo</w:t>
+      <w:r>
+        <w:rPr>
+          <w:lang w:val="it-IT"/>
+        </w:rPr>
+        <w:t>population: numero di individui nel gruppo</w:t>
       </w:r>
     </w:p>
     <w:p>
@@ -1716,91 +1153,7 @@
         <w:rPr>
           <w:lang w:val="it-IT"/>
         </w:rPr>
-        <w:t xml:space="preserve">task: { </w:t>
-      </w:r>
-      <w:proofErr w:type="spellStart"/>
-      <w:r>
-        <w:rPr>
-          <w:lang w:val="it-IT"/>
-        </w:rPr>
-        <w:t>type</w:t>
-      </w:r>
-      <w:proofErr w:type="spellEnd"/>
-      <w:r>
-        <w:rPr>
-          <w:lang w:val="it-IT"/>
-        </w:rPr>
-        <w:t>: '</w:t>
-      </w:r>
-      <w:proofErr w:type="spellStart"/>
-      <w:r>
-        <w:rPr>
-          <w:lang w:val="it-IT"/>
-        </w:rPr>
-        <w:t>gatherWood</w:t>
-      </w:r>
-      <w:proofErr w:type="spellEnd"/>
-      <w:r>
-        <w:rPr>
-          <w:lang w:val="it-IT"/>
-        </w:rPr>
-        <w:t>' | '</w:t>
-      </w:r>
-      <w:proofErr w:type="spellStart"/>
-      <w:r>
-        <w:rPr>
-          <w:lang w:val="it-IT"/>
-        </w:rPr>
-        <w:t>hunt</w:t>
-      </w:r>
-      <w:proofErr w:type="spellEnd"/>
-      <w:r>
-        <w:rPr>
-          <w:lang w:val="it-IT"/>
-        </w:rPr>
-        <w:t>' | '</w:t>
-      </w:r>
-      <w:proofErr w:type="spellStart"/>
-      <w:r>
-        <w:rPr>
-          <w:lang w:val="it-IT"/>
-        </w:rPr>
-        <w:t>forage</w:t>
-      </w:r>
-      <w:proofErr w:type="spellEnd"/>
-      <w:r>
-        <w:rPr>
-          <w:lang w:val="it-IT"/>
-        </w:rPr>
-        <w:t>' | '</w:t>
-      </w:r>
-      <w:proofErr w:type="spellStart"/>
-      <w:r>
-        <w:rPr>
-          <w:lang w:val="it-IT"/>
-        </w:rPr>
-        <w:t>fish</w:t>
-      </w:r>
-      <w:proofErr w:type="spellEnd"/>
-      <w:r>
-        <w:rPr>
-          <w:lang w:val="it-IT"/>
-        </w:rPr>
-        <w:t>' | '</w:t>
-      </w:r>
-      <w:proofErr w:type="spellStart"/>
-      <w:r>
-        <w:rPr>
-          <w:lang w:val="it-IT"/>
-        </w:rPr>
-        <w:t>trapSmallGame</w:t>
-      </w:r>
-      <w:proofErr w:type="spellEnd"/>
-      <w:r>
-        <w:rPr>
-          <w:lang w:val="it-IT"/>
-        </w:rPr>
-        <w:t>', location: {x, y} }</w:t>
+        <w:t>task: { type: 'gatherWood' | 'hunt' | 'forage' | 'fish' | 'trapSmallGame', location: {x, y} }</w:t>
       </w:r>
     </w:p>
     <w:p>
@@ -1813,33 +1166,11 @@
           <w:lang w:val="it-IT"/>
         </w:rPr>
       </w:pPr>
-      <w:proofErr w:type="spellStart"/>
-      <w:r>
-        <w:rPr>
-          <w:lang w:val="it-IT"/>
-        </w:rPr>
-        <w:t>inventory</w:t>
-      </w:r>
-      <w:proofErr w:type="spellEnd"/>
-      <w:r>
-        <w:rPr>
-          <w:lang w:val="it-IT"/>
-        </w:rPr>
-        <w:t xml:space="preserve">: { </w:t>
-      </w:r>
-      <w:proofErr w:type="spellStart"/>
-      <w:r>
-        <w:rPr>
-          <w:lang w:val="it-IT"/>
-        </w:rPr>
-        <w:t>wood</w:t>
-      </w:r>
-      <w:proofErr w:type="spellEnd"/>
-      <w:r>
-        <w:rPr>
-          <w:lang w:val="it-IT"/>
-        </w:rPr>
-        <w:t>: 0, food: 0 } – risorse trasportate (in futuro potranno essere differenziate)</w:t>
+      <w:r>
+        <w:rPr>
+          <w:lang w:val="it-IT"/>
+        </w:rPr>
+        <w:t>inventory: { wood: 0, food: 0 } – risorse trasportate (in futuro potranno essere differenziate)</w:t>
       </w:r>
     </w:p>
     <w:p>
@@ -1852,19 +1183,11 @@
           <w:lang w:val="it-IT"/>
         </w:rPr>
       </w:pPr>
-      <w:proofErr w:type="spellStart"/>
-      <w:r>
-        <w:rPr>
-          <w:lang w:val="it-IT"/>
-        </w:rPr>
-        <w:t>rations</w:t>
-      </w:r>
-      <w:proofErr w:type="spellEnd"/>
-      <w:r>
-        <w:rPr>
-          <w:lang w:val="it-IT"/>
-        </w:rPr>
-        <w:t>: provviste di cibo portate per il viaggio</w:t>
+      <w:r>
+        <w:rPr>
+          <w:lang w:val="it-IT"/>
+        </w:rPr>
+        <w:t>rations: provviste di cibo portate per il viaggio</w:t>
       </w:r>
     </w:p>
     <w:p>
@@ -1893,27 +1216,9 @@
           <w:numId w:val="4"/>
         </w:numPr>
       </w:pPr>
-      <w:proofErr w:type="spellStart"/>
-      <w:r>
-        <w:t>herdSize</w:t>
-      </w:r>
-      <w:proofErr w:type="spellEnd"/>
-      <w:r>
-        <w:t xml:space="preserve">: </w:t>
-      </w:r>
-      <w:proofErr w:type="spellStart"/>
-      <w:r>
-        <w:t>numero</w:t>
-      </w:r>
-      <w:proofErr w:type="spellEnd"/>
-      <w:r>
-        <w:t xml:space="preserve"> di </w:t>
-      </w:r>
-      <w:proofErr w:type="spellStart"/>
-      <w:r>
-        <w:t>capi</w:t>
-      </w:r>
-      <w:proofErr w:type="spellEnd"/>
+      <w:r>
+        <w:t>herdSize: numero di capi</w:t>
+      </w:r>
     </w:p>
     <w:p>
       <w:pPr>
@@ -1923,29 +1228,8 @@
         </w:numPr>
       </w:pPr>
       <w:r>
-        <w:t xml:space="preserve">habitat: </w:t>
-      </w:r>
-      <w:proofErr w:type="spellStart"/>
-      <w:r>
-        <w:t>tipo</w:t>
-      </w:r>
-      <w:proofErr w:type="spellEnd"/>
-      <w:r>
-        <w:t xml:space="preserve"> di </w:t>
-      </w:r>
-      <w:proofErr w:type="spellStart"/>
-      <w:r>
-        <w:t>terreno</w:t>
-      </w:r>
-      <w:proofErr w:type="spellEnd"/>
-      <w:r>
-        <w:t xml:space="preserve"> </w:t>
-      </w:r>
-      <w:proofErr w:type="spellStart"/>
-      <w:r>
-        <w:t>preferito</w:t>
-      </w:r>
-      <w:proofErr w:type="spellEnd"/>
+        <w:t>habitat: tipo di terreno preferito</w:t>
+      </w:r>
     </w:p>
     <w:p>
       <w:pPr>
@@ -1985,19 +1269,11 @@
           <w:lang w:val="it-IT"/>
         </w:rPr>
       </w:pPr>
-      <w:proofErr w:type="spellStart"/>
-      <w:r>
-        <w:rPr>
-          <w:lang w:val="it-IT"/>
-        </w:rPr>
-        <w:t>Phaser</w:t>
-      </w:r>
-      <w:proofErr w:type="spellEnd"/>
-      <w:r>
-        <w:rPr>
-          <w:lang w:val="it-IT"/>
-        </w:rPr>
-        <w:t xml:space="preserve"> chiama update(time, delta) a ogni frame. La logica di gioco può essere disaccoppiata dal rendering per garantire coerenza temporale.</w:t>
+      <w:r>
+        <w:rPr>
+          <w:lang w:val="it-IT"/>
+        </w:rPr>
+        <w:t>Phaser chiama update(time, delta) a ogni frame. La logica di gioco può essere disaccoppiata dal rendering per garantire coerenza temporale.</w:t>
       </w:r>
     </w:p>
     <w:p>
@@ -2007,7 +1283,6 @@
           <w:numId w:val="5"/>
         </w:numPr>
       </w:pPr>
-      <w:proofErr w:type="spellStart"/>
       <w:r>
         <w:rPr>
           <w:b/>
@@ -2016,51 +1291,14 @@
         </w:rPr>
         <w:t>TimeManager</w:t>
       </w:r>
-      <w:proofErr w:type="spellEnd"/>
-      <w:r>
-        <w:rPr>
-          <w:lang w:val="it-IT"/>
-        </w:rPr>
-        <w:t> calcola il tempo di gioco effettivo (</w:t>
-      </w:r>
-      <w:proofErr w:type="spellStart"/>
-      <w:r>
-        <w:rPr>
-          <w:lang w:val="it-IT"/>
-        </w:rPr>
-        <w:t>gameDelta</w:t>
-      </w:r>
-      <w:proofErr w:type="spellEnd"/>
-      <w:r>
-        <w:rPr>
-          <w:lang w:val="it-IT"/>
-        </w:rPr>
-        <w:t xml:space="preserve"> = delta * </w:t>
-      </w:r>
-      <w:proofErr w:type="spellStart"/>
-      <w:r>
-        <w:rPr>
-          <w:lang w:val="it-IT"/>
-        </w:rPr>
-        <w:t>speedMultiplier</w:t>
-      </w:r>
-      <w:proofErr w:type="spellEnd"/>
-      <w:r>
-        <w:rPr>
-          <w:lang w:val="it-IT"/>
-        </w:rPr>
-        <w:t xml:space="preserve">). </w:t>
-      </w:r>
-      <w:r>
-        <w:t>Se in pausa, </w:t>
-      </w:r>
-      <w:proofErr w:type="spellStart"/>
-      <w:r>
-        <w:t>gameDelta</w:t>
-      </w:r>
-      <w:proofErr w:type="spellEnd"/>
-      <w:r>
-        <w:t xml:space="preserve"> = 0.</w:t>
+      <w:r>
+        <w:rPr>
+          <w:lang w:val="it-IT"/>
+        </w:rPr>
+        <w:t xml:space="preserve"> calcola il tempo di gioco effettivo (gameDelta = delta * speedMultiplier). </w:t>
+      </w:r>
+      <w:r>
+        <w:t>Se in pausa, gameDelta = 0.</w:t>
       </w:r>
     </w:p>
     <w:p>
@@ -2085,35 +1323,7 @@
         <w:rPr>
           <w:lang w:val="it-IT"/>
         </w:rPr>
-        <w:t> tutte le unità con stato '</w:t>
-      </w:r>
-      <w:proofErr w:type="spellStart"/>
-      <w:r>
-        <w:rPr>
-          <w:lang w:val="it-IT"/>
-        </w:rPr>
-        <w:t>moving</w:t>
-      </w:r>
-      <w:proofErr w:type="spellEnd"/>
-      <w:r>
-        <w:rPr>
-          <w:lang w:val="it-IT"/>
-        </w:rPr>
-        <w:t>' vengono spostate verso il target in base a speed e </w:t>
-      </w:r>
-      <w:proofErr w:type="spellStart"/>
-      <w:r>
-        <w:rPr>
-          <w:lang w:val="it-IT"/>
-        </w:rPr>
-        <w:t>gameDelta</w:t>
-      </w:r>
-      <w:proofErr w:type="spellEnd"/>
-      <w:r>
-        <w:rPr>
-          <w:lang w:val="it-IT"/>
-        </w:rPr>
-        <w:t>.</w:t>
+        <w:t> tutte le unità con stato 'moving' vengono spostate verso il target in base a speed e gameDelta.</w:t>
       </w:r>
     </w:p>
     <w:p>
@@ -2187,21 +1397,7 @@
         <w:rPr>
           <w:lang w:val="it-IT"/>
         </w:rPr>
-        <w:t> a intervalli regolari di tempo di gioco (es. ogni </w:t>
-      </w:r>
-      <w:proofErr w:type="spellStart"/>
-      <w:r>
-        <w:rPr>
-          <w:lang w:val="it-IT"/>
-        </w:rPr>
-        <w:t>dayLength</w:t>
-      </w:r>
-      <w:proofErr w:type="spellEnd"/>
-      <w:r>
-        <w:rPr>
-          <w:lang w:val="it-IT"/>
-        </w:rPr>
-        <w:t> secondi) tutti i pop consumano cibo dalle scorte dell'accampamento.</w:t>
+        <w:t> a intervalli regolari di tempo di gioco (es. ogni dayLength secondi) tutti i pop consumano cibo dalle scorte dell'accampamento.</w:t>
       </w:r>
     </w:p>
     <w:p>
@@ -2223,48 +1419,10 @@
         <w:rPr>
           <w:lang w:val="it-IT"/>
         </w:rPr>
-        <w:t xml:space="preserve"> a intervalli regolari, le celle della griglia rigenerano una frazione di densità per ogni </w:t>
-      </w:r>
-      <w:proofErr w:type="spellStart"/>
-      <w:r>
-        <w:rPr>
-          <w:lang w:val="it-IT"/>
-        </w:rPr>
-        <w:t>layer</w:t>
-      </w:r>
-      <w:proofErr w:type="spellEnd"/>
-      <w:r>
-        <w:rPr>
-          <w:lang w:val="it-IT"/>
-        </w:rPr>
-        <w:t xml:space="preserve"> (es. </w:t>
-      </w:r>
-      <w:r>
-        <w:t>+0.01 per </w:t>
-      </w:r>
-      <w:proofErr w:type="spellStart"/>
-      <w:r>
-        <w:t>forestDensity</w:t>
-      </w:r>
-      <w:proofErr w:type="spellEnd"/>
-      <w:r>
-        <w:t xml:space="preserve"> al </w:t>
-      </w:r>
-      <w:proofErr w:type="spellStart"/>
-      <w:r>
-        <w:t>giorno</w:t>
-      </w:r>
-      <w:proofErr w:type="spellEnd"/>
-      <w:r>
-        <w:t xml:space="preserve"> se non </w:t>
-      </w:r>
-      <w:proofErr w:type="spellStart"/>
-      <w:r>
-        <w:t>tagliata</w:t>
-      </w:r>
-      <w:proofErr w:type="spellEnd"/>
-      <w:r>
-        <w:t>).</w:t>
+        <w:t xml:space="preserve"> a intervalli regolari, le celle della griglia rigenerano una frazione di densità per ogni layer (es. </w:t>
+      </w:r>
+      <w:r>
+        <w:t>+0.01 per forestDensity al giorno se non tagliata).</w:t>
       </w:r>
     </w:p>
     <w:p>
@@ -2299,35 +1457,7 @@
         <w:rPr>
           <w:lang w:val="it-IT"/>
         </w:rPr>
-        <w:t xml:space="preserve">Il codice è ospitato su un repository </w:t>
-      </w:r>
-      <w:proofErr w:type="spellStart"/>
-      <w:r>
-        <w:rPr>
-          <w:lang w:val="it-IT"/>
-        </w:rPr>
-        <w:t>Git</w:t>
-      </w:r>
-      <w:proofErr w:type="spellEnd"/>
-      <w:r>
-        <w:rPr>
-          <w:lang w:val="it-IT"/>
-        </w:rPr>
-        <w:t xml:space="preserve"> (GitHub). La chat è usata per discutere, scrivere </w:t>
-      </w:r>
-      <w:proofErr w:type="spellStart"/>
-      <w:r>
-        <w:rPr>
-          <w:lang w:val="it-IT"/>
-        </w:rPr>
-        <w:t>snippet</w:t>
-      </w:r>
-      <w:proofErr w:type="spellEnd"/>
-      <w:r>
-        <w:rPr>
-          <w:lang w:val="it-IT"/>
-        </w:rPr>
-        <w:t xml:space="preserve"> e aggiornare la documentazione, </w:t>
+        <w:t>Il codice è ospitato su un repository Git (GitHub). La chat è usata per discutere, scrivere snippet e aggiornare la documentazione, </w:t>
       </w:r>
       <w:r>
         <w:rPr>
@@ -2402,13 +1532,8 @@
         </w:numPr>
       </w:pPr>
       <w:r>
-        <w:t xml:space="preserve">Roadmap del </w:t>
-      </w:r>
-      <w:proofErr w:type="spellStart"/>
-      <w:r>
-        <w:t>Prototipo</w:t>
-      </w:r>
-      <w:proofErr w:type="spellEnd"/>
+        <w:t>Roadmap del Prototipo</w:t>
+      </w:r>
     </w:p>
     <w:p>
       <w:pPr>
@@ -2429,23 +1554,7 @@
         </w:numPr>
       </w:pPr>
       <w:r>
-        <w:t xml:space="preserve">GDD </w:t>
-      </w:r>
-      <w:proofErr w:type="spellStart"/>
-      <w:r>
-        <w:t>Esteso</w:t>
-      </w:r>
-      <w:proofErr w:type="spellEnd"/>
-      <w:r>
-        <w:t xml:space="preserve"> (</w:t>
-      </w:r>
-      <w:proofErr w:type="spellStart"/>
-      <w:r>
-        <w:t>Bibbia</w:t>
-      </w:r>
-      <w:proofErr w:type="spellEnd"/>
-      <w:r>
-        <w:t xml:space="preserve"> completa)</w:t>
+        <w:t>GDD Esteso (Bibbia completa)</w:t>
       </w:r>
     </w:p>
     <w:p>
@@ -2455,21 +1564,8 @@
           <w:numId w:val="6"/>
         </w:numPr>
       </w:pPr>
-      <w:proofErr w:type="spellStart"/>
-      <w:r>
-        <w:t>Questo</w:t>
-      </w:r>
-      <w:proofErr w:type="spellEnd"/>
-      <w:r>
-        <w:t xml:space="preserve"> </w:t>
-      </w:r>
-      <w:proofErr w:type="spellStart"/>
-      <w:r>
-        <w:t>documento</w:t>
-      </w:r>
-      <w:proofErr w:type="spellEnd"/>
-      <w:r>
-        <w:t xml:space="preserve"> (TECHNICAL.md)</w:t>
+      <w:r>
+        <w:t>Questo documento (TECHNICAL.md)</w:t>
       </w:r>
     </w:p>
     <w:p>
@@ -2574,35 +1670,7 @@
         <w:rPr>
           <w:lang w:val="it-IT"/>
         </w:rPr>
-        <w:t xml:space="preserve">L'utente applica le modifiche localmente, testa il codice, e poi </w:t>
-      </w:r>
-      <w:proofErr w:type="spellStart"/>
-      <w:r>
-        <w:rPr>
-          <w:lang w:val="it-IT"/>
-        </w:rPr>
-        <w:t>committa</w:t>
-      </w:r>
-      <w:proofErr w:type="spellEnd"/>
-      <w:r>
-        <w:rPr>
-          <w:lang w:val="it-IT"/>
-        </w:rPr>
-        <w:t xml:space="preserve"> e </w:t>
-      </w:r>
-      <w:proofErr w:type="spellStart"/>
-      <w:r>
-        <w:rPr>
-          <w:lang w:val="it-IT"/>
-        </w:rPr>
-        <w:t>pusha</w:t>
-      </w:r>
-      <w:proofErr w:type="spellEnd"/>
-      <w:r>
-        <w:rPr>
-          <w:lang w:val="it-IT"/>
-        </w:rPr>
-        <w:t xml:space="preserve"> sul repository.</w:t>
+        <w:t>L'utente applica le modifiche localmente, testa il codice, e poi committa e pusha sul repository.</w:t>
       </w:r>
     </w:p>
     <w:p>
@@ -2673,21 +1741,7 @@
         <w:rPr>
           <w:lang w:val="it-IT"/>
         </w:rPr>
-        <w:t xml:space="preserve">Il codice è scritto con nomi di variabili e funzioni chiari ed esplicativi. Ogni file ha un'intestazione che ne descrive lo scopo. Le funzioni complesse hanno commenti in stile </w:t>
-      </w:r>
-      <w:proofErr w:type="spellStart"/>
-      <w:r>
-        <w:rPr>
-          <w:lang w:val="it-IT"/>
-        </w:rPr>
-        <w:t>JSDoc</w:t>
-      </w:r>
-      <w:proofErr w:type="spellEnd"/>
-      <w:r>
-        <w:rPr>
-          <w:lang w:val="it-IT"/>
-        </w:rPr>
-        <w:t>.</w:t>
+        <w:t>Il codice è scritto con nomi di variabili e funzioni chiari ed esplicativi. Ogni file ha un'intestazione che ne descrive lo scopo. Le funzioni complesse hanno commenti in stile JSDoc.</w:t>
       </w:r>
     </w:p>
     <w:p>
@@ -2915,24 +1969,289 @@
           <w:lang w:val="it-IT"/>
         </w:rPr>
       </w:pPr>
+      <w:r>
+        <w:rPr>
+          <w:lang w:val="it-IT" w:eastAsia="en-GB"/>
+        </w:rPr>
+        <w:t xml:space="preserve">Inoltre, darà </w:t>
+      </w:r>
+      <w:r>
+        <w:rPr>
+          <w:b/>
+          <w:bCs/>
+          <w:lang w:val="it-IT" w:eastAsia="en-GB"/>
+        </w:rPr>
+        <w:t>istruzioni passo passo</w:t>
+      </w:r>
+      <w:r>
+        <w:rPr>
+          <w:lang w:val="it-IT" w:eastAsia="en-GB"/>
+        </w:rPr>
+        <w:t xml:space="preserve"> per l’implementazione, cioè </w:t>
+      </w:r>
+      <w:r>
+        <w:rPr>
+          <w:lang w:val="it-IT"/>
+        </w:rPr>
+        <w:t>un elenco operativo per l'utente, scritto in linguaggio semplice, che include:</w:t>
+      </w:r>
+    </w:p>
+    <w:p>
+      <w:pPr>
+        <w:pStyle w:val="ListParagraph"/>
+        <w:numPr>
+          <w:ilvl w:val="0"/>
+          <w:numId w:val="19"/>
+        </w:numPr>
+        <w:rPr>
+          <w:lang w:val="it-IT"/>
+        </w:rPr>
+      </w:pPr>
+      <w:r>
+        <w:rPr>
+          <w:lang w:val="it-IT" w:eastAsia="en-GB"/>
+        </w:rPr>
+        <w:t>Quali file aprire in VS Code.</w:t>
+      </w:r>
+    </w:p>
+    <w:p>
+      <w:pPr>
+        <w:pStyle w:val="ListParagraph"/>
+        <w:numPr>
+          <w:ilvl w:val="0"/>
+          <w:numId w:val="19"/>
+        </w:numPr>
+        <w:rPr>
+          <w:lang w:val="it-IT" w:eastAsia="en-GB"/>
+        </w:rPr>
+      </w:pPr>
+      <w:r>
+        <w:rPr>
+          <w:lang w:val="it-IT" w:eastAsia="en-GB"/>
+        </w:rPr>
+        <w:t>Cosa incollare esattamente e in quale punto del file.</w:t>
+      </w:r>
+    </w:p>
+    <w:p>
+      <w:pPr>
+        <w:pStyle w:val="ListParagraph"/>
+        <w:numPr>
+          <w:ilvl w:val="0"/>
+          <w:numId w:val="19"/>
+        </w:numPr>
+        <w:rPr>
+          <w:lang w:val="it-IT" w:eastAsia="en-GB"/>
+        </w:rPr>
+      </w:pPr>
+      <w:r>
+        <w:rPr>
+          <w:lang w:val="it-IT" w:eastAsia="en-GB"/>
+        </w:rPr>
+        <w:t>Quali tasti premere (es. Ctrl+S per salvare).</w:t>
+      </w:r>
+    </w:p>
+    <w:p>
+      <w:pPr>
+        <w:pStyle w:val="ListParagraph"/>
+        <w:numPr>
+          <w:ilvl w:val="0"/>
+          <w:numId w:val="19"/>
+        </w:numPr>
+        <w:rPr>
+          <w:lang w:val="it-IT" w:eastAsia="en-GB"/>
+        </w:rPr>
+      </w:pPr>
+      <w:r>
+        <w:rPr>
+          <w:lang w:val="it-IT" w:eastAsia="en-GB"/>
+        </w:rPr>
+        <w:t>Come eseguire i test manuali per verificare il funzionamento.</w:t>
+      </w:r>
+    </w:p>
+    <w:p>
+      <w:pPr>
+        <w:rPr>
+          <w:lang w:val="it-IT" w:eastAsia="en-GB"/>
+        </w:rPr>
+      </w:pPr>
+      <w:r>
+        <w:rPr>
+          <w:lang w:val="it-IT" w:eastAsia="en-GB"/>
+        </w:rPr>
+        <w:t>In questo modo ogni modifica è comprensibile anche a un non tecnico e immediatamente testabile.</w:t>
+      </w:r>
+    </w:p>
+    <w:p>
+      <w:pPr>
+        <w:pStyle w:val="Heading2"/>
+      </w:pPr>
+      <w:r>
+        <w:t>Checklist di test al termine di ogni batch</w:t>
+      </w:r>
+    </w:p>
+    <w:p>
+      <w:pPr>
+        <w:rPr>
+          <w:lang w:val="it-IT"/>
+        </w:rPr>
+      </w:pPr>
+      <w:r>
+        <w:rPr>
+          <w:lang w:val="it-IT"/>
+        </w:rPr>
+        <w:t>Alla fine di ogni sessione di implementazione, l'assistente fornirà una checklist di test manuali per verificare che quanto sviluppato funzioni correttamente. La checklist includerà:</w:t>
+      </w:r>
+    </w:p>
+    <w:p>
+      <w:pPr>
+        <w:pStyle w:val="ListParagraph"/>
+        <w:numPr>
+          <w:ilvl w:val="1"/>
+          <w:numId w:val="14"/>
+        </w:numPr>
+        <w:rPr>
+          <w:lang w:val="it-IT"/>
+        </w:rPr>
+      </w:pPr>
+      <w:r>
+        <w:rPr>
+          <w:lang w:val="it-IT"/>
+        </w:rPr>
+        <w:t>Azioni specifiche da compiere nel gioco (es. "clicca su una cella verde").</w:t>
+      </w:r>
+    </w:p>
+    <w:p>
+      <w:pPr>
+        <w:pStyle w:val="ListParagraph"/>
+        <w:numPr>
+          <w:ilvl w:val="1"/>
+          <w:numId w:val="14"/>
+        </w:numPr>
+        <w:rPr>
+          <w:lang w:val="it-IT"/>
+        </w:rPr>
+      </w:pPr>
+      <w:r>
+        <w:rPr>
+          <w:lang w:val="it-IT"/>
+        </w:rPr>
+        <w:t>Il comportamento atteso (es. "il pop deve iniziare a muoversi verso la cella").</w:t>
+      </w:r>
+    </w:p>
+    <w:p>
+      <w:pPr>
+        <w:pStyle w:val="ListParagraph"/>
+        <w:numPr>
+          <w:ilvl w:val="1"/>
+          <w:numId w:val="14"/>
+        </w:numPr>
+        <w:rPr>
+          <w:lang w:val="it-IT"/>
+        </w:rPr>
+      </w:pPr>
+      <w:r>
+        <w:rPr>
+          <w:lang w:val="it-IT"/>
+        </w:rPr>
+        <w:t>Eventuali controlli nella console del browser (es. "non devono apparire errori rossi").</w:t>
+      </w:r>
+    </w:p>
+    <w:p>
+      <w:pPr>
+        <w:rPr>
+          <w:lang w:val="it-IT"/>
+        </w:rPr>
+      </w:pPr>
+      <w:r>
+        <w:rPr>
+          <w:lang w:val="it-IT"/>
+        </w:rPr>
+        <w:t>L'utente eseguirà i test e segnalerà eventuali anomalie prima di procedere al commit.</w:t>
+      </w:r>
+    </w:p>
+    <w:p>
+      <w:pPr>
+        <w:pStyle w:val="Heading2"/>
+      </w:pPr>
+      <w:r>
+        <w:t>Aggiornamento della documentazione al termine di ogni sessione</w:t>
+      </w:r>
+    </w:p>
+    <w:p>
+      <w:pPr>
+        <w:rPr>
+          <w:lang w:val="it-IT"/>
+        </w:rPr>
+      </w:pPr>
+      <w:r>
+        <w:rPr>
+          <w:lang w:val="it-IT"/>
+        </w:rPr>
+        <w:t>Alla fine di ogni sessione, l'assistente ricorderà all'utente di:</w:t>
+      </w:r>
+    </w:p>
+    <w:p>
+      <w:pPr>
+        <w:pStyle w:val="ListParagraph"/>
+        <w:numPr>
+          <w:ilvl w:val="1"/>
+          <w:numId w:val="14"/>
+        </w:numPr>
+        <w:rPr>
+          <w:lang w:val="it-IT"/>
+        </w:rPr>
+      </w:pPr>
+      <w:r>
+        <w:rPr>
+          <w:lang w:val="it-IT"/>
+        </w:rPr>
+        <w:lastRenderedPageBreak/>
+        <w:t>Verificare se i documenti di design (GDD, roadmap, concept) devono essere aggiornati per riflettere le nuove meccaniche implementate o le decisioni prese durante la sessione.</w:t>
+      </w:r>
+    </w:p>
+    <w:p>
+      <w:pPr>
+        <w:pStyle w:val="ListParagraph"/>
+        <w:numPr>
+          <w:ilvl w:val="1"/>
+          <w:numId w:val="14"/>
+        </w:numPr>
+        <w:rPr>
+          <w:lang w:val="it-IT"/>
+        </w:rPr>
+      </w:pPr>
+      <w:r>
+        <w:rPr>
+          <w:lang w:val="it-IT"/>
+        </w:rPr>
+        <w:t>Aggiornare il TECHNICAL.md se sono state introdotte nuove strutture dati, funzioni o pattern architetturali.</w:t>
+      </w:r>
+    </w:p>
+    <w:p>
+      <w:pPr>
+        <w:pStyle w:val="ListParagraph"/>
+        <w:numPr>
+          <w:ilvl w:val="1"/>
+          <w:numId w:val="14"/>
+        </w:numPr>
+        <w:rPr>
+          <w:lang w:val="it-IT"/>
+        </w:rPr>
+      </w:pPr>
+      <w:r>
+        <w:rPr>
+          <w:lang w:val="it-IT"/>
+        </w:rPr>
+        <w:t>Fare commit e push di tutti i file modificati (codice e documentazione) con un messaggio chiaro.</w:t>
+      </w:r>
     </w:p>
     <w:p>
       <w:pPr>
         <w:pStyle w:val="Heading1"/>
       </w:pPr>
-      <w:proofErr w:type="spellStart"/>
-      <w:r>
-        <w:t>Riferimenti</w:t>
-      </w:r>
-      <w:proofErr w:type="spellEnd"/>
-      <w:r>
-        <w:t xml:space="preserve"> </w:t>
-      </w:r>
-      <w:proofErr w:type="spellStart"/>
-      <w:r>
-        <w:t>incrociati</w:t>
-      </w:r>
-      <w:proofErr w:type="spellEnd"/>
+      <w:r>
+        <w:t>Riferimenti incrociati</w:t>
+      </w:r>
     </w:p>
     <w:p>
       <w:pPr>
@@ -2988,6 +2307,118 @@
 <file path=word/numbering.xml><?xml version="1.0" encoding="utf-8"?>
 <w:numbering xmlns:wpc="http://schemas.microsoft.com/office/word/2010/wordprocessingCanvas" xmlns:cx="http://schemas.microsoft.com/office/drawing/2014/chartex" xmlns:cx1="http://schemas.microsoft.com/office/drawing/2015/9/8/chartex" xmlns:cx2="http://schemas.microsoft.com/office/drawing/2015/10/21/chartex" xmlns:cx3="http://schemas.microsoft.com/office/drawing/2016/5/9/chartex" xmlns:cx4="http://schemas.microsoft.com/office/drawing/2016/5/10/chartex" xmlns:cx5="http://schemas.microsoft.com/office/drawing/2016/5/11/chartex" xmlns:cx6="http://schemas.microsoft.com/office/drawing/2016/5/12/chartex" xmlns:cx7="http://schemas.microsoft.com/office/drawing/2016/5/13/chartex" xmlns:cx8="http://schemas.microsoft.com/office/drawing/2016/5/14/chartex" xmlns:mc="http://schemas.openxmlformats.org/markup-compatibility/2006" xmlns:aink="http://schemas.microsoft.com/office/drawing/2016/ink" xmlns:am3d="http://schemas.microsoft.com/office/drawing/2017/model3d" xmlns:o="urn:schemas-microsoft-com:office:office" xmlns:oel="http://schemas.microsoft.com/office/2019/extlst" xmlns:r="http://schemas.openxmlformats.org/officeDocument/2006/relationships" xmlns:m="http://schemas.openxmlformats.org/officeDocument/2006/math" xmlns:v="urn:schemas-microsoft-com:vml" xmlns:wp14="http://schemas.microsoft.com/office/word/2010/wordprocessingDrawing" xmlns:wp="http://schemas.openxmlformats.org/drawingml/2006/wordprocessingDrawing" xmlns:w10="urn:schemas-microsoft-com:office:word" xmlns:w="http://schemas.openxmlformats.org/wordprocessingml/2006/main" xmlns:w14="http://schemas.microsoft.com/office/word/2010/wordml" xmlns:w15="http://schemas.microsoft.com/office/word/2012/wordml" xmlns:w16cex="http://schemas.microsoft.com/office/word/2018/wordml/cex" xmlns:w16cid="http://schemas.microsoft.com/office/word/2016/wordml/cid" xmlns:w16="http://schemas.microsoft.com/office/word/2018/wordml" xmlns:w16du="http://schemas.microsoft.com/office/word/2023/wordml/word16du" xmlns:w16sdtdh="http://schemas.microsoft.com/office/word/2020/wordml/sdtdatahash" xmlns:w16sdtfl="http://schemas.microsoft.com/office/word/2024/wordml/sdtformatlock" xmlns:w16se="http://schemas.microsoft.com/office/word/2015/wordml/symex" xmlns:wpg="http://schemas.microsoft.com/office/word/2010/wordprocessingGroup" xmlns:wpi="http://schemas.microsoft.com/office/word/2010/wordprocessingInk" xmlns:wne="http://schemas.microsoft.com/office/word/2006/wordml" xmlns:wps="http://schemas.microsoft.com/office/word/2010/wordprocessingShape" mc:Ignorable="w14 w15 w16se w16cid w16 w16cex w16sdtdh w16sdtfl w16du wp14">
   <w:abstractNum w:abstractNumId="0" w15:restartNumberingAfterBreak="0">
+    <w:nsid w:val="02082034"/>
+    <w:multiLevelType w:val="hybridMultilevel"/>
+    <w:tmpl w:val="04349C5A"/>
+    <w:lvl w:ilvl="0" w:tplc="C3982DF2">
+      <w:numFmt w:val="bullet"/>
+      <w:lvlText w:val="-"/>
+      <w:lvlJc w:val="left"/>
+      <w:pPr>
+        <w:ind w:left="525" w:hanging="360"/>
+      </w:pPr>
+      <w:rPr>
+        <w:rFonts w:ascii="Calibri" w:eastAsiaTheme="minorHAnsi" w:hAnsi="Calibri" w:cs="Calibri" w:hint="default"/>
+      </w:rPr>
+    </w:lvl>
+    <w:lvl w:ilvl="1" w:tplc="08090003" w:tentative="1">
+      <w:start w:val="1"/>
+      <w:numFmt w:val="bullet"/>
+      <w:lvlText w:val="o"/>
+      <w:lvlJc w:val="left"/>
+      <w:pPr>
+        <w:ind w:left="1245" w:hanging="360"/>
+      </w:pPr>
+      <w:rPr>
+        <w:rFonts w:ascii="Courier New" w:hAnsi="Courier New" w:cs="Courier New" w:hint="default"/>
+      </w:rPr>
+    </w:lvl>
+    <w:lvl w:ilvl="2" w:tplc="08090005" w:tentative="1">
+      <w:start w:val="1"/>
+      <w:numFmt w:val="bullet"/>
+      <w:lvlText w:val=""/>
+      <w:lvlJc w:val="left"/>
+      <w:pPr>
+        <w:ind w:left="1965" w:hanging="360"/>
+      </w:pPr>
+      <w:rPr>
+        <w:rFonts w:ascii="Wingdings" w:hAnsi="Wingdings" w:hint="default"/>
+      </w:rPr>
+    </w:lvl>
+    <w:lvl w:ilvl="3" w:tplc="08090001" w:tentative="1">
+      <w:start w:val="1"/>
+      <w:numFmt w:val="bullet"/>
+      <w:lvlText w:val=""/>
+      <w:lvlJc w:val="left"/>
+      <w:pPr>
+        <w:ind w:left="2685" w:hanging="360"/>
+      </w:pPr>
+      <w:rPr>
+        <w:rFonts w:ascii="Symbol" w:hAnsi="Symbol" w:hint="default"/>
+      </w:rPr>
+    </w:lvl>
+    <w:lvl w:ilvl="4" w:tplc="08090003" w:tentative="1">
+      <w:start w:val="1"/>
+      <w:numFmt w:val="bullet"/>
+      <w:lvlText w:val="o"/>
+      <w:lvlJc w:val="left"/>
+      <w:pPr>
+        <w:ind w:left="3405" w:hanging="360"/>
+      </w:pPr>
+      <w:rPr>
+        <w:rFonts w:ascii="Courier New" w:hAnsi="Courier New" w:cs="Courier New" w:hint="default"/>
+      </w:rPr>
+    </w:lvl>
+    <w:lvl w:ilvl="5" w:tplc="08090005" w:tentative="1">
+      <w:start w:val="1"/>
+      <w:numFmt w:val="bullet"/>
+      <w:lvlText w:val=""/>
+      <w:lvlJc w:val="left"/>
+      <w:pPr>
+        <w:ind w:left="4125" w:hanging="360"/>
+      </w:pPr>
+      <w:rPr>
+        <w:rFonts w:ascii="Wingdings" w:hAnsi="Wingdings" w:hint="default"/>
+      </w:rPr>
+    </w:lvl>
+    <w:lvl w:ilvl="6" w:tplc="08090001" w:tentative="1">
+      <w:start w:val="1"/>
+      <w:numFmt w:val="bullet"/>
+      <w:lvlText w:val=""/>
+      <w:lvlJc w:val="left"/>
+      <w:pPr>
+        <w:ind w:left="4845" w:hanging="360"/>
+      </w:pPr>
+      <w:rPr>
+        <w:rFonts w:ascii="Symbol" w:hAnsi="Symbol" w:hint="default"/>
+      </w:rPr>
+    </w:lvl>
+    <w:lvl w:ilvl="7" w:tplc="08090003" w:tentative="1">
+      <w:start w:val="1"/>
+      <w:numFmt w:val="bullet"/>
+      <w:lvlText w:val="o"/>
+      <w:lvlJc w:val="left"/>
+      <w:pPr>
+        <w:ind w:left="5565" w:hanging="360"/>
+      </w:pPr>
+      <w:rPr>
+        <w:rFonts w:ascii="Courier New" w:hAnsi="Courier New" w:cs="Courier New" w:hint="default"/>
+      </w:rPr>
+    </w:lvl>
+    <w:lvl w:ilvl="8" w:tplc="08090005" w:tentative="1">
+      <w:start w:val="1"/>
+      <w:numFmt w:val="bullet"/>
+      <w:lvlText w:val=""/>
+      <w:lvlJc w:val="left"/>
+      <w:pPr>
+        <w:ind w:left="6285" w:hanging="360"/>
+      </w:pPr>
+      <w:rPr>
+        <w:rFonts w:ascii="Wingdings" w:hAnsi="Wingdings" w:hint="default"/>
+      </w:rPr>
+    </w:lvl>
+  </w:abstractNum>
+  <w:abstractNum w:abstractNumId="1" w15:restartNumberingAfterBreak="0">
     <w:nsid w:val="03F44815"/>
     <w:multiLevelType w:val="multilevel"/>
     <w:tmpl w:val="09124338"/>
@@ -3082,7 +2513,7 @@
       </w:pPr>
     </w:lvl>
   </w:abstractNum>
-  <w:abstractNum w:abstractNumId="1" w15:restartNumberingAfterBreak="0">
+  <w:abstractNum w:abstractNumId="2" w15:restartNumberingAfterBreak="0">
     <w:nsid w:val="092C135F"/>
     <w:multiLevelType w:val="multilevel"/>
     <w:tmpl w:val="BD8E7EC4"/>
@@ -3231,7 +2662,120 @@
       </w:rPr>
     </w:lvl>
   </w:abstractNum>
-  <w:abstractNum w:abstractNumId="2" w15:restartNumberingAfterBreak="0">
+  <w:abstractNum w:abstractNumId="3" w15:restartNumberingAfterBreak="0">
+    <w:nsid w:val="0C4B3B15"/>
+    <w:multiLevelType w:val="hybridMultilevel"/>
+    <w:tmpl w:val="A2CA88A8"/>
+    <w:lvl w:ilvl="0" w:tplc="08090001">
+      <w:start w:val="1"/>
+      <w:numFmt w:val="bullet"/>
+      <w:lvlText w:val=""/>
+      <w:lvlJc w:val="left"/>
+      <w:pPr>
+        <w:ind w:left="720" w:hanging="360"/>
+      </w:pPr>
+      <w:rPr>
+        <w:rFonts w:ascii="Symbol" w:hAnsi="Symbol" w:hint="default"/>
+      </w:rPr>
+    </w:lvl>
+    <w:lvl w:ilvl="1" w:tplc="08090003" w:tentative="1">
+      <w:start w:val="1"/>
+      <w:numFmt w:val="bullet"/>
+      <w:lvlText w:val="o"/>
+      <w:lvlJc w:val="left"/>
+      <w:pPr>
+        <w:ind w:left="1440" w:hanging="360"/>
+      </w:pPr>
+      <w:rPr>
+        <w:rFonts w:ascii="Courier New" w:hAnsi="Courier New" w:cs="Courier New" w:hint="default"/>
+      </w:rPr>
+    </w:lvl>
+    <w:lvl w:ilvl="2" w:tplc="08090005" w:tentative="1">
+      <w:start w:val="1"/>
+      <w:numFmt w:val="bullet"/>
+      <w:lvlText w:val=""/>
+      <w:lvlJc w:val="left"/>
+      <w:pPr>
+        <w:ind w:left="2160" w:hanging="360"/>
+      </w:pPr>
+      <w:rPr>
+        <w:rFonts w:ascii="Wingdings" w:hAnsi="Wingdings" w:hint="default"/>
+      </w:rPr>
+    </w:lvl>
+    <w:lvl w:ilvl="3" w:tplc="08090001" w:tentative="1">
+      <w:start w:val="1"/>
+      <w:numFmt w:val="bullet"/>
+      <w:lvlText w:val=""/>
+      <w:lvlJc w:val="left"/>
+      <w:pPr>
+        <w:ind w:left="2880" w:hanging="360"/>
+      </w:pPr>
+      <w:rPr>
+        <w:rFonts w:ascii="Symbol" w:hAnsi="Symbol" w:hint="default"/>
+      </w:rPr>
+    </w:lvl>
+    <w:lvl w:ilvl="4" w:tplc="08090003" w:tentative="1">
+      <w:start w:val="1"/>
+      <w:numFmt w:val="bullet"/>
+      <w:lvlText w:val="o"/>
+      <w:lvlJc w:val="left"/>
+      <w:pPr>
+        <w:ind w:left="3600" w:hanging="360"/>
+      </w:pPr>
+      <w:rPr>
+        <w:rFonts w:ascii="Courier New" w:hAnsi="Courier New" w:cs="Courier New" w:hint="default"/>
+      </w:rPr>
+    </w:lvl>
+    <w:lvl w:ilvl="5" w:tplc="08090005" w:tentative="1">
+      <w:start w:val="1"/>
+      <w:numFmt w:val="bullet"/>
+      <w:lvlText w:val=""/>
+      <w:lvlJc w:val="left"/>
+      <w:pPr>
+        <w:ind w:left="4320" w:hanging="360"/>
+      </w:pPr>
+      <w:rPr>
+        <w:rFonts w:ascii="Wingdings" w:hAnsi="Wingdings" w:hint="default"/>
+      </w:rPr>
+    </w:lvl>
+    <w:lvl w:ilvl="6" w:tplc="08090001" w:tentative="1">
+      <w:start w:val="1"/>
+      <w:numFmt w:val="bullet"/>
+      <w:lvlText w:val=""/>
+      <w:lvlJc w:val="left"/>
+      <w:pPr>
+        <w:ind w:left="5040" w:hanging="360"/>
+      </w:pPr>
+      <w:rPr>
+        <w:rFonts w:ascii="Symbol" w:hAnsi="Symbol" w:hint="default"/>
+      </w:rPr>
+    </w:lvl>
+    <w:lvl w:ilvl="7" w:tplc="08090003" w:tentative="1">
+      <w:start w:val="1"/>
+      <w:numFmt w:val="bullet"/>
+      <w:lvlText w:val="o"/>
+      <w:lvlJc w:val="left"/>
+      <w:pPr>
+        <w:ind w:left="5760" w:hanging="360"/>
+      </w:pPr>
+      <w:rPr>
+        <w:rFonts w:ascii="Courier New" w:hAnsi="Courier New" w:cs="Courier New" w:hint="default"/>
+      </w:rPr>
+    </w:lvl>
+    <w:lvl w:ilvl="8" w:tplc="08090005" w:tentative="1">
+      <w:start w:val="1"/>
+      <w:numFmt w:val="bullet"/>
+      <w:lvlText w:val=""/>
+      <w:lvlJc w:val="left"/>
+      <w:pPr>
+        <w:ind w:left="6480" w:hanging="360"/>
+      </w:pPr>
+      <w:rPr>
+        <w:rFonts w:ascii="Wingdings" w:hAnsi="Wingdings" w:hint="default"/>
+      </w:rPr>
+    </w:lvl>
+  </w:abstractNum>
+  <w:abstractNum w:abstractNumId="4" w15:restartNumberingAfterBreak="0">
     <w:nsid w:val="18FC330E"/>
     <w:multiLevelType w:val="multilevel"/>
     <w:tmpl w:val="AC247900"/>
@@ -3380,7 +2924,7 @@
       </w:rPr>
     </w:lvl>
   </w:abstractNum>
-  <w:abstractNum w:abstractNumId="3" w15:restartNumberingAfterBreak="0">
+  <w:abstractNum w:abstractNumId="5" w15:restartNumberingAfterBreak="0">
     <w:nsid w:val="21D76783"/>
     <w:multiLevelType w:val="multilevel"/>
     <w:tmpl w:val="C6E25464"/>
@@ -3529,7 +3073,7 @@
       </w:rPr>
     </w:lvl>
   </w:abstractNum>
-  <w:abstractNum w:abstractNumId="4" w15:restartNumberingAfterBreak="0">
+  <w:abstractNum w:abstractNumId="6" w15:restartNumberingAfterBreak="0">
     <w:nsid w:val="26734DB7"/>
     <w:multiLevelType w:val="multilevel"/>
     <w:tmpl w:val="6206E184"/>
@@ -3678,7 +3222,120 @@
       </w:rPr>
     </w:lvl>
   </w:abstractNum>
-  <w:abstractNum w:abstractNumId="5" w15:restartNumberingAfterBreak="0">
+  <w:abstractNum w:abstractNumId="7" w15:restartNumberingAfterBreak="0">
+    <w:nsid w:val="2D747D0A"/>
+    <w:multiLevelType w:val="hybridMultilevel"/>
+    <w:tmpl w:val="8F7AB6A8"/>
+    <w:lvl w:ilvl="0" w:tplc="08090001">
+      <w:start w:val="1"/>
+      <w:numFmt w:val="bullet"/>
+      <w:lvlText w:val=""/>
+      <w:lvlJc w:val="left"/>
+      <w:pPr>
+        <w:ind w:left="720" w:hanging="360"/>
+      </w:pPr>
+      <w:rPr>
+        <w:rFonts w:ascii="Symbol" w:hAnsi="Symbol" w:hint="default"/>
+      </w:rPr>
+    </w:lvl>
+    <w:lvl w:ilvl="1" w:tplc="08090003" w:tentative="1">
+      <w:start w:val="1"/>
+      <w:numFmt w:val="bullet"/>
+      <w:lvlText w:val="o"/>
+      <w:lvlJc w:val="left"/>
+      <w:pPr>
+        <w:ind w:left="1440" w:hanging="360"/>
+      </w:pPr>
+      <w:rPr>
+        <w:rFonts w:ascii="Courier New" w:hAnsi="Courier New" w:cs="Courier New" w:hint="default"/>
+      </w:rPr>
+    </w:lvl>
+    <w:lvl w:ilvl="2" w:tplc="08090005" w:tentative="1">
+      <w:start w:val="1"/>
+      <w:numFmt w:val="bullet"/>
+      <w:lvlText w:val=""/>
+      <w:lvlJc w:val="left"/>
+      <w:pPr>
+        <w:ind w:left="2160" w:hanging="360"/>
+      </w:pPr>
+      <w:rPr>
+        <w:rFonts w:ascii="Wingdings" w:hAnsi="Wingdings" w:hint="default"/>
+      </w:rPr>
+    </w:lvl>
+    <w:lvl w:ilvl="3" w:tplc="08090001" w:tentative="1">
+      <w:start w:val="1"/>
+      <w:numFmt w:val="bullet"/>
+      <w:lvlText w:val=""/>
+      <w:lvlJc w:val="left"/>
+      <w:pPr>
+        <w:ind w:left="2880" w:hanging="360"/>
+      </w:pPr>
+      <w:rPr>
+        <w:rFonts w:ascii="Symbol" w:hAnsi="Symbol" w:hint="default"/>
+      </w:rPr>
+    </w:lvl>
+    <w:lvl w:ilvl="4" w:tplc="08090003" w:tentative="1">
+      <w:start w:val="1"/>
+      <w:numFmt w:val="bullet"/>
+      <w:lvlText w:val="o"/>
+      <w:lvlJc w:val="left"/>
+      <w:pPr>
+        <w:ind w:left="3600" w:hanging="360"/>
+      </w:pPr>
+      <w:rPr>
+        <w:rFonts w:ascii="Courier New" w:hAnsi="Courier New" w:cs="Courier New" w:hint="default"/>
+      </w:rPr>
+    </w:lvl>
+    <w:lvl w:ilvl="5" w:tplc="08090005" w:tentative="1">
+      <w:start w:val="1"/>
+      <w:numFmt w:val="bullet"/>
+      <w:lvlText w:val=""/>
+      <w:lvlJc w:val="left"/>
+      <w:pPr>
+        <w:ind w:left="4320" w:hanging="360"/>
+      </w:pPr>
+      <w:rPr>
+        <w:rFonts w:ascii="Wingdings" w:hAnsi="Wingdings" w:hint="default"/>
+      </w:rPr>
+    </w:lvl>
+    <w:lvl w:ilvl="6" w:tplc="08090001" w:tentative="1">
+      <w:start w:val="1"/>
+      <w:numFmt w:val="bullet"/>
+      <w:lvlText w:val=""/>
+      <w:lvlJc w:val="left"/>
+      <w:pPr>
+        <w:ind w:left="5040" w:hanging="360"/>
+      </w:pPr>
+      <w:rPr>
+        <w:rFonts w:ascii="Symbol" w:hAnsi="Symbol" w:hint="default"/>
+      </w:rPr>
+    </w:lvl>
+    <w:lvl w:ilvl="7" w:tplc="08090003" w:tentative="1">
+      <w:start w:val="1"/>
+      <w:numFmt w:val="bullet"/>
+      <w:lvlText w:val="o"/>
+      <w:lvlJc w:val="left"/>
+      <w:pPr>
+        <w:ind w:left="5760" w:hanging="360"/>
+      </w:pPr>
+      <w:rPr>
+        <w:rFonts w:ascii="Courier New" w:hAnsi="Courier New" w:cs="Courier New" w:hint="default"/>
+      </w:rPr>
+    </w:lvl>
+    <w:lvl w:ilvl="8" w:tplc="08090005" w:tentative="1">
+      <w:start w:val="1"/>
+      <w:numFmt w:val="bullet"/>
+      <w:lvlText w:val=""/>
+      <w:lvlJc w:val="left"/>
+      <w:pPr>
+        <w:ind w:left="6480" w:hanging="360"/>
+      </w:pPr>
+      <w:rPr>
+        <w:rFonts w:ascii="Wingdings" w:hAnsi="Wingdings" w:hint="default"/>
+      </w:rPr>
+    </w:lvl>
+  </w:abstractNum>
+  <w:abstractNum w:abstractNumId="8" w15:restartNumberingAfterBreak="0">
     <w:nsid w:val="300322DB"/>
     <w:multiLevelType w:val="hybridMultilevel"/>
     <w:tmpl w:val="AB0213C2"/>
@@ -3767,7 +3424,7 @@
       </w:pPr>
     </w:lvl>
   </w:abstractNum>
-  <w:abstractNum w:abstractNumId="6" w15:restartNumberingAfterBreak="0">
+  <w:abstractNum w:abstractNumId="9" w15:restartNumberingAfterBreak="0">
     <w:nsid w:val="35437768"/>
     <w:multiLevelType w:val="multilevel"/>
     <w:tmpl w:val="3DBCE22A"/>
@@ -3916,7 +3573,7 @@
       </w:rPr>
     </w:lvl>
   </w:abstractNum>
-  <w:abstractNum w:abstractNumId="7" w15:restartNumberingAfterBreak="0">
+  <w:abstractNum w:abstractNumId="10" w15:restartNumberingAfterBreak="0">
     <w:nsid w:val="45D40CED"/>
     <w:multiLevelType w:val="multilevel"/>
     <w:tmpl w:val="6A049972"/>
@@ -4002,7 +3659,119 @@
       </w:pPr>
     </w:lvl>
   </w:abstractNum>
-  <w:abstractNum w:abstractNumId="8" w15:restartNumberingAfterBreak="0">
+  <w:abstractNum w:abstractNumId="11" w15:restartNumberingAfterBreak="0">
+    <w:nsid w:val="494A6890"/>
+    <w:multiLevelType w:val="hybridMultilevel"/>
+    <w:tmpl w:val="8598BAA4"/>
+    <w:lvl w:ilvl="0" w:tplc="C3982DF2">
+      <w:numFmt w:val="bullet"/>
+      <w:lvlText w:val="-"/>
+      <w:lvlJc w:val="left"/>
+      <w:pPr>
+        <w:ind w:left="690" w:hanging="360"/>
+      </w:pPr>
+      <w:rPr>
+        <w:rFonts w:ascii="Calibri" w:eastAsiaTheme="minorHAnsi" w:hAnsi="Calibri" w:cs="Calibri" w:hint="default"/>
+      </w:rPr>
+    </w:lvl>
+    <w:lvl w:ilvl="1" w:tplc="08090003" w:tentative="1">
+      <w:start w:val="1"/>
+      <w:numFmt w:val="bullet"/>
+      <w:lvlText w:val="o"/>
+      <w:lvlJc w:val="left"/>
+      <w:pPr>
+        <w:ind w:left="1605" w:hanging="360"/>
+      </w:pPr>
+      <w:rPr>
+        <w:rFonts w:ascii="Courier New" w:hAnsi="Courier New" w:cs="Courier New" w:hint="default"/>
+      </w:rPr>
+    </w:lvl>
+    <w:lvl w:ilvl="2" w:tplc="08090005" w:tentative="1">
+      <w:start w:val="1"/>
+      <w:numFmt w:val="bullet"/>
+      <w:lvlText w:val=""/>
+      <w:lvlJc w:val="left"/>
+      <w:pPr>
+        <w:ind w:left="2325" w:hanging="360"/>
+      </w:pPr>
+      <w:rPr>
+        <w:rFonts w:ascii="Wingdings" w:hAnsi="Wingdings" w:hint="default"/>
+      </w:rPr>
+    </w:lvl>
+    <w:lvl w:ilvl="3" w:tplc="08090001" w:tentative="1">
+      <w:start w:val="1"/>
+      <w:numFmt w:val="bullet"/>
+      <w:lvlText w:val=""/>
+      <w:lvlJc w:val="left"/>
+      <w:pPr>
+        <w:ind w:left="3045" w:hanging="360"/>
+      </w:pPr>
+      <w:rPr>
+        <w:rFonts w:ascii="Symbol" w:hAnsi="Symbol" w:hint="default"/>
+      </w:rPr>
+    </w:lvl>
+    <w:lvl w:ilvl="4" w:tplc="08090003" w:tentative="1">
+      <w:start w:val="1"/>
+      <w:numFmt w:val="bullet"/>
+      <w:lvlText w:val="o"/>
+      <w:lvlJc w:val="left"/>
+      <w:pPr>
+        <w:ind w:left="3765" w:hanging="360"/>
+      </w:pPr>
+      <w:rPr>
+        <w:rFonts w:ascii="Courier New" w:hAnsi="Courier New" w:cs="Courier New" w:hint="default"/>
+      </w:rPr>
+    </w:lvl>
+    <w:lvl w:ilvl="5" w:tplc="08090005" w:tentative="1">
+      <w:start w:val="1"/>
+      <w:numFmt w:val="bullet"/>
+      <w:lvlText w:val=""/>
+      <w:lvlJc w:val="left"/>
+      <w:pPr>
+        <w:ind w:left="4485" w:hanging="360"/>
+      </w:pPr>
+      <w:rPr>
+        <w:rFonts w:ascii="Wingdings" w:hAnsi="Wingdings" w:hint="default"/>
+      </w:rPr>
+    </w:lvl>
+    <w:lvl w:ilvl="6" w:tplc="08090001" w:tentative="1">
+      <w:start w:val="1"/>
+      <w:numFmt w:val="bullet"/>
+      <w:lvlText w:val=""/>
+      <w:lvlJc w:val="left"/>
+      <w:pPr>
+        <w:ind w:left="5205" w:hanging="360"/>
+      </w:pPr>
+      <w:rPr>
+        <w:rFonts w:ascii="Symbol" w:hAnsi="Symbol" w:hint="default"/>
+      </w:rPr>
+    </w:lvl>
+    <w:lvl w:ilvl="7" w:tplc="08090003" w:tentative="1">
+      <w:start w:val="1"/>
+      <w:numFmt w:val="bullet"/>
+      <w:lvlText w:val="o"/>
+      <w:lvlJc w:val="left"/>
+      <w:pPr>
+        <w:ind w:left="5925" w:hanging="360"/>
+      </w:pPr>
+      <w:rPr>
+        <w:rFonts w:ascii="Courier New" w:hAnsi="Courier New" w:cs="Courier New" w:hint="default"/>
+      </w:rPr>
+    </w:lvl>
+    <w:lvl w:ilvl="8" w:tplc="08090005" w:tentative="1">
+      <w:start w:val="1"/>
+      <w:numFmt w:val="bullet"/>
+      <w:lvlText w:val=""/>
+      <w:lvlJc w:val="left"/>
+      <w:pPr>
+        <w:ind w:left="6645" w:hanging="360"/>
+      </w:pPr>
+      <w:rPr>
+        <w:rFonts w:ascii="Wingdings" w:hAnsi="Wingdings" w:hint="default"/>
+      </w:rPr>
+    </w:lvl>
+  </w:abstractNum>
+  <w:abstractNum w:abstractNumId="12" w15:restartNumberingAfterBreak="0">
     <w:nsid w:val="52BF2B4F"/>
     <w:multiLevelType w:val="hybridMultilevel"/>
     <w:tmpl w:val="BDB8DC4A"/>
@@ -4115,7 +3884,7 @@
       </w:rPr>
     </w:lvl>
   </w:abstractNum>
-  <w:abstractNum w:abstractNumId="9" w15:restartNumberingAfterBreak="0">
+  <w:abstractNum w:abstractNumId="13" w15:restartNumberingAfterBreak="0">
     <w:nsid w:val="57E6693C"/>
     <w:multiLevelType w:val="multilevel"/>
     <w:tmpl w:val="E21E4AEA"/>
@@ -4264,7 +4033,7 @@
       </w:rPr>
     </w:lvl>
   </w:abstractNum>
-  <w:abstractNum w:abstractNumId="10" w15:restartNumberingAfterBreak="0">
+  <w:abstractNum w:abstractNumId="14" w15:restartNumberingAfterBreak="0">
     <w:nsid w:val="62B053A3"/>
     <w:multiLevelType w:val="hybridMultilevel"/>
     <w:tmpl w:val="B194E900"/>
@@ -4350,7 +4119,7 @@
       </w:pPr>
     </w:lvl>
   </w:abstractNum>
-  <w:abstractNum w:abstractNumId="11" w15:restartNumberingAfterBreak="0">
+  <w:abstractNum w:abstractNumId="15" w15:restartNumberingAfterBreak="0">
     <w:nsid w:val="67160CA4"/>
     <w:multiLevelType w:val="multilevel"/>
     <w:tmpl w:val="3EAE1DF8"/>
@@ -4463,7 +4232,120 @@
       </w:pPr>
     </w:lvl>
   </w:abstractNum>
-  <w:abstractNum w:abstractNumId="12" w15:restartNumberingAfterBreak="0">
+  <w:abstractNum w:abstractNumId="16" w15:restartNumberingAfterBreak="0">
+    <w:nsid w:val="686415E6"/>
+    <w:multiLevelType w:val="hybridMultilevel"/>
+    <w:tmpl w:val="9AC84FA2"/>
+    <w:lvl w:ilvl="0" w:tplc="08090001">
+      <w:start w:val="1"/>
+      <w:numFmt w:val="bullet"/>
+      <w:lvlText w:val=""/>
+      <w:lvlJc w:val="left"/>
+      <w:pPr>
+        <w:ind w:left="720" w:hanging="360"/>
+      </w:pPr>
+      <w:rPr>
+        <w:rFonts w:ascii="Symbol" w:hAnsi="Symbol" w:hint="default"/>
+      </w:rPr>
+    </w:lvl>
+    <w:lvl w:ilvl="1" w:tplc="08090003" w:tentative="1">
+      <w:start w:val="1"/>
+      <w:numFmt w:val="bullet"/>
+      <w:lvlText w:val="o"/>
+      <w:lvlJc w:val="left"/>
+      <w:pPr>
+        <w:ind w:left="1440" w:hanging="360"/>
+      </w:pPr>
+      <w:rPr>
+        <w:rFonts w:ascii="Courier New" w:hAnsi="Courier New" w:cs="Courier New" w:hint="default"/>
+      </w:rPr>
+    </w:lvl>
+    <w:lvl w:ilvl="2" w:tplc="08090005" w:tentative="1">
+      <w:start w:val="1"/>
+      <w:numFmt w:val="bullet"/>
+      <w:lvlText w:val=""/>
+      <w:lvlJc w:val="left"/>
+      <w:pPr>
+        <w:ind w:left="2160" w:hanging="360"/>
+      </w:pPr>
+      <w:rPr>
+        <w:rFonts w:ascii="Wingdings" w:hAnsi="Wingdings" w:hint="default"/>
+      </w:rPr>
+    </w:lvl>
+    <w:lvl w:ilvl="3" w:tplc="08090001" w:tentative="1">
+      <w:start w:val="1"/>
+      <w:numFmt w:val="bullet"/>
+      <w:lvlText w:val=""/>
+      <w:lvlJc w:val="left"/>
+      <w:pPr>
+        <w:ind w:left="2880" w:hanging="360"/>
+      </w:pPr>
+      <w:rPr>
+        <w:rFonts w:ascii="Symbol" w:hAnsi="Symbol" w:hint="default"/>
+      </w:rPr>
+    </w:lvl>
+    <w:lvl w:ilvl="4" w:tplc="08090003" w:tentative="1">
+      <w:start w:val="1"/>
+      <w:numFmt w:val="bullet"/>
+      <w:lvlText w:val="o"/>
+      <w:lvlJc w:val="left"/>
+      <w:pPr>
+        <w:ind w:left="3600" w:hanging="360"/>
+      </w:pPr>
+      <w:rPr>
+        <w:rFonts w:ascii="Courier New" w:hAnsi="Courier New" w:cs="Courier New" w:hint="default"/>
+      </w:rPr>
+    </w:lvl>
+    <w:lvl w:ilvl="5" w:tplc="08090005" w:tentative="1">
+      <w:start w:val="1"/>
+      <w:numFmt w:val="bullet"/>
+      <w:lvlText w:val=""/>
+      <w:lvlJc w:val="left"/>
+      <w:pPr>
+        <w:ind w:left="4320" w:hanging="360"/>
+      </w:pPr>
+      <w:rPr>
+        <w:rFonts w:ascii="Wingdings" w:hAnsi="Wingdings" w:hint="default"/>
+      </w:rPr>
+    </w:lvl>
+    <w:lvl w:ilvl="6" w:tplc="08090001" w:tentative="1">
+      <w:start w:val="1"/>
+      <w:numFmt w:val="bullet"/>
+      <w:lvlText w:val=""/>
+      <w:lvlJc w:val="left"/>
+      <w:pPr>
+        <w:ind w:left="5040" w:hanging="360"/>
+      </w:pPr>
+      <w:rPr>
+        <w:rFonts w:ascii="Symbol" w:hAnsi="Symbol" w:hint="default"/>
+      </w:rPr>
+    </w:lvl>
+    <w:lvl w:ilvl="7" w:tplc="08090003" w:tentative="1">
+      <w:start w:val="1"/>
+      <w:numFmt w:val="bullet"/>
+      <w:lvlText w:val="o"/>
+      <w:lvlJc w:val="left"/>
+      <w:pPr>
+        <w:ind w:left="5760" w:hanging="360"/>
+      </w:pPr>
+      <w:rPr>
+        <w:rFonts w:ascii="Courier New" w:hAnsi="Courier New" w:cs="Courier New" w:hint="default"/>
+      </w:rPr>
+    </w:lvl>
+    <w:lvl w:ilvl="8" w:tplc="08090005" w:tentative="1">
+      <w:start w:val="1"/>
+      <w:numFmt w:val="bullet"/>
+      <w:lvlText w:val=""/>
+      <w:lvlJc w:val="left"/>
+      <w:pPr>
+        <w:ind w:left="6480" w:hanging="360"/>
+      </w:pPr>
+      <w:rPr>
+        <w:rFonts w:ascii="Wingdings" w:hAnsi="Wingdings" w:hint="default"/>
+      </w:rPr>
+    </w:lvl>
+  </w:abstractNum>
+  <w:abstractNum w:abstractNumId="17" w15:restartNumberingAfterBreak="0">
     <w:nsid w:val="6E4D4AD7"/>
     <w:multiLevelType w:val="multilevel"/>
     <w:tmpl w:val="D354E42E"/>
@@ -4612,7 +4494,7 @@
       </w:rPr>
     </w:lvl>
   </w:abstractNum>
-  <w:abstractNum w:abstractNumId="13" w15:restartNumberingAfterBreak="0">
+  <w:abstractNum w:abstractNumId="18" w15:restartNumberingAfterBreak="0">
     <w:nsid w:val="6FA430C8"/>
     <w:multiLevelType w:val="multilevel"/>
     <w:tmpl w:val="4142CFCE"/>
@@ -4762,46 +4644,61 @@
     </w:lvl>
   </w:abstractNum>
   <w:num w:numId="1" w16cid:durableId="1753548350">
+    <w:abstractNumId w:val="18"/>
+  </w:num>
+  <w:num w:numId="2" w16cid:durableId="427048364">
+    <w:abstractNumId w:val="6"/>
+  </w:num>
+  <w:num w:numId="3" w16cid:durableId="1713846482">
+    <w:abstractNumId w:val="2"/>
+  </w:num>
+  <w:num w:numId="4" w16cid:durableId="1037005820">
+    <w:abstractNumId w:val="4"/>
+  </w:num>
+  <w:num w:numId="5" w16cid:durableId="2111391550">
+    <w:abstractNumId w:val="15"/>
+  </w:num>
+  <w:num w:numId="6" w16cid:durableId="844706756">
     <w:abstractNumId w:val="13"/>
   </w:num>
-  <w:num w:numId="2" w16cid:durableId="427048364">
-    <w:abstractNumId w:val="4"/>
+  <w:num w:numId="7" w16cid:durableId="1853176865">
+    <w:abstractNumId w:val="5"/>
   </w:num>
-  <w:num w:numId="3" w16cid:durableId="1713846482">
+  <w:num w:numId="8" w16cid:durableId="661277827">
+    <w:abstractNumId w:val="17"/>
+  </w:num>
+  <w:num w:numId="9" w16cid:durableId="1440685245">
+    <w:abstractNumId w:val="10"/>
+  </w:num>
+  <w:num w:numId="10" w16cid:durableId="1019117261">
+    <w:abstractNumId w:val="8"/>
+  </w:num>
+  <w:num w:numId="11" w16cid:durableId="662205183">
+    <w:abstractNumId w:val="14"/>
+  </w:num>
+  <w:num w:numId="12" w16cid:durableId="53700060">
     <w:abstractNumId w:val="1"/>
   </w:num>
-  <w:num w:numId="4" w16cid:durableId="1037005820">
-    <w:abstractNumId w:val="2"/>
-  </w:num>
-  <w:num w:numId="5" w16cid:durableId="2111391550">
-    <w:abstractNumId w:val="11"/>
-  </w:num>
-  <w:num w:numId="6" w16cid:durableId="844706756">
+  <w:num w:numId="13" w16cid:durableId="61368790">
     <w:abstractNumId w:val="9"/>
   </w:num>
-  <w:num w:numId="7" w16cid:durableId="1853176865">
+  <w:num w:numId="14" w16cid:durableId="815876773">
+    <w:abstractNumId w:val="12"/>
+  </w:num>
+  <w:num w:numId="15" w16cid:durableId="751241483">
+    <w:abstractNumId w:val="7"/>
+  </w:num>
+  <w:num w:numId="16" w16cid:durableId="822086425">
+    <w:abstractNumId w:val="16"/>
+  </w:num>
+  <w:num w:numId="17" w16cid:durableId="1747065957">
     <w:abstractNumId w:val="3"/>
   </w:num>
-  <w:num w:numId="8" w16cid:durableId="661277827">
-    <w:abstractNumId w:val="12"/>
-  </w:num>
-  <w:num w:numId="9" w16cid:durableId="1440685245">
-    <w:abstractNumId w:val="7"/>
-  </w:num>
-  <w:num w:numId="10" w16cid:durableId="1019117261">
-    <w:abstractNumId w:val="5"/>
-  </w:num>
-  <w:num w:numId="11" w16cid:durableId="662205183">
-    <w:abstractNumId w:val="10"/>
-  </w:num>
-  <w:num w:numId="12" w16cid:durableId="53700060">
+  <w:num w:numId="18" w16cid:durableId="1956400171">
     <w:abstractNumId w:val="0"/>
   </w:num>
-  <w:num w:numId="13" w16cid:durableId="61368790">
-    <w:abstractNumId w:val="6"/>
-  </w:num>
-  <w:num w:numId="14" w16cid:durableId="815876773">
-    <w:abstractNumId w:val="8"/>
+  <w:num w:numId="19" w16cid:durableId="1090584944">
+    <w:abstractNumId w:val="11"/>
   </w:num>
 </w:numbering>
 </file>
@@ -5445,7 +5342,6 @@
   <w:style w:type="character" w:default="1" w:styleId="DefaultParagraphFont">
     <w:name w:val="Default Paragraph Font"/>
     <w:uiPriority w:val="1"/>
-    <w:semiHidden/>
     <w:unhideWhenUsed/>
   </w:style>
   <w:style w:type="table" w:default="1" w:styleId="TableNormal">

</xml_diff>

<commit_message>
0.0.1A - MVP1 - Batch 1: Increase game resolution to 1280x720 and center canvas
- Set Phaser config width/height to 1280x720 for a larger game world.
- Updated CSS to center the canvas using flexbox on the body.
- Added in Technical documentation to do not remove comments that are still valid when changing code
</commit_message>
<xml_diff>
--- a/Docs/Technical.docx
+++ b/Docs/Technical.docx
@@ -7,8 +7,13 @@
         <w:pStyle w:val="Heading1"/>
       </w:pPr>
       <w:r>
-        <w:t>Stack tecnologico</w:t>
-      </w:r>
+        <w:t xml:space="preserve">Stack </w:t>
+      </w:r>
+      <w:proofErr w:type="spellStart"/>
+      <w:r>
+        <w:t>tecnologico</w:t>
+      </w:r>
+      <w:proofErr w:type="spellEnd"/>
     </w:p>
     <w:p>
       <w:pPr>
@@ -17,12 +22,21 @@
           <w:numId w:val="1"/>
         </w:numPr>
       </w:pPr>
+      <w:proofErr w:type="spellStart"/>
       <w:r>
         <w:rPr>
           <w:b/>
           <w:bCs/>
         </w:rPr>
-        <w:t>Linguaggio:</w:t>
+        <w:t>Linguaggio</w:t>
+      </w:r>
+      <w:proofErr w:type="spellEnd"/>
+      <w:r>
+        <w:rPr>
+          <w:b/>
+          <w:bCs/>
+        </w:rPr>
+        <w:t>:</w:t>
       </w:r>
       <w:r>
         <w:t> JavaScript (ES6+)</w:t>
@@ -50,7 +64,21 @@
         <w:rPr>
           <w:lang w:val="it-IT"/>
         </w:rPr>
-        <w:t> Phaser 3 (caricato da CDN)</w:t>
+        <w:t> </w:t>
+      </w:r>
+      <w:proofErr w:type="spellStart"/>
+      <w:r>
+        <w:rPr>
+          <w:lang w:val="it-IT"/>
+        </w:rPr>
+        <w:t>Phaser</w:t>
+      </w:r>
+      <w:proofErr w:type="spellEnd"/>
+      <w:r>
+        <w:rPr>
+          <w:lang w:val="it-IT"/>
+        </w:rPr>
+        <w:t xml:space="preserve"> 3 (caricato da CDN)</w:t>
       </w:r>
     </w:p>
     <w:p>
@@ -85,12 +113,21 @@
           <w:numId w:val="1"/>
         </w:numPr>
       </w:pPr>
+      <w:proofErr w:type="spellStart"/>
       <w:r>
         <w:rPr>
           <w:b/>
           <w:bCs/>
         </w:rPr>
-        <w:t>Struttura file:</w:t>
+        <w:t>Struttura</w:t>
+      </w:r>
+      <w:proofErr w:type="spellEnd"/>
+      <w:r>
+        <w:rPr>
+          <w:b/>
+          <w:bCs/>
+        </w:rPr>
+        <w:t xml:space="preserve"> file:</w:t>
       </w:r>
     </w:p>
     <w:p>
@@ -107,7 +144,21 @@
         <w:rPr>
           <w:lang w:val="it-IT"/>
         </w:rPr>
-        <w:t>index.html – punto di ingresso, carica Phaser e gli script</w:t>
+        <w:t xml:space="preserve">index.html – punto di ingresso, carica </w:t>
+      </w:r>
+      <w:proofErr w:type="spellStart"/>
+      <w:r>
+        <w:rPr>
+          <w:lang w:val="it-IT"/>
+        </w:rPr>
+        <w:t>Phaser</w:t>
+      </w:r>
+      <w:proofErr w:type="spellEnd"/>
+      <w:r>
+        <w:rPr>
+          <w:lang w:val="it-IT"/>
+        </w:rPr>
+        <w:t xml:space="preserve"> e gli script</w:t>
       </w:r>
     </w:p>
     <w:p>
@@ -120,11 +171,19 @@
           <w:lang w:val="it-IT"/>
         </w:rPr>
       </w:pPr>
-      <w:r>
-        <w:rPr>
-          <w:lang w:val="it-IT"/>
-        </w:rPr>
-        <w:t>css/style.css – stili per UI HTML sovrapposta</w:t>
+      <w:proofErr w:type="spellStart"/>
+      <w:r>
+        <w:rPr>
+          <w:lang w:val="it-IT"/>
+        </w:rPr>
+        <w:t>css</w:t>
+      </w:r>
+      <w:proofErr w:type="spellEnd"/>
+      <w:r>
+        <w:rPr>
+          <w:lang w:val="it-IT"/>
+        </w:rPr>
+        <w:t>/style.css – stili per UI HTML sovrapposta</w:t>
       </w:r>
     </w:p>
     <w:p>
@@ -137,11 +196,33 @@
           <w:lang w:val="it-IT"/>
         </w:rPr>
       </w:pPr>
-      <w:r>
-        <w:rPr>
-          <w:lang w:val="it-IT"/>
-        </w:rPr>
-        <w:t>js/main.js – inizializzazione di Phaser e configurazione globale</w:t>
+      <w:proofErr w:type="spellStart"/>
+      <w:r>
+        <w:rPr>
+          <w:lang w:val="it-IT"/>
+        </w:rPr>
+        <w:t>js</w:t>
+      </w:r>
+      <w:proofErr w:type="spellEnd"/>
+      <w:r>
+        <w:rPr>
+          <w:lang w:val="it-IT"/>
+        </w:rPr>
+        <w:t xml:space="preserve">/main.js – inizializzazione di </w:t>
+      </w:r>
+      <w:proofErr w:type="spellStart"/>
+      <w:r>
+        <w:rPr>
+          <w:lang w:val="it-IT"/>
+        </w:rPr>
+        <w:t>Phaser</w:t>
+      </w:r>
+      <w:proofErr w:type="spellEnd"/>
+      <w:r>
+        <w:rPr>
+          <w:lang w:val="it-IT"/>
+        </w:rPr>
+        <w:t xml:space="preserve"> e configurazione globale</w:t>
       </w:r>
     </w:p>
     <w:p>
@@ -154,11 +235,33 @@
           <w:lang w:val="it-IT"/>
         </w:rPr>
       </w:pPr>
-      <w:r>
-        <w:rPr>
-          <w:lang w:val="it-IT"/>
-        </w:rPr>
-        <w:t>js/world.js – griglia spaziale, layer di densità, query spaziali</w:t>
+      <w:proofErr w:type="spellStart"/>
+      <w:r>
+        <w:rPr>
+          <w:lang w:val="it-IT"/>
+        </w:rPr>
+        <w:t>js</w:t>
+      </w:r>
+      <w:proofErr w:type="spellEnd"/>
+      <w:r>
+        <w:rPr>
+          <w:lang w:val="it-IT"/>
+        </w:rPr>
+        <w:t xml:space="preserve">/world.js – griglia spaziale, </w:t>
+      </w:r>
+      <w:proofErr w:type="spellStart"/>
+      <w:r>
+        <w:rPr>
+          <w:lang w:val="it-IT"/>
+        </w:rPr>
+        <w:t>layer</w:t>
+      </w:r>
+      <w:proofErr w:type="spellEnd"/>
+      <w:r>
+        <w:rPr>
+          <w:lang w:val="it-IT"/>
+        </w:rPr>
+        <w:t xml:space="preserve"> di densità, query spaziali</w:t>
       </w:r>
     </w:p>
     <w:p>
@@ -171,11 +274,19 @@
           <w:lang w:val="it-IT"/>
         </w:rPr>
       </w:pPr>
-      <w:r>
-        <w:rPr>
-          <w:lang w:val="it-IT"/>
-        </w:rPr>
-        <w:t>js/units.js – classi per pop, unità, branchi</w:t>
+      <w:proofErr w:type="spellStart"/>
+      <w:r>
+        <w:rPr>
+          <w:lang w:val="it-IT"/>
+        </w:rPr>
+        <w:t>js</w:t>
+      </w:r>
+      <w:proofErr w:type="spellEnd"/>
+      <w:r>
+        <w:rPr>
+          <w:lang w:val="it-IT"/>
+        </w:rPr>
+        <w:t>/units.js – classi per pop, unità, branchi</w:t>
       </w:r>
     </w:p>
     <w:p>
@@ -188,11 +299,19 @@
           <w:lang w:val="it-IT"/>
         </w:rPr>
       </w:pPr>
-      <w:r>
-        <w:rPr>
-          <w:lang w:val="it-IT"/>
-        </w:rPr>
-        <w:t>js/resources.js – logica di raccolta, consumo, deterioramento (futuro)</w:t>
+      <w:proofErr w:type="spellStart"/>
+      <w:r>
+        <w:rPr>
+          <w:lang w:val="it-IT"/>
+        </w:rPr>
+        <w:t>js</w:t>
+      </w:r>
+      <w:proofErr w:type="spellEnd"/>
+      <w:r>
+        <w:rPr>
+          <w:lang w:val="it-IT"/>
+        </w:rPr>
+        <w:t>/resources.js – logica di raccolta, consumo, deterioramento (futuro)</w:t>
       </w:r>
     </w:p>
     <w:p>
@@ -205,11 +324,33 @@
           <w:lang w:val="it-IT"/>
         </w:rPr>
       </w:pPr>
-      <w:r>
-        <w:rPr>
-          <w:lang w:val="it-IT"/>
-        </w:rPr>
-        <w:t>js/ui.js – interfaccia utente, pannelli, tooltip (futuro)</w:t>
+      <w:proofErr w:type="spellStart"/>
+      <w:r>
+        <w:rPr>
+          <w:lang w:val="it-IT"/>
+        </w:rPr>
+        <w:t>js</w:t>
+      </w:r>
+      <w:proofErr w:type="spellEnd"/>
+      <w:r>
+        <w:rPr>
+          <w:lang w:val="it-IT"/>
+        </w:rPr>
+        <w:t xml:space="preserve">/ui.js – interfaccia utente, pannelli, </w:t>
+      </w:r>
+      <w:proofErr w:type="spellStart"/>
+      <w:r>
+        <w:rPr>
+          <w:lang w:val="it-IT"/>
+        </w:rPr>
+        <w:t>tooltip</w:t>
+      </w:r>
+      <w:proofErr w:type="spellEnd"/>
+      <w:r>
+        <w:rPr>
+          <w:lang w:val="it-IT"/>
+        </w:rPr>
+        <w:t xml:space="preserve"> (futuro)</w:t>
       </w:r>
     </w:p>
     <w:p>
@@ -222,11 +363,19 @@
           <w:lang w:val="it-IT"/>
         </w:rPr>
       </w:pPr>
-      <w:r>
-        <w:rPr>
-          <w:lang w:val="it-IT"/>
-        </w:rPr>
-        <w:t>js/time.js – gestione pausa/play/velocità (futuro)</w:t>
+      <w:proofErr w:type="spellStart"/>
+      <w:r>
+        <w:rPr>
+          <w:lang w:val="it-IT"/>
+        </w:rPr>
+        <w:t>js</w:t>
+      </w:r>
+      <w:proofErr w:type="spellEnd"/>
+      <w:r>
+        <w:rPr>
+          <w:lang w:val="it-IT"/>
+        </w:rPr>
+        <w:t>/time.js – gestione pausa/play/velocità (futuro)</w:t>
       </w:r>
     </w:p>
     <w:p>
@@ -288,12 +437,14 @@
           <w:lang w:val="it-IT"/>
         </w:rPr>
       </w:pPr>
+      <w:proofErr w:type="spellStart"/>
       <w:r>
         <w:rPr>
           <w:lang w:val="it-IT"/>
         </w:rPr>
         <w:t>javascript</w:t>
       </w:r>
+      <w:proofErr w:type="spellEnd"/>
     </w:p>
     <w:p>
       <w:pPr>
@@ -318,7 +469,21 @@
         <w:rPr>
           <w:lang w:val="it-IT"/>
         </w:rPr>
-        <w:t xml:space="preserve">  cx, cy,                   </w:t>
+        <w:t xml:space="preserve">  cx, </w:t>
+      </w:r>
+      <w:proofErr w:type="spellStart"/>
+      <w:r>
+        <w:rPr>
+          <w:lang w:val="it-IT"/>
+        </w:rPr>
+        <w:t>cy</w:t>
+      </w:r>
+      <w:proofErr w:type="spellEnd"/>
+      <w:r>
+        <w:rPr>
+          <w:lang w:val="it-IT"/>
+        </w:rPr>
+        <w:t xml:space="preserve">,                   </w:t>
       </w:r>
       <w:r>
         <w:rPr>
@@ -339,7 +504,21 @@
         <w:rPr>
           <w:lang w:val="it-IT"/>
         </w:rPr>
-        <w:t xml:space="preserve">  entities: [],             </w:t>
+        <w:t xml:space="preserve">  </w:t>
+      </w:r>
+      <w:proofErr w:type="spellStart"/>
+      <w:r>
+        <w:rPr>
+          <w:lang w:val="it-IT"/>
+        </w:rPr>
+        <w:t>entities</w:t>
+      </w:r>
+      <w:proofErr w:type="spellEnd"/>
+      <w:r>
+        <w:rPr>
+          <w:lang w:val="it-IT"/>
+        </w:rPr>
+        <w:t xml:space="preserve">: [],             </w:t>
       </w:r>
       <w:r>
         <w:rPr>
@@ -361,7 +540,21 @@
           <w:lang w:val="it-IT"/>
         </w:rPr>
         <w:lastRenderedPageBreak/>
-        <w:t xml:space="preserve">  forestDensity: 0.0,       </w:t>
+        <w:t xml:space="preserve">  </w:t>
+      </w:r>
+      <w:proofErr w:type="spellStart"/>
+      <w:r>
+        <w:rPr>
+          <w:lang w:val="it-IT"/>
+        </w:rPr>
+        <w:t>forestDensity</w:t>
+      </w:r>
+      <w:proofErr w:type="spellEnd"/>
+      <w:r>
+        <w:rPr>
+          <w:lang w:val="it-IT"/>
+        </w:rPr>
+        <w:t xml:space="preserve">: 0.0,       </w:t>
       </w:r>
       <w:r>
         <w:rPr>
@@ -382,7 +575,21 @@
         <w:rPr>
           <w:lang w:val="it-IT"/>
         </w:rPr>
-        <w:t xml:space="preserve">  forageDensity: 0.0,       </w:t>
+        <w:t xml:space="preserve">  </w:t>
+      </w:r>
+      <w:proofErr w:type="spellStart"/>
+      <w:r>
+        <w:rPr>
+          <w:lang w:val="it-IT"/>
+        </w:rPr>
+        <w:t>forageDensity</w:t>
+      </w:r>
+      <w:proofErr w:type="spellEnd"/>
+      <w:r>
+        <w:rPr>
+          <w:lang w:val="it-IT"/>
+        </w:rPr>
+        <w:t xml:space="preserve">: 0.0,       </w:t>
       </w:r>
       <w:r>
         <w:rPr>
@@ -403,7 +610,21 @@
         <w:rPr>
           <w:lang w:val="it-IT"/>
         </w:rPr>
-        <w:t xml:space="preserve">  smallGameDensity: 0.0,    </w:t>
+        <w:t xml:space="preserve">  </w:t>
+      </w:r>
+      <w:proofErr w:type="spellStart"/>
+      <w:r>
+        <w:rPr>
+          <w:lang w:val="it-IT"/>
+        </w:rPr>
+        <w:t>smallGameDensity</w:t>
+      </w:r>
+      <w:proofErr w:type="spellEnd"/>
+      <w:r>
+        <w:rPr>
+          <w:lang w:val="it-IT"/>
+        </w:rPr>
+        <w:t xml:space="preserve">: 0.0,    </w:t>
       </w:r>
       <w:r>
         <w:rPr>
@@ -424,7 +645,21 @@
         <w:rPr>
           <w:lang w:val="it-IT"/>
         </w:rPr>
-        <w:t xml:space="preserve">  fishDensity: 0.0,         </w:t>
+        <w:t xml:space="preserve">  </w:t>
+      </w:r>
+      <w:proofErr w:type="spellStart"/>
+      <w:r>
+        <w:rPr>
+          <w:lang w:val="it-IT"/>
+        </w:rPr>
+        <w:t>fishDensity</w:t>
+      </w:r>
+      <w:proofErr w:type="spellEnd"/>
+      <w:r>
+        <w:rPr>
+          <w:lang w:val="it-IT"/>
+        </w:rPr>
+        <w:t xml:space="preserve">: 0.0,         </w:t>
       </w:r>
       <w:r>
         <w:rPr>
@@ -445,7 +680,21 @@
         <w:rPr>
           <w:lang w:val="it-IT"/>
         </w:rPr>
-        <w:t xml:space="preserve">  fertility: 0.5            </w:t>
+        <w:t xml:space="preserve">  </w:t>
+      </w:r>
+      <w:proofErr w:type="spellStart"/>
+      <w:r>
+        <w:rPr>
+          <w:lang w:val="it-IT"/>
+        </w:rPr>
+        <w:t>fertility</w:t>
+      </w:r>
+      <w:proofErr w:type="spellEnd"/>
+      <w:r>
+        <w:rPr>
+          <w:lang w:val="it-IT"/>
+        </w:rPr>
+        <w:t xml:space="preserve">: 0.5            </w:t>
       </w:r>
       <w:r>
         <w:rPr>
@@ -479,7 +728,35 @@
         <w:rPr>
           <w:lang w:val="it-IT"/>
         </w:rPr>
-        <w:t>La griglia è memorizzata in un array 2D o in una Map con chiave "cx,cy".</w:t>
+        <w:t>La griglia è memorizzata in un array 2D o in una </w:t>
+      </w:r>
+      <w:proofErr w:type="spellStart"/>
+      <w:r>
+        <w:rPr>
+          <w:lang w:val="it-IT"/>
+        </w:rPr>
+        <w:t>Map</w:t>
+      </w:r>
+      <w:proofErr w:type="spellEnd"/>
+      <w:r>
+        <w:rPr>
+          <w:lang w:val="it-IT"/>
+        </w:rPr>
+        <w:t> con chiave "</w:t>
+      </w:r>
+      <w:proofErr w:type="spellStart"/>
+      <w:r>
+        <w:rPr>
+          <w:lang w:val="it-IT"/>
+        </w:rPr>
+        <w:t>cx,cy</w:t>
+      </w:r>
+      <w:proofErr w:type="spellEnd"/>
+      <w:r>
+        <w:rPr>
+          <w:lang w:val="it-IT"/>
+        </w:rPr>
+        <w:t>".</w:t>
       </w:r>
     </w:p>
     <w:p>
@@ -500,11 +777,33 @@
           <w:lang w:val="it-IT"/>
         </w:rPr>
       </w:pPr>
-      <w:r>
-        <w:rPr>
-          <w:lang w:val="it-IT"/>
-        </w:rPr>
-        <w:t>worldToCell(x, y) → {cx, cy}: converte coordinate mondo in coordinate cella.</w:t>
+      <w:proofErr w:type="spellStart"/>
+      <w:r>
+        <w:rPr>
+          <w:lang w:val="it-IT"/>
+        </w:rPr>
+        <w:t>worldToCell</w:t>
+      </w:r>
+      <w:proofErr w:type="spellEnd"/>
+      <w:r>
+        <w:rPr>
+          <w:lang w:val="it-IT"/>
+        </w:rPr>
+        <w:t xml:space="preserve">(x, y) → {cx, </w:t>
+      </w:r>
+      <w:proofErr w:type="spellStart"/>
+      <w:r>
+        <w:rPr>
+          <w:lang w:val="it-IT"/>
+        </w:rPr>
+        <w:t>cy</w:t>
+      </w:r>
+      <w:proofErr w:type="spellEnd"/>
+      <w:r>
+        <w:rPr>
+          <w:lang w:val="it-IT"/>
+        </w:rPr>
+        <w:t>}: converte coordinate mondo in coordinate cella.</w:t>
       </w:r>
     </w:p>
     <w:p>
@@ -517,11 +816,33 @@
           <w:lang w:val="it-IT"/>
         </w:rPr>
       </w:pPr>
-      <w:r>
-        <w:rPr>
-          <w:lang w:val="it-IT"/>
-        </w:rPr>
-        <w:t>getCell(cx, cy) → oggetto cella (crea la cella se non esiste).</w:t>
+      <w:proofErr w:type="spellStart"/>
+      <w:r>
+        <w:rPr>
+          <w:lang w:val="it-IT"/>
+        </w:rPr>
+        <w:t>getCell</w:t>
+      </w:r>
+      <w:proofErr w:type="spellEnd"/>
+      <w:r>
+        <w:rPr>
+          <w:lang w:val="it-IT"/>
+        </w:rPr>
+        <w:t xml:space="preserve">(cx, </w:t>
+      </w:r>
+      <w:proofErr w:type="spellStart"/>
+      <w:r>
+        <w:rPr>
+          <w:lang w:val="it-IT"/>
+        </w:rPr>
+        <w:t>cy</w:t>
+      </w:r>
+      <w:proofErr w:type="spellEnd"/>
+      <w:r>
+        <w:rPr>
+          <w:lang w:val="it-IT"/>
+        </w:rPr>
+        <w:t>) → oggetto cella (crea la cella se non esiste).</w:t>
       </w:r>
     </w:p>
     <w:p>
@@ -534,11 +855,33 @@
           <w:lang w:val="it-IT"/>
         </w:rPr>
       </w:pPr>
-      <w:r>
-        <w:rPr>
-          <w:lang w:val="it-IT"/>
-        </w:rPr>
-        <w:t>getEntitiesInRadius(x, y, radius) → array di entità: interroga le celle nel raggio e filtra per distanza esatta.</w:t>
+      <w:proofErr w:type="spellStart"/>
+      <w:r>
+        <w:rPr>
+          <w:lang w:val="it-IT"/>
+        </w:rPr>
+        <w:t>getEntitiesInRadius</w:t>
+      </w:r>
+      <w:proofErr w:type="spellEnd"/>
+      <w:r>
+        <w:rPr>
+          <w:lang w:val="it-IT"/>
+        </w:rPr>
+        <w:t xml:space="preserve">(x, y, </w:t>
+      </w:r>
+      <w:proofErr w:type="spellStart"/>
+      <w:r>
+        <w:rPr>
+          <w:lang w:val="it-IT"/>
+        </w:rPr>
+        <w:t>radius</w:t>
+      </w:r>
+      <w:proofErr w:type="spellEnd"/>
+      <w:r>
+        <w:rPr>
+          <w:lang w:val="it-IT"/>
+        </w:rPr>
+        <w:t>) → array di entità: interroga le celle nel raggio e filtra per distanza esatta.</w:t>
       </w:r>
     </w:p>
     <w:p>
@@ -551,11 +894,75 @@
           <w:lang w:val="it-IT"/>
         </w:rPr>
       </w:pPr>
-      <w:r>
-        <w:rPr>
-          <w:lang w:val="it-IT"/>
-        </w:rPr>
-        <w:t>modifyDensity(x, y, layer, amount, impactRadius): modifica la densità del layer indicato nelle celle intorno alla posizione, con decadimento radiale.</w:t>
+      <w:proofErr w:type="spellStart"/>
+      <w:r>
+        <w:rPr>
+          <w:lang w:val="it-IT"/>
+        </w:rPr>
+        <w:t>modifyDensity</w:t>
+      </w:r>
+      <w:proofErr w:type="spellEnd"/>
+      <w:r>
+        <w:rPr>
+          <w:lang w:val="it-IT"/>
+        </w:rPr>
+        <w:t xml:space="preserve">(x, y, </w:t>
+      </w:r>
+      <w:proofErr w:type="spellStart"/>
+      <w:r>
+        <w:rPr>
+          <w:lang w:val="it-IT"/>
+        </w:rPr>
+        <w:t>layer</w:t>
+      </w:r>
+      <w:proofErr w:type="spellEnd"/>
+      <w:r>
+        <w:rPr>
+          <w:lang w:val="it-IT"/>
+        </w:rPr>
+        <w:t xml:space="preserve">, </w:t>
+      </w:r>
+      <w:proofErr w:type="spellStart"/>
+      <w:r>
+        <w:rPr>
+          <w:lang w:val="it-IT"/>
+        </w:rPr>
+        <w:t>amount</w:t>
+      </w:r>
+      <w:proofErr w:type="spellEnd"/>
+      <w:r>
+        <w:rPr>
+          <w:lang w:val="it-IT"/>
+        </w:rPr>
+        <w:t xml:space="preserve">, </w:t>
+      </w:r>
+      <w:proofErr w:type="spellStart"/>
+      <w:r>
+        <w:rPr>
+          <w:lang w:val="it-IT"/>
+        </w:rPr>
+        <w:t>impactRadius</w:t>
+      </w:r>
+      <w:proofErr w:type="spellEnd"/>
+      <w:r>
+        <w:rPr>
+          <w:lang w:val="it-IT"/>
+        </w:rPr>
+        <w:t xml:space="preserve">): modifica la densità del </w:t>
+      </w:r>
+      <w:proofErr w:type="spellStart"/>
+      <w:r>
+        <w:rPr>
+          <w:lang w:val="it-IT"/>
+        </w:rPr>
+        <w:t>layer</w:t>
+      </w:r>
+      <w:proofErr w:type="spellEnd"/>
+      <w:r>
+        <w:rPr>
+          <w:lang w:val="it-IT"/>
+        </w:rPr>
+        <w:t xml:space="preserve"> indicato nelle celle intorno alla posizione, con decadimento radiale.</w:t>
       </w:r>
     </w:p>
     <w:p>
@@ -623,9 +1030,11 @@
             <w:hideMark/>
           </w:tcPr>
           <w:p>
+            <w:proofErr w:type="spellStart"/>
             <w:r>
               <w:t>Proprietà</w:t>
             </w:r>
+            <w:proofErr w:type="spellEnd"/>
           </w:p>
         </w:tc>
         <w:tc>
@@ -644,9 +1053,11 @@
             <w:hideMark/>
           </w:tcPr>
           <w:p>
+            <w:proofErr w:type="spellStart"/>
             <w:r>
               <w:t>Descrizione</w:t>
             </w:r>
+            <w:proofErr w:type="spellEnd"/>
           </w:p>
         </w:tc>
       </w:tr>
@@ -682,9 +1093,11 @@
             <w:hideMark/>
           </w:tcPr>
           <w:p>
+            <w:proofErr w:type="spellStart"/>
             <w:r>
               <w:t>forestDensity</w:t>
             </w:r>
+            <w:proofErr w:type="spellEnd"/>
           </w:p>
         </w:tc>
         <w:tc>
@@ -728,9 +1141,19 @@
             <w:hideMark/>
           </w:tcPr>
           <w:p>
+            <w:proofErr w:type="spellStart"/>
             <w:r>
-              <w:t>Vegetazione raccoglibile</w:t>
+              <w:t>Vegetazione</w:t>
             </w:r>
+            <w:proofErr w:type="spellEnd"/>
+            <w:r>
+              <w:t xml:space="preserve"> </w:t>
+            </w:r>
+            <w:proofErr w:type="spellStart"/>
+            <w:r>
+              <w:t>raccoglibile</w:t>
+            </w:r>
+            <w:proofErr w:type="spellEnd"/>
           </w:p>
         </w:tc>
         <w:tc>
@@ -746,9 +1169,11 @@
             <w:hideMark/>
           </w:tcPr>
           <w:p>
+            <w:proofErr w:type="spellStart"/>
             <w:r>
               <w:t>forageDensity</w:t>
             </w:r>
+            <w:proofErr w:type="spellEnd"/>
           </w:p>
         </w:tc>
         <w:tc>
@@ -793,8 +1218,13 @@
           </w:tcPr>
           <w:p>
             <w:r>
-              <w:t>Piccola fauna terrestre</w:t>
+              <w:t xml:space="preserve">Piccola fauna </w:t>
             </w:r>
+            <w:proofErr w:type="spellStart"/>
+            <w:r>
+              <w:t>terrestre</w:t>
+            </w:r>
+            <w:proofErr w:type="spellEnd"/>
           </w:p>
         </w:tc>
         <w:tc>
@@ -810,9 +1240,11 @@
             <w:hideMark/>
           </w:tcPr>
           <w:p>
+            <w:proofErr w:type="spellStart"/>
             <w:r>
               <w:t>smallGameDensity</w:t>
             </w:r>
+            <w:proofErr w:type="spellEnd"/>
           </w:p>
         </w:tc>
         <w:tc>
@@ -874,9 +1306,11 @@
             <w:hideMark/>
           </w:tcPr>
           <w:p>
+            <w:proofErr w:type="spellStart"/>
             <w:r>
               <w:t>fishDensity</w:t>
             </w:r>
+            <w:proofErr w:type="spellEnd"/>
           </w:p>
         </w:tc>
         <w:tc>
@@ -899,7 +1333,23 @@
               <w:t xml:space="preserve">Disponibile solo in celle d'acqua. </w:t>
             </w:r>
             <w:r>
-              <w:t>Ridotto dalla pesca.</w:t>
+              <w:t xml:space="preserve">Ridotto </w:t>
+            </w:r>
+            <w:proofErr w:type="spellStart"/>
+            <w:r>
+              <w:t>dalla</w:t>
+            </w:r>
+            <w:proofErr w:type="spellEnd"/>
+            <w:r>
+              <w:t xml:space="preserve"> </w:t>
+            </w:r>
+            <w:proofErr w:type="spellStart"/>
+            <w:r>
+              <w:t>pesca</w:t>
+            </w:r>
+            <w:proofErr w:type="spellEnd"/>
+            <w:r>
+              <w:t>.</w:t>
             </w:r>
           </w:p>
         </w:tc>
@@ -918,9 +1368,11 @@
             <w:hideMark/>
           </w:tcPr>
           <w:p>
+            <w:proofErr w:type="spellStart"/>
             <w:r>
               <w:t>Fertilità</w:t>
             </w:r>
+            <w:proofErr w:type="spellEnd"/>
           </w:p>
         </w:tc>
         <w:tc>
@@ -955,7 +1407,31 @@
           </w:tcPr>
           <w:p>
             <w:r>
-              <w:t>Per uso futuro (agricoltura).</w:t>
+              <w:t xml:space="preserve">Per </w:t>
+            </w:r>
+            <w:proofErr w:type="spellStart"/>
+            <w:r>
+              <w:t>uso</w:t>
+            </w:r>
+            <w:proofErr w:type="spellEnd"/>
+            <w:r>
+              <w:t xml:space="preserve"> </w:t>
+            </w:r>
+            <w:proofErr w:type="spellStart"/>
+            <w:r>
+              <w:t>futuro</w:t>
+            </w:r>
+            <w:proofErr w:type="spellEnd"/>
+            <w:r>
+              <w:t xml:space="preserve"> (</w:t>
+            </w:r>
+            <w:proofErr w:type="spellStart"/>
+            <w:r>
+              <w:t>agricoltura</w:t>
+            </w:r>
+            <w:proofErr w:type="spellEnd"/>
+            <w:r>
+              <w:t>).</w:t>
             </w:r>
           </w:p>
         </w:tc>
@@ -998,9 +1474,11 @@
       </w:r>
     </w:p>
     <w:p>
+      <w:proofErr w:type="spellStart"/>
       <w:r>
         <w:t>javascript</w:t>
       </w:r>
+      <w:proofErr w:type="spellEnd"/>
     </w:p>
     <w:p>
       <w:r>
@@ -1051,7 +1529,35 @@
         <w:rPr>
           <w:lang w:val="it-IT"/>
         </w:rPr>
-        <w:t xml:space="preserve">  targetX, targetY,         </w:t>
+        <w:t xml:space="preserve">  </w:t>
+      </w:r>
+      <w:proofErr w:type="spellStart"/>
+      <w:r>
+        <w:rPr>
+          <w:lang w:val="it-IT"/>
+        </w:rPr>
+        <w:t>targetX</w:t>
+      </w:r>
+      <w:proofErr w:type="spellEnd"/>
+      <w:r>
+        <w:rPr>
+          <w:lang w:val="it-IT"/>
+        </w:rPr>
+        <w:t xml:space="preserve">, </w:t>
+      </w:r>
+      <w:proofErr w:type="spellStart"/>
+      <w:r>
+        <w:rPr>
+          <w:lang w:val="it-IT"/>
+        </w:rPr>
+        <w:t>targetY</w:t>
+      </w:r>
+      <w:proofErr w:type="spellEnd"/>
+      <w:r>
+        <w:rPr>
+          <w:lang w:val="it-IT"/>
+        </w:rPr>
+        <w:t xml:space="preserve">,         </w:t>
       </w:r>
       <w:r>
         <w:rPr>
@@ -1093,7 +1599,35 @@
         <w:rPr>
           <w:lang w:val="it-IT"/>
         </w:rPr>
-        <w:t xml:space="preserve">  state: 'idle' | 'moving' | 'working'</w:t>
+        <w:t xml:space="preserve">  state: '</w:t>
+      </w:r>
+      <w:proofErr w:type="spellStart"/>
+      <w:r>
+        <w:rPr>
+          <w:lang w:val="it-IT"/>
+        </w:rPr>
+        <w:t>idle</w:t>
+      </w:r>
+      <w:proofErr w:type="spellEnd"/>
+      <w:r>
+        <w:rPr>
+          <w:lang w:val="it-IT"/>
+        </w:rPr>
+        <w:t>' | '</w:t>
+      </w:r>
+      <w:proofErr w:type="spellStart"/>
+      <w:r>
+        <w:rPr>
+          <w:lang w:val="it-IT"/>
+        </w:rPr>
+        <w:t>moving</w:t>
+      </w:r>
+      <w:proofErr w:type="spellEnd"/>
+      <w:r>
+        <w:rPr>
+          <w:lang w:val="it-IT"/>
+        </w:rPr>
+        <w:t>' | 'working'</w:t>
       </w:r>
     </w:p>
     <w:p>
@@ -1118,8 +1652,29 @@
       </w:r>
     </w:p>
     <w:p>
-      <w:r>
-        <w:t>Estende l'unità generica con:</w:t>
+      <w:proofErr w:type="spellStart"/>
+      <w:r>
+        <w:t>Estende</w:t>
+      </w:r>
+      <w:proofErr w:type="spellEnd"/>
+      <w:r>
+        <w:t xml:space="preserve"> </w:t>
+      </w:r>
+      <w:proofErr w:type="spellStart"/>
+      <w:r>
+        <w:t>l'unità</w:t>
+      </w:r>
+      <w:proofErr w:type="spellEnd"/>
+      <w:r>
+        <w:t xml:space="preserve"> </w:t>
+      </w:r>
+      <w:proofErr w:type="spellStart"/>
+      <w:r>
+        <w:t>generica</w:t>
+      </w:r>
+      <w:proofErr w:type="spellEnd"/>
+      <w:r>
+        <w:t xml:space="preserve"> con:</w:t>
       </w:r>
     </w:p>
     <w:p>
@@ -1132,11 +1687,19 @@
           <w:lang w:val="it-IT"/>
         </w:rPr>
       </w:pPr>
-      <w:r>
-        <w:rPr>
-          <w:lang w:val="it-IT"/>
-        </w:rPr>
-        <w:t>population: numero di individui nel gruppo</w:t>
+      <w:proofErr w:type="spellStart"/>
+      <w:r>
+        <w:rPr>
+          <w:lang w:val="it-IT"/>
+        </w:rPr>
+        <w:t>population</w:t>
+      </w:r>
+      <w:proofErr w:type="spellEnd"/>
+      <w:r>
+        <w:rPr>
+          <w:lang w:val="it-IT"/>
+        </w:rPr>
+        <w:t>: numero di individui nel gruppo</w:t>
       </w:r>
     </w:p>
     <w:p>
@@ -1153,7 +1716,91 @@
         <w:rPr>
           <w:lang w:val="it-IT"/>
         </w:rPr>
-        <w:t>task: { type: 'gatherWood' | 'hunt' | 'forage' | 'fish' | 'trapSmallGame', location: {x, y} }</w:t>
+        <w:t xml:space="preserve">task: { </w:t>
+      </w:r>
+      <w:proofErr w:type="spellStart"/>
+      <w:r>
+        <w:rPr>
+          <w:lang w:val="it-IT"/>
+        </w:rPr>
+        <w:t>type</w:t>
+      </w:r>
+      <w:proofErr w:type="spellEnd"/>
+      <w:r>
+        <w:rPr>
+          <w:lang w:val="it-IT"/>
+        </w:rPr>
+        <w:t>: '</w:t>
+      </w:r>
+      <w:proofErr w:type="spellStart"/>
+      <w:r>
+        <w:rPr>
+          <w:lang w:val="it-IT"/>
+        </w:rPr>
+        <w:t>gatherWood</w:t>
+      </w:r>
+      <w:proofErr w:type="spellEnd"/>
+      <w:r>
+        <w:rPr>
+          <w:lang w:val="it-IT"/>
+        </w:rPr>
+        <w:t>' | '</w:t>
+      </w:r>
+      <w:proofErr w:type="spellStart"/>
+      <w:r>
+        <w:rPr>
+          <w:lang w:val="it-IT"/>
+        </w:rPr>
+        <w:t>hunt</w:t>
+      </w:r>
+      <w:proofErr w:type="spellEnd"/>
+      <w:r>
+        <w:rPr>
+          <w:lang w:val="it-IT"/>
+        </w:rPr>
+        <w:t>' | '</w:t>
+      </w:r>
+      <w:proofErr w:type="spellStart"/>
+      <w:r>
+        <w:rPr>
+          <w:lang w:val="it-IT"/>
+        </w:rPr>
+        <w:t>forage</w:t>
+      </w:r>
+      <w:proofErr w:type="spellEnd"/>
+      <w:r>
+        <w:rPr>
+          <w:lang w:val="it-IT"/>
+        </w:rPr>
+        <w:t>' | '</w:t>
+      </w:r>
+      <w:proofErr w:type="spellStart"/>
+      <w:r>
+        <w:rPr>
+          <w:lang w:val="it-IT"/>
+        </w:rPr>
+        <w:t>fish</w:t>
+      </w:r>
+      <w:proofErr w:type="spellEnd"/>
+      <w:r>
+        <w:rPr>
+          <w:lang w:val="it-IT"/>
+        </w:rPr>
+        <w:t>' | '</w:t>
+      </w:r>
+      <w:proofErr w:type="spellStart"/>
+      <w:r>
+        <w:rPr>
+          <w:lang w:val="it-IT"/>
+        </w:rPr>
+        <w:t>trapSmallGame</w:t>
+      </w:r>
+      <w:proofErr w:type="spellEnd"/>
+      <w:r>
+        <w:rPr>
+          <w:lang w:val="it-IT"/>
+        </w:rPr>
+        <w:t>', location: {x, y} }</w:t>
       </w:r>
     </w:p>
     <w:p>
@@ -1166,11 +1813,33 @@
           <w:lang w:val="it-IT"/>
         </w:rPr>
       </w:pPr>
-      <w:r>
-        <w:rPr>
-          <w:lang w:val="it-IT"/>
-        </w:rPr>
-        <w:t>inventory: { wood: 0, food: 0 } – risorse trasportate (in futuro potranno essere differenziate)</w:t>
+      <w:proofErr w:type="spellStart"/>
+      <w:r>
+        <w:rPr>
+          <w:lang w:val="it-IT"/>
+        </w:rPr>
+        <w:t>inventory</w:t>
+      </w:r>
+      <w:proofErr w:type="spellEnd"/>
+      <w:r>
+        <w:rPr>
+          <w:lang w:val="it-IT"/>
+        </w:rPr>
+        <w:t xml:space="preserve">: { </w:t>
+      </w:r>
+      <w:proofErr w:type="spellStart"/>
+      <w:r>
+        <w:rPr>
+          <w:lang w:val="it-IT"/>
+        </w:rPr>
+        <w:t>wood</w:t>
+      </w:r>
+      <w:proofErr w:type="spellEnd"/>
+      <w:r>
+        <w:rPr>
+          <w:lang w:val="it-IT"/>
+        </w:rPr>
+        <w:t>: 0, food: 0 } – risorse trasportate (in futuro potranno essere differenziate)</w:t>
       </w:r>
     </w:p>
     <w:p>
@@ -1183,11 +1852,19 @@
           <w:lang w:val="it-IT"/>
         </w:rPr>
       </w:pPr>
-      <w:r>
-        <w:rPr>
-          <w:lang w:val="it-IT"/>
-        </w:rPr>
-        <w:t>rations: provviste di cibo portate per il viaggio</w:t>
+      <w:proofErr w:type="spellStart"/>
+      <w:r>
+        <w:rPr>
+          <w:lang w:val="it-IT"/>
+        </w:rPr>
+        <w:t>rations</w:t>
+      </w:r>
+      <w:proofErr w:type="spellEnd"/>
+      <w:r>
+        <w:rPr>
+          <w:lang w:val="it-IT"/>
+        </w:rPr>
+        <w:t>: provviste di cibo portate per il viaggio</w:t>
       </w:r>
     </w:p>
     <w:p>
@@ -1216,9 +1893,27 @@
           <w:numId w:val="4"/>
         </w:numPr>
       </w:pPr>
-      <w:r>
-        <w:t>herdSize: numero di capi</w:t>
-      </w:r>
+      <w:proofErr w:type="spellStart"/>
+      <w:r>
+        <w:t>herdSize</w:t>
+      </w:r>
+      <w:proofErr w:type="spellEnd"/>
+      <w:r>
+        <w:t xml:space="preserve">: </w:t>
+      </w:r>
+      <w:proofErr w:type="spellStart"/>
+      <w:r>
+        <w:t>numero</w:t>
+      </w:r>
+      <w:proofErr w:type="spellEnd"/>
+      <w:r>
+        <w:t xml:space="preserve"> di </w:t>
+      </w:r>
+      <w:proofErr w:type="spellStart"/>
+      <w:r>
+        <w:t>capi</w:t>
+      </w:r>
+      <w:proofErr w:type="spellEnd"/>
     </w:p>
     <w:p>
       <w:pPr>
@@ -1228,8 +1923,29 @@
         </w:numPr>
       </w:pPr>
       <w:r>
-        <w:t>habitat: tipo di terreno preferito</w:t>
-      </w:r>
+        <w:t xml:space="preserve">habitat: </w:t>
+      </w:r>
+      <w:proofErr w:type="spellStart"/>
+      <w:r>
+        <w:t>tipo</w:t>
+      </w:r>
+      <w:proofErr w:type="spellEnd"/>
+      <w:r>
+        <w:t xml:space="preserve"> di </w:t>
+      </w:r>
+      <w:proofErr w:type="spellStart"/>
+      <w:r>
+        <w:t>terreno</w:t>
+      </w:r>
+      <w:proofErr w:type="spellEnd"/>
+      <w:r>
+        <w:t xml:space="preserve"> </w:t>
+      </w:r>
+      <w:proofErr w:type="spellStart"/>
+      <w:r>
+        <w:t>preferito</w:t>
+      </w:r>
+      <w:proofErr w:type="spellEnd"/>
     </w:p>
     <w:p>
       <w:pPr>
@@ -1269,11 +1985,19 @@
           <w:lang w:val="it-IT"/>
         </w:rPr>
       </w:pPr>
-      <w:r>
-        <w:rPr>
-          <w:lang w:val="it-IT"/>
-        </w:rPr>
-        <w:t>Phaser chiama update(time, delta) a ogni frame. La logica di gioco può essere disaccoppiata dal rendering per garantire coerenza temporale.</w:t>
+      <w:proofErr w:type="spellStart"/>
+      <w:r>
+        <w:rPr>
+          <w:lang w:val="it-IT"/>
+        </w:rPr>
+        <w:t>Phaser</w:t>
+      </w:r>
+      <w:proofErr w:type="spellEnd"/>
+      <w:r>
+        <w:rPr>
+          <w:lang w:val="it-IT"/>
+        </w:rPr>
+        <w:t xml:space="preserve"> chiama update(time, delta) a ogni frame. La logica di gioco può essere disaccoppiata dal rendering per garantire coerenza temporale.</w:t>
       </w:r>
     </w:p>
     <w:p>
@@ -1283,6 +2007,7 @@
           <w:numId w:val="5"/>
         </w:numPr>
       </w:pPr>
+      <w:proofErr w:type="spellStart"/>
       <w:r>
         <w:rPr>
           <w:b/>
@@ -1291,14 +2016,51 @@
         </w:rPr>
         <w:t>TimeManager</w:t>
       </w:r>
-      <w:r>
-        <w:rPr>
-          <w:lang w:val="it-IT"/>
-        </w:rPr>
-        <w:t xml:space="preserve"> calcola il tempo di gioco effettivo (gameDelta = delta * speedMultiplier). </w:t>
-      </w:r>
-      <w:r>
-        <w:t>Se in pausa, gameDelta = 0.</w:t>
+      <w:proofErr w:type="spellEnd"/>
+      <w:r>
+        <w:rPr>
+          <w:lang w:val="it-IT"/>
+        </w:rPr>
+        <w:t> calcola il tempo di gioco effettivo (</w:t>
+      </w:r>
+      <w:proofErr w:type="spellStart"/>
+      <w:r>
+        <w:rPr>
+          <w:lang w:val="it-IT"/>
+        </w:rPr>
+        <w:t>gameDelta</w:t>
+      </w:r>
+      <w:proofErr w:type="spellEnd"/>
+      <w:r>
+        <w:rPr>
+          <w:lang w:val="it-IT"/>
+        </w:rPr>
+        <w:t xml:space="preserve"> = delta * </w:t>
+      </w:r>
+      <w:proofErr w:type="spellStart"/>
+      <w:r>
+        <w:rPr>
+          <w:lang w:val="it-IT"/>
+        </w:rPr>
+        <w:t>speedMultiplier</w:t>
+      </w:r>
+      <w:proofErr w:type="spellEnd"/>
+      <w:r>
+        <w:rPr>
+          <w:lang w:val="it-IT"/>
+        </w:rPr>
+        <w:t xml:space="preserve">). </w:t>
+      </w:r>
+      <w:r>
+        <w:t>Se in pausa, </w:t>
+      </w:r>
+      <w:proofErr w:type="spellStart"/>
+      <w:r>
+        <w:t>gameDelta</w:t>
+      </w:r>
+      <w:proofErr w:type="spellEnd"/>
+      <w:r>
+        <w:t xml:space="preserve"> = 0.</w:t>
       </w:r>
     </w:p>
     <w:p>
@@ -1323,7 +2085,35 @@
         <w:rPr>
           <w:lang w:val="it-IT"/>
         </w:rPr>
-        <w:t> tutte le unità con stato 'moving' vengono spostate verso il target in base a speed e gameDelta.</w:t>
+        <w:t> tutte le unità con stato '</w:t>
+      </w:r>
+      <w:proofErr w:type="spellStart"/>
+      <w:r>
+        <w:rPr>
+          <w:lang w:val="it-IT"/>
+        </w:rPr>
+        <w:t>moving</w:t>
+      </w:r>
+      <w:proofErr w:type="spellEnd"/>
+      <w:r>
+        <w:rPr>
+          <w:lang w:val="it-IT"/>
+        </w:rPr>
+        <w:t>' vengono spostate verso il target in base a speed e </w:t>
+      </w:r>
+      <w:proofErr w:type="spellStart"/>
+      <w:r>
+        <w:rPr>
+          <w:lang w:val="it-IT"/>
+        </w:rPr>
+        <w:t>gameDelta</w:t>
+      </w:r>
+      <w:proofErr w:type="spellEnd"/>
+      <w:r>
+        <w:rPr>
+          <w:lang w:val="it-IT"/>
+        </w:rPr>
+        <w:t>.</w:t>
       </w:r>
     </w:p>
     <w:p>
@@ -1397,7 +2187,21 @@
         <w:rPr>
           <w:lang w:val="it-IT"/>
         </w:rPr>
-        <w:t> a intervalli regolari di tempo di gioco (es. ogni dayLength secondi) tutti i pop consumano cibo dalle scorte dell'accampamento.</w:t>
+        <w:t> a intervalli regolari di tempo di gioco (es. ogni </w:t>
+      </w:r>
+      <w:proofErr w:type="spellStart"/>
+      <w:r>
+        <w:rPr>
+          <w:lang w:val="it-IT"/>
+        </w:rPr>
+        <w:t>dayLength</w:t>
+      </w:r>
+      <w:proofErr w:type="spellEnd"/>
+      <w:r>
+        <w:rPr>
+          <w:lang w:val="it-IT"/>
+        </w:rPr>
+        <w:t> secondi) tutti i pop consumano cibo dalle scorte dell'accampamento.</w:t>
       </w:r>
     </w:p>
     <w:p>
@@ -1419,10 +2223,48 @@
         <w:rPr>
           <w:lang w:val="it-IT"/>
         </w:rPr>
-        <w:t xml:space="preserve"> a intervalli regolari, le celle della griglia rigenerano una frazione di densità per ogni layer (es. </w:t>
-      </w:r>
-      <w:r>
-        <w:t>+0.01 per forestDensity al giorno se non tagliata).</w:t>
+        <w:t xml:space="preserve"> a intervalli regolari, le celle della griglia rigenerano una frazione di densità per ogni </w:t>
+      </w:r>
+      <w:proofErr w:type="spellStart"/>
+      <w:r>
+        <w:rPr>
+          <w:lang w:val="it-IT"/>
+        </w:rPr>
+        <w:t>layer</w:t>
+      </w:r>
+      <w:proofErr w:type="spellEnd"/>
+      <w:r>
+        <w:rPr>
+          <w:lang w:val="it-IT"/>
+        </w:rPr>
+        <w:t xml:space="preserve"> (es. </w:t>
+      </w:r>
+      <w:r>
+        <w:t>+0.01 per </w:t>
+      </w:r>
+      <w:proofErr w:type="spellStart"/>
+      <w:r>
+        <w:t>forestDensity</w:t>
+      </w:r>
+      <w:proofErr w:type="spellEnd"/>
+      <w:r>
+        <w:t xml:space="preserve"> al </w:t>
+      </w:r>
+      <w:proofErr w:type="spellStart"/>
+      <w:r>
+        <w:t>giorno</w:t>
+      </w:r>
+      <w:proofErr w:type="spellEnd"/>
+      <w:r>
+        <w:t xml:space="preserve"> se non </w:t>
+      </w:r>
+      <w:proofErr w:type="spellStart"/>
+      <w:r>
+        <w:t>tagliata</w:t>
+      </w:r>
+      <w:proofErr w:type="spellEnd"/>
+      <w:r>
+        <w:t>).</w:t>
       </w:r>
     </w:p>
     <w:p>
@@ -1457,7 +2299,35 @@
         <w:rPr>
           <w:lang w:val="it-IT"/>
         </w:rPr>
-        <w:t>Il codice è ospitato su un repository Git (GitHub). La chat è usata per discutere, scrivere snippet e aggiornare la documentazione, </w:t>
+        <w:t xml:space="preserve">Il codice è ospitato su un repository </w:t>
+      </w:r>
+      <w:proofErr w:type="spellStart"/>
+      <w:r>
+        <w:rPr>
+          <w:lang w:val="it-IT"/>
+        </w:rPr>
+        <w:t>Git</w:t>
+      </w:r>
+      <w:proofErr w:type="spellEnd"/>
+      <w:r>
+        <w:rPr>
+          <w:lang w:val="it-IT"/>
+        </w:rPr>
+        <w:t xml:space="preserve"> (GitHub). La chat è usata per discutere, scrivere </w:t>
+      </w:r>
+      <w:proofErr w:type="spellStart"/>
+      <w:r>
+        <w:rPr>
+          <w:lang w:val="it-IT"/>
+        </w:rPr>
+        <w:t>snippet</w:t>
+      </w:r>
+      <w:proofErr w:type="spellEnd"/>
+      <w:r>
+        <w:rPr>
+          <w:lang w:val="it-IT"/>
+        </w:rPr>
+        <w:t xml:space="preserve"> e aggiornare la documentazione, </w:t>
       </w:r>
       <w:r>
         <w:rPr>
@@ -1532,8 +2402,13 @@
         </w:numPr>
       </w:pPr>
       <w:r>
-        <w:t>Roadmap del Prototipo</w:t>
-      </w:r>
+        <w:t xml:space="preserve">Roadmap del </w:t>
+      </w:r>
+      <w:proofErr w:type="spellStart"/>
+      <w:r>
+        <w:t>Prototipo</w:t>
+      </w:r>
+      <w:proofErr w:type="spellEnd"/>
     </w:p>
     <w:p>
       <w:pPr>
@@ -1554,7 +2429,23 @@
         </w:numPr>
       </w:pPr>
       <w:r>
-        <w:t>GDD Esteso (Bibbia completa)</w:t>
+        <w:t xml:space="preserve">GDD </w:t>
+      </w:r>
+      <w:proofErr w:type="spellStart"/>
+      <w:r>
+        <w:t>Esteso</w:t>
+      </w:r>
+      <w:proofErr w:type="spellEnd"/>
+      <w:r>
+        <w:t xml:space="preserve"> (</w:t>
+      </w:r>
+      <w:proofErr w:type="spellStart"/>
+      <w:r>
+        <w:t>Bibbia</w:t>
+      </w:r>
+      <w:proofErr w:type="spellEnd"/>
+      <w:r>
+        <w:t xml:space="preserve"> completa)</w:t>
       </w:r>
     </w:p>
     <w:p>
@@ -1564,8 +2455,21 @@
           <w:numId w:val="6"/>
         </w:numPr>
       </w:pPr>
-      <w:r>
-        <w:t>Questo documento (TECHNICAL.md)</w:t>
+      <w:proofErr w:type="spellStart"/>
+      <w:r>
+        <w:t>Questo</w:t>
+      </w:r>
+      <w:proofErr w:type="spellEnd"/>
+      <w:r>
+        <w:t xml:space="preserve"> </w:t>
+      </w:r>
+      <w:proofErr w:type="spellStart"/>
+      <w:r>
+        <w:t>documento</w:t>
+      </w:r>
+      <w:proofErr w:type="spellEnd"/>
+      <w:r>
+        <w:t xml:space="preserve"> (TECHNICAL.md)</w:t>
       </w:r>
     </w:p>
     <w:p>
@@ -1670,7 +2574,35 @@
         <w:rPr>
           <w:lang w:val="it-IT"/>
         </w:rPr>
-        <w:t>L'utente applica le modifiche localmente, testa il codice, e poi committa e pusha sul repository.</w:t>
+        <w:t xml:space="preserve">L'utente applica le modifiche localmente, testa il codice, e poi </w:t>
+      </w:r>
+      <w:proofErr w:type="spellStart"/>
+      <w:r>
+        <w:rPr>
+          <w:lang w:val="it-IT"/>
+        </w:rPr>
+        <w:t>committa</w:t>
+      </w:r>
+      <w:proofErr w:type="spellEnd"/>
+      <w:r>
+        <w:rPr>
+          <w:lang w:val="it-IT"/>
+        </w:rPr>
+        <w:t xml:space="preserve"> e </w:t>
+      </w:r>
+      <w:proofErr w:type="spellStart"/>
+      <w:r>
+        <w:rPr>
+          <w:lang w:val="it-IT"/>
+        </w:rPr>
+        <w:t>pusha</w:t>
+      </w:r>
+      <w:proofErr w:type="spellEnd"/>
+      <w:r>
+        <w:rPr>
+          <w:lang w:val="it-IT"/>
+        </w:rPr>
+        <w:t xml:space="preserve"> sul repository.</w:t>
       </w:r>
     </w:p>
     <w:p>
@@ -1741,7 +2673,21 @@
         <w:rPr>
           <w:lang w:val="it-IT"/>
         </w:rPr>
-        <w:t>Il codice è scritto con nomi di variabili e funzioni chiari ed esplicativi. Ogni file ha un'intestazione che ne descrive lo scopo. Le funzioni complesse hanno commenti in stile JSDoc.</w:t>
+        <w:t xml:space="preserve">Il codice è scritto con nomi di variabili e funzioni chiari ed esplicativi. Ogni file ha un'intestazione che ne descrive lo scopo. Le funzioni complesse hanno commenti in stile </w:t>
+      </w:r>
+      <w:proofErr w:type="spellStart"/>
+      <w:r>
+        <w:rPr>
+          <w:lang w:val="it-IT"/>
+        </w:rPr>
+        <w:t>JSDoc</w:t>
+      </w:r>
+      <w:proofErr w:type="spellEnd"/>
+      <w:r>
+        <w:rPr>
+          <w:lang w:val="it-IT"/>
+        </w:rPr>
+        <w:t>.</w:t>
       </w:r>
     </w:p>
     <w:p>
@@ -1754,101 +2700,112 @@
     </w:p>
     <w:p>
       <w:pPr>
-        <w:pStyle w:val="ds-markdown-paragraph"/>
+        <w:pStyle w:val="ListParagraph"/>
+        <w:numPr>
+          <w:ilvl w:val="0"/>
+          <w:numId w:val="20"/>
+        </w:numPr>
+        <w:rPr>
+          <w:lang w:val="it-IT"/>
+        </w:rPr>
+      </w:pPr>
+      <w:r>
+        <w:rPr>
+          <w:rStyle w:val="Strong"/>
+          <w:rFonts w:ascii="Segoe UI" w:hAnsi="Segoe UI" w:cs="Segoe UI"/>
+          <w:color w:val="0F1115"/>
+          <w:lang w:val="it-IT"/>
+        </w:rPr>
+        <w:t>Lingua:</w:t>
+      </w:r>
+      <w:r>
+        <w:rPr>
+          <w:lang w:val="it-IT"/>
+        </w:rPr>
+        <w:t> tutto il codice, i commenti e i nomi dei file sono in </w:t>
+      </w:r>
+      <w:r>
+        <w:rPr>
+          <w:rStyle w:val="Strong"/>
+          <w:rFonts w:ascii="Segoe UI" w:hAnsi="Segoe UI" w:cs="Segoe UI"/>
+          <w:color w:val="0F1115"/>
+          <w:lang w:val="it-IT"/>
+        </w:rPr>
+        <w:t>inglese</w:t>
+      </w:r>
+      <w:r>
+        <w:rPr>
+          <w:lang w:val="it-IT"/>
+        </w:rPr>
+        <w:t>. Questo include nomi di variabili, funzioni, classi, messaggi di commit e documentazione tecnica interna al codice.</w:t>
+      </w:r>
+    </w:p>
+    <w:p>
+      <w:pPr>
+        <w:pStyle w:val="ListParagraph"/>
+        <w:numPr>
+          <w:ilvl w:val="0"/>
+          <w:numId w:val="20"/>
+        </w:numPr>
+        <w:rPr>
+          <w:lang w:val="it-IT"/>
+        </w:rPr>
+      </w:pPr>
+      <w:r>
+        <w:rPr>
+          <w:lang w:val="it-IT"/>
+        </w:rPr>
+        <w:t>I documenti di design (GDD, roadmap, concept) possono restare in italiano, in quanto rivolti alla progettazione e non all’implementazione.</w:t>
+      </w:r>
+    </w:p>
+    <w:p>
+      <w:pPr>
+        <w:pStyle w:val="ListParagraph"/>
+        <w:numPr>
+          <w:ilvl w:val="0"/>
+          <w:numId w:val="20"/>
+        </w:numPr>
+        <w:rPr>
+          <w:lang w:val="it-IT"/>
+        </w:rPr>
+      </w:pPr>
+      <w:r>
+        <w:rPr>
+          <w:lang w:val="it-IT"/>
+        </w:rPr>
+        <w:t>Questa scelta facilita la coerenza, la ricerca di aiuto online e la portabilità del progetto.</w:t>
+      </w:r>
+    </w:p>
+    <w:p>
+      <w:pPr>
+        <w:pStyle w:val="ListParagraph"/>
         <w:numPr>
           <w:ilvl w:val="0"/>
           <w:numId w:val="13"/>
         </w:numPr>
+        <w:rPr>
+          <w:lang w:val="it-IT"/>
+        </w:rPr>
+      </w:pPr>
+      <w:r>
+        <w:rPr>
+          <w:lang w:val="it-IT"/>
+        </w:rPr>
+        <w:t>Quando vengono fornite modifiche a file esistenti, l'assistente deve preservare i commenti già presenti, a meno che le modifiche stesse non li rendano obsoleti o errati.</w:t>
+      </w:r>
+    </w:p>
+    <w:p>
+      <w:pPr>
+        <w:pStyle w:val="ds-markdown-paragraph"/>
         <w:shd w:val="clear" w:color="auto" w:fill="FFFFFF"/>
         <w:spacing w:before="0" w:beforeAutospacing="0" w:after="0" w:afterAutospacing="0"/>
+        <w:ind w:left="720"/>
         <w:rPr>
           <w:rFonts w:ascii="Segoe UI" w:hAnsi="Segoe UI" w:cs="Segoe UI"/>
           <w:color w:val="0F1115"/>
           <w:lang w:val="it-IT"/>
         </w:rPr>
       </w:pPr>
-      <w:r>
-        <w:rPr>
-          <w:rStyle w:val="Strong"/>
-          <w:rFonts w:ascii="Segoe UI" w:hAnsi="Segoe UI" w:cs="Segoe UI"/>
-          <w:color w:val="0F1115"/>
-          <w:lang w:val="it-IT"/>
-        </w:rPr>
-        <w:t>Lingua:</w:t>
-      </w:r>
-      <w:r>
-        <w:rPr>
-          <w:rFonts w:ascii="Segoe UI" w:hAnsi="Segoe UI" w:cs="Segoe UI"/>
-          <w:color w:val="0F1115"/>
-          <w:lang w:val="it-IT"/>
-        </w:rPr>
-        <w:t> tutto il codice, i commenti e i nomi dei file sono in </w:t>
-      </w:r>
-      <w:r>
-        <w:rPr>
-          <w:rStyle w:val="Strong"/>
-          <w:rFonts w:ascii="Segoe UI" w:hAnsi="Segoe UI" w:cs="Segoe UI"/>
-          <w:color w:val="0F1115"/>
-          <w:lang w:val="it-IT"/>
-        </w:rPr>
-        <w:t>inglese</w:t>
-      </w:r>
-      <w:r>
-        <w:rPr>
-          <w:rFonts w:ascii="Segoe UI" w:hAnsi="Segoe UI" w:cs="Segoe UI"/>
-          <w:color w:val="0F1115"/>
-          <w:lang w:val="it-IT"/>
-        </w:rPr>
-        <w:t>. Questo include nomi di variabili, funzioni, classi, messaggi di commit e documentazione tecnica interna al codice.</w:t>
-      </w:r>
-    </w:p>
-    <w:p>
-      <w:pPr>
-        <w:pStyle w:val="ds-markdown-paragraph"/>
-        <w:numPr>
-          <w:ilvl w:val="0"/>
-          <w:numId w:val="13"/>
-        </w:numPr>
-        <w:shd w:val="clear" w:color="auto" w:fill="FFFFFF"/>
-        <w:spacing w:before="0" w:beforeAutospacing="0" w:after="0" w:afterAutospacing="0"/>
-        <w:rPr>
-          <w:rFonts w:ascii="Segoe UI" w:hAnsi="Segoe UI" w:cs="Segoe UI"/>
-          <w:color w:val="0F1115"/>
-          <w:lang w:val="it-IT"/>
-        </w:rPr>
-      </w:pPr>
-      <w:r>
-        <w:rPr>
-          <w:rFonts w:ascii="Segoe UI" w:hAnsi="Segoe UI" w:cs="Segoe UI"/>
-          <w:color w:val="0F1115"/>
-          <w:lang w:val="it-IT"/>
-        </w:rPr>
-        <w:t>I documenti di design (GDD, roadmap, concept) possono restare in italiano, in quanto rivolti alla progettazione e non all’implementazione.</w:t>
-      </w:r>
-    </w:p>
-    <w:p>
-      <w:pPr>
-        <w:pStyle w:val="ds-markdown-paragraph"/>
-        <w:numPr>
-          <w:ilvl w:val="0"/>
-          <w:numId w:val="13"/>
-        </w:numPr>
-        <w:shd w:val="clear" w:color="auto" w:fill="FFFFFF"/>
-        <w:spacing w:before="0" w:beforeAutospacing="0" w:after="0" w:afterAutospacing="0"/>
-        <w:rPr>
-          <w:rFonts w:ascii="Segoe UI" w:hAnsi="Segoe UI" w:cs="Segoe UI"/>
-          <w:color w:val="0F1115"/>
-          <w:lang w:val="it-IT"/>
-        </w:rPr>
-      </w:pPr>
-      <w:r>
-        <w:rPr>
-          <w:rFonts w:ascii="Segoe UI" w:hAnsi="Segoe UI" w:cs="Segoe UI"/>
-          <w:color w:val="0F1115"/>
-          <w:lang w:val="it-IT"/>
-        </w:rPr>
-        <w:t>Questa scelta facilita la coerenza, la ricerca di aiuto online e la portabilità del progetto.</w:t>
-      </w:r>
     </w:p>
     <w:p>
       <w:pPr>
@@ -1981,8 +2938,18 @@
           <w:bCs/>
           <w:lang w:val="it-IT" w:eastAsia="en-GB"/>
         </w:rPr>
-        <w:t>istruzioni passo passo</w:t>
-      </w:r>
+        <w:t xml:space="preserve">istruzioni passo </w:t>
+      </w:r>
+      <w:proofErr w:type="spellStart"/>
+      <w:r>
+        <w:rPr>
+          <w:b/>
+          <w:bCs/>
+          <w:lang w:val="it-IT" w:eastAsia="en-GB"/>
+        </w:rPr>
+        <w:t>passo</w:t>
+      </w:r>
+      <w:proofErr w:type="spellEnd"/>
       <w:r>
         <w:rPr>
           <w:lang w:val="it-IT" w:eastAsia="en-GB"/>
@@ -2047,7 +3014,21 @@
         <w:rPr>
           <w:lang w:val="it-IT" w:eastAsia="en-GB"/>
         </w:rPr>
-        <w:t>Quali tasti premere (es. Ctrl+S per salvare).</w:t>
+        <w:t xml:space="preserve">Quali tasti premere (es. </w:t>
+      </w:r>
+      <w:proofErr w:type="spellStart"/>
+      <w:r>
+        <w:rPr>
+          <w:lang w:val="it-IT" w:eastAsia="en-GB"/>
+        </w:rPr>
+        <w:t>Ctrl+S</w:t>
+      </w:r>
+      <w:proofErr w:type="spellEnd"/>
+      <w:r>
+        <w:rPr>
+          <w:lang w:val="it-IT" w:eastAsia="en-GB"/>
+        </w:rPr>
+        <w:t xml:space="preserve"> per salvare).</w:t>
       </w:r>
     </w:p>
     <w:p>
@@ -2166,7 +3147,21 @@
         <w:rPr>
           <w:lang w:val="it-IT"/>
         </w:rPr>
-        <w:t>L'utente eseguirà i test e segnalerà eventuali anomalie prima di procedere al commit.</w:t>
+        <w:t xml:space="preserve">L'utente eseguirà i test e segnalerà eventuali anomalie prima di procedere al </w:t>
+      </w:r>
+      <w:proofErr w:type="spellStart"/>
+      <w:r>
+        <w:rPr>
+          <w:lang w:val="it-IT"/>
+        </w:rPr>
+        <w:t>commit</w:t>
+      </w:r>
+      <w:proofErr w:type="spellEnd"/>
+      <w:r>
+        <w:rPr>
+          <w:lang w:val="it-IT"/>
+        </w:rPr>
+        <w:t>.</w:t>
       </w:r>
     </w:p>
     <w:p>
@@ -2242,16 +3237,54 @@
         <w:rPr>
           <w:lang w:val="it-IT"/>
         </w:rPr>
-        <w:t>Fare commit e push di tutti i file modificati (codice e documentazione) con un messaggio chiaro.</w:t>
+        <w:t xml:space="preserve">Fare </w:t>
+      </w:r>
+      <w:proofErr w:type="spellStart"/>
+      <w:r>
+        <w:rPr>
+          <w:lang w:val="it-IT"/>
+        </w:rPr>
+        <w:t>commit</w:t>
+      </w:r>
+      <w:proofErr w:type="spellEnd"/>
+      <w:r>
+        <w:rPr>
+          <w:lang w:val="it-IT"/>
+        </w:rPr>
+        <w:t xml:space="preserve"> e </w:t>
+      </w:r>
+      <w:proofErr w:type="spellStart"/>
+      <w:r>
+        <w:rPr>
+          <w:lang w:val="it-IT"/>
+        </w:rPr>
+        <w:t>push</w:t>
+      </w:r>
+      <w:proofErr w:type="spellEnd"/>
+      <w:r>
+        <w:rPr>
+          <w:lang w:val="it-IT"/>
+        </w:rPr>
+        <w:t xml:space="preserve"> di tutti i file modificati (codice e documentazione) con un messaggio chiaro.</w:t>
       </w:r>
     </w:p>
     <w:p>
       <w:pPr>
         <w:pStyle w:val="Heading1"/>
       </w:pPr>
-      <w:r>
-        <w:t>Riferimenti incrociati</w:t>
-      </w:r>
+      <w:proofErr w:type="spellStart"/>
+      <w:r>
+        <w:t>Riferimenti</w:t>
+      </w:r>
+      <w:proofErr w:type="spellEnd"/>
+      <w:r>
+        <w:t xml:space="preserve"> </w:t>
+      </w:r>
+      <w:proofErr w:type="spellStart"/>
+      <w:r>
+        <w:t>incrociati</w:t>
+      </w:r>
+      <w:proofErr w:type="spellEnd"/>
     </w:p>
     <w:p>
       <w:pPr>
@@ -4346,6 +5379,155 @@
     </w:lvl>
   </w:abstractNum>
   <w:abstractNum w:abstractNumId="17" w15:restartNumberingAfterBreak="0">
+    <w:nsid w:val="6CA53A97"/>
+    <w:multiLevelType w:val="multilevel"/>
+    <w:tmpl w:val="3DBCE22A"/>
+    <w:lvl w:ilvl="0">
+      <w:start w:val="1"/>
+      <w:numFmt w:val="bullet"/>
+      <w:lvlText w:val=""/>
+      <w:lvlJc w:val="left"/>
+      <w:pPr>
+        <w:tabs>
+          <w:tab w:val="num" w:pos="720"/>
+        </w:tabs>
+        <w:ind w:left="720" w:hanging="360"/>
+      </w:pPr>
+      <w:rPr>
+        <w:rFonts w:ascii="Symbol" w:hAnsi="Symbol" w:hint="default"/>
+        <w:sz w:val="20"/>
+      </w:rPr>
+    </w:lvl>
+    <w:lvl w:ilvl="1" w:tentative="1">
+      <w:start w:val="1"/>
+      <w:numFmt w:val="bullet"/>
+      <w:lvlText w:val="o"/>
+      <w:lvlJc w:val="left"/>
+      <w:pPr>
+        <w:tabs>
+          <w:tab w:val="num" w:pos="1440"/>
+        </w:tabs>
+        <w:ind w:left="1440" w:hanging="360"/>
+      </w:pPr>
+      <w:rPr>
+        <w:rFonts w:ascii="Courier New" w:hAnsi="Courier New" w:hint="default"/>
+        <w:sz w:val="20"/>
+      </w:rPr>
+    </w:lvl>
+    <w:lvl w:ilvl="2" w:tentative="1">
+      <w:start w:val="1"/>
+      <w:numFmt w:val="bullet"/>
+      <w:lvlText w:val=""/>
+      <w:lvlJc w:val="left"/>
+      <w:pPr>
+        <w:tabs>
+          <w:tab w:val="num" w:pos="2160"/>
+        </w:tabs>
+        <w:ind w:left="2160" w:hanging="360"/>
+      </w:pPr>
+      <w:rPr>
+        <w:rFonts w:ascii="Wingdings" w:hAnsi="Wingdings" w:hint="default"/>
+        <w:sz w:val="20"/>
+      </w:rPr>
+    </w:lvl>
+    <w:lvl w:ilvl="3" w:tentative="1">
+      <w:start w:val="1"/>
+      <w:numFmt w:val="bullet"/>
+      <w:lvlText w:val=""/>
+      <w:lvlJc w:val="left"/>
+      <w:pPr>
+        <w:tabs>
+          <w:tab w:val="num" w:pos="2880"/>
+        </w:tabs>
+        <w:ind w:left="2880" w:hanging="360"/>
+      </w:pPr>
+      <w:rPr>
+        <w:rFonts w:ascii="Wingdings" w:hAnsi="Wingdings" w:hint="default"/>
+        <w:sz w:val="20"/>
+      </w:rPr>
+    </w:lvl>
+    <w:lvl w:ilvl="4" w:tentative="1">
+      <w:start w:val="1"/>
+      <w:numFmt w:val="bullet"/>
+      <w:lvlText w:val=""/>
+      <w:lvlJc w:val="left"/>
+      <w:pPr>
+        <w:tabs>
+          <w:tab w:val="num" w:pos="3600"/>
+        </w:tabs>
+        <w:ind w:left="3600" w:hanging="360"/>
+      </w:pPr>
+      <w:rPr>
+        <w:rFonts w:ascii="Wingdings" w:hAnsi="Wingdings" w:hint="default"/>
+        <w:sz w:val="20"/>
+      </w:rPr>
+    </w:lvl>
+    <w:lvl w:ilvl="5" w:tentative="1">
+      <w:start w:val="1"/>
+      <w:numFmt w:val="bullet"/>
+      <w:lvlText w:val=""/>
+      <w:lvlJc w:val="left"/>
+      <w:pPr>
+        <w:tabs>
+          <w:tab w:val="num" w:pos="4320"/>
+        </w:tabs>
+        <w:ind w:left="4320" w:hanging="360"/>
+      </w:pPr>
+      <w:rPr>
+        <w:rFonts w:ascii="Wingdings" w:hAnsi="Wingdings" w:hint="default"/>
+        <w:sz w:val="20"/>
+      </w:rPr>
+    </w:lvl>
+    <w:lvl w:ilvl="6" w:tentative="1">
+      <w:start w:val="1"/>
+      <w:numFmt w:val="bullet"/>
+      <w:lvlText w:val=""/>
+      <w:lvlJc w:val="left"/>
+      <w:pPr>
+        <w:tabs>
+          <w:tab w:val="num" w:pos="5040"/>
+        </w:tabs>
+        <w:ind w:left="5040" w:hanging="360"/>
+      </w:pPr>
+      <w:rPr>
+        <w:rFonts w:ascii="Wingdings" w:hAnsi="Wingdings" w:hint="default"/>
+        <w:sz w:val="20"/>
+      </w:rPr>
+    </w:lvl>
+    <w:lvl w:ilvl="7" w:tentative="1">
+      <w:start w:val="1"/>
+      <w:numFmt w:val="bullet"/>
+      <w:lvlText w:val=""/>
+      <w:lvlJc w:val="left"/>
+      <w:pPr>
+        <w:tabs>
+          <w:tab w:val="num" w:pos="5760"/>
+        </w:tabs>
+        <w:ind w:left="5760" w:hanging="360"/>
+      </w:pPr>
+      <w:rPr>
+        <w:rFonts w:ascii="Wingdings" w:hAnsi="Wingdings" w:hint="default"/>
+        <w:sz w:val="20"/>
+      </w:rPr>
+    </w:lvl>
+    <w:lvl w:ilvl="8" w:tentative="1">
+      <w:start w:val="1"/>
+      <w:numFmt w:val="bullet"/>
+      <w:lvlText w:val=""/>
+      <w:lvlJc w:val="left"/>
+      <w:pPr>
+        <w:tabs>
+          <w:tab w:val="num" w:pos="6480"/>
+        </w:tabs>
+        <w:ind w:left="6480" w:hanging="360"/>
+      </w:pPr>
+      <w:rPr>
+        <w:rFonts w:ascii="Wingdings" w:hAnsi="Wingdings" w:hint="default"/>
+        <w:sz w:val="20"/>
+      </w:rPr>
+    </w:lvl>
+  </w:abstractNum>
+  <w:abstractNum w:abstractNumId="18" w15:restartNumberingAfterBreak="0">
     <w:nsid w:val="6E4D4AD7"/>
     <w:multiLevelType w:val="multilevel"/>
     <w:tmpl w:val="D354E42E"/>
@@ -4494,7 +5676,7 @@
       </w:rPr>
     </w:lvl>
   </w:abstractNum>
-  <w:abstractNum w:abstractNumId="18" w15:restartNumberingAfterBreak="0">
+  <w:abstractNum w:abstractNumId="19" w15:restartNumberingAfterBreak="0">
     <w:nsid w:val="6FA430C8"/>
     <w:multiLevelType w:val="multilevel"/>
     <w:tmpl w:val="4142CFCE"/>
@@ -4644,7 +5826,7 @@
     </w:lvl>
   </w:abstractNum>
   <w:num w:numId="1" w16cid:durableId="1753548350">
-    <w:abstractNumId w:val="18"/>
+    <w:abstractNumId w:val="19"/>
   </w:num>
   <w:num w:numId="2" w16cid:durableId="427048364">
     <w:abstractNumId w:val="6"/>
@@ -4665,7 +5847,7 @@
     <w:abstractNumId w:val="5"/>
   </w:num>
   <w:num w:numId="8" w16cid:durableId="661277827">
-    <w:abstractNumId w:val="17"/>
+    <w:abstractNumId w:val="18"/>
   </w:num>
   <w:num w:numId="9" w16cid:durableId="1440685245">
     <w:abstractNumId w:val="10"/>
@@ -4699,6 +5881,9 @@
   </w:num>
   <w:num w:numId="19" w16cid:durableId="1090584944">
     <w:abstractNumId w:val="11"/>
+  </w:num>
+  <w:num w:numId="20" w16cid:durableId="461728514">
+    <w:abstractNumId w:val="17"/>
   </w:num>
 </w:numbering>
 </file>

</xml_diff>

<commit_message>
0.0.4 MVP 1 - Batch 4 : Food gathering with density reduction and dynamic grid
- Pop now enters 'working' state on arrival when a forage task is set.
- Gathering rate proportional to local forageDensity; density decreases over time.
- Dynamic grid redraw: cells change color as density changes.
- Fixed moveTo to preserve task; separated left-click (select) and right-click (move/gather).
- Added green indicator on pop when working.
</commit_message>
<xml_diff>
--- a/Docs/Technical.docx
+++ b/Docs/Technical.docx
@@ -7,13 +7,8 @@
         <w:pStyle w:val="Heading1"/>
       </w:pPr>
       <w:r>
-        <w:t xml:space="preserve">Stack </w:t>
-      </w:r>
-      <w:proofErr w:type="spellStart"/>
-      <w:r>
-        <w:t>tecnologico</w:t>
-      </w:r>
-      <w:proofErr w:type="spellEnd"/>
+        <w:t>Stack tecnologico</w:t>
+      </w:r>
     </w:p>
     <w:p>
       <w:pPr>
@@ -22,21 +17,12 @@
           <w:numId w:val="1"/>
         </w:numPr>
       </w:pPr>
-      <w:proofErr w:type="spellStart"/>
       <w:r>
         <w:rPr>
           <w:b/>
           <w:bCs/>
         </w:rPr>
-        <w:t>Linguaggio</w:t>
-      </w:r>
-      <w:proofErr w:type="spellEnd"/>
-      <w:r>
-        <w:rPr>
-          <w:b/>
-          <w:bCs/>
-        </w:rPr>
-        <w:t>:</w:t>
+        <w:t>Linguaggio:</w:t>
       </w:r>
       <w:r>
         <w:t> JavaScript (ES6+)</w:t>
@@ -64,21 +50,7 @@
         <w:rPr>
           <w:lang w:val="it-IT"/>
         </w:rPr>
-        <w:t> </w:t>
-      </w:r>
-      <w:proofErr w:type="spellStart"/>
-      <w:r>
-        <w:rPr>
-          <w:lang w:val="it-IT"/>
-        </w:rPr>
-        <w:t>Phaser</w:t>
-      </w:r>
-      <w:proofErr w:type="spellEnd"/>
-      <w:r>
-        <w:rPr>
-          <w:lang w:val="it-IT"/>
-        </w:rPr>
-        <w:t xml:space="preserve"> 3 (caricato da CDN)</w:t>
+        <w:t> Phaser 3 (caricato da CDN)</w:t>
       </w:r>
     </w:p>
     <w:p>
@@ -113,21 +85,12 @@
           <w:numId w:val="1"/>
         </w:numPr>
       </w:pPr>
-      <w:proofErr w:type="spellStart"/>
       <w:r>
         <w:rPr>
           <w:b/>
           <w:bCs/>
         </w:rPr>
-        <w:t>Struttura</w:t>
-      </w:r>
-      <w:proofErr w:type="spellEnd"/>
-      <w:r>
-        <w:rPr>
-          <w:b/>
-          <w:bCs/>
-        </w:rPr>
-        <w:t xml:space="preserve"> file:</w:t>
+        <w:t>Struttura file:</w:t>
       </w:r>
     </w:p>
     <w:p>
@@ -144,21 +107,7 @@
         <w:rPr>
           <w:lang w:val="it-IT"/>
         </w:rPr>
-        <w:t xml:space="preserve">index.html – punto di ingresso, carica </w:t>
-      </w:r>
-      <w:proofErr w:type="spellStart"/>
-      <w:r>
-        <w:rPr>
-          <w:lang w:val="it-IT"/>
-        </w:rPr>
-        <w:t>Phaser</w:t>
-      </w:r>
-      <w:proofErr w:type="spellEnd"/>
-      <w:r>
-        <w:rPr>
-          <w:lang w:val="it-IT"/>
-        </w:rPr>
-        <w:t xml:space="preserve"> e gli script</w:t>
+        <w:t>index.html – punto di ingresso, carica Phaser e gli script</w:t>
       </w:r>
     </w:p>
     <w:p>
@@ -171,19 +120,11 @@
           <w:lang w:val="it-IT"/>
         </w:rPr>
       </w:pPr>
-      <w:proofErr w:type="spellStart"/>
-      <w:r>
-        <w:rPr>
-          <w:lang w:val="it-IT"/>
-        </w:rPr>
-        <w:t>css</w:t>
-      </w:r>
-      <w:proofErr w:type="spellEnd"/>
-      <w:r>
-        <w:rPr>
-          <w:lang w:val="it-IT"/>
-        </w:rPr>
-        <w:t>/style.css – stili per UI HTML sovrapposta</w:t>
+      <w:r>
+        <w:rPr>
+          <w:lang w:val="it-IT"/>
+        </w:rPr>
+        <w:t>css/style.css – stili per UI HTML sovrapposta</w:t>
       </w:r>
     </w:p>
     <w:p>
@@ -196,33 +137,11 @@
           <w:lang w:val="it-IT"/>
         </w:rPr>
       </w:pPr>
-      <w:proofErr w:type="spellStart"/>
-      <w:r>
-        <w:rPr>
-          <w:lang w:val="it-IT"/>
-        </w:rPr>
-        <w:t>js</w:t>
-      </w:r>
-      <w:proofErr w:type="spellEnd"/>
-      <w:r>
-        <w:rPr>
-          <w:lang w:val="it-IT"/>
-        </w:rPr>
-        <w:t xml:space="preserve">/main.js – inizializzazione di </w:t>
-      </w:r>
-      <w:proofErr w:type="spellStart"/>
-      <w:r>
-        <w:rPr>
-          <w:lang w:val="it-IT"/>
-        </w:rPr>
-        <w:t>Phaser</w:t>
-      </w:r>
-      <w:proofErr w:type="spellEnd"/>
-      <w:r>
-        <w:rPr>
-          <w:lang w:val="it-IT"/>
-        </w:rPr>
-        <w:t xml:space="preserve"> e configurazione globale</w:t>
+      <w:r>
+        <w:rPr>
+          <w:lang w:val="it-IT"/>
+        </w:rPr>
+        <w:t>js/main.js – inizializzazione di Phaser e configurazione globale</w:t>
       </w:r>
     </w:p>
     <w:p>
@@ -235,33 +154,11 @@
           <w:lang w:val="it-IT"/>
         </w:rPr>
       </w:pPr>
-      <w:proofErr w:type="spellStart"/>
-      <w:r>
-        <w:rPr>
-          <w:lang w:val="it-IT"/>
-        </w:rPr>
-        <w:t>js</w:t>
-      </w:r>
-      <w:proofErr w:type="spellEnd"/>
-      <w:r>
-        <w:rPr>
-          <w:lang w:val="it-IT"/>
-        </w:rPr>
-        <w:t xml:space="preserve">/world.js – griglia spaziale, </w:t>
-      </w:r>
-      <w:proofErr w:type="spellStart"/>
-      <w:r>
-        <w:rPr>
-          <w:lang w:val="it-IT"/>
-        </w:rPr>
-        <w:t>layer</w:t>
-      </w:r>
-      <w:proofErr w:type="spellEnd"/>
-      <w:r>
-        <w:rPr>
-          <w:lang w:val="it-IT"/>
-        </w:rPr>
-        <w:t xml:space="preserve"> di densità, query spaziali</w:t>
+      <w:r>
+        <w:rPr>
+          <w:lang w:val="it-IT"/>
+        </w:rPr>
+        <w:t>js/world.js – griglia spaziale, layer di densità, query spaziali</w:t>
       </w:r>
     </w:p>
     <w:p>
@@ -274,19 +171,11 @@
           <w:lang w:val="it-IT"/>
         </w:rPr>
       </w:pPr>
-      <w:proofErr w:type="spellStart"/>
-      <w:r>
-        <w:rPr>
-          <w:lang w:val="it-IT"/>
-        </w:rPr>
-        <w:t>js</w:t>
-      </w:r>
-      <w:proofErr w:type="spellEnd"/>
-      <w:r>
-        <w:rPr>
-          <w:lang w:val="it-IT"/>
-        </w:rPr>
-        <w:t>/units.js – classi per pop, unità, branchi</w:t>
+      <w:r>
+        <w:rPr>
+          <w:lang w:val="it-IT"/>
+        </w:rPr>
+        <w:t>js/units.js – classi per pop, unità, branchi</w:t>
       </w:r>
     </w:p>
     <w:p>
@@ -299,19 +188,11 @@
           <w:lang w:val="it-IT"/>
         </w:rPr>
       </w:pPr>
-      <w:proofErr w:type="spellStart"/>
-      <w:r>
-        <w:rPr>
-          <w:lang w:val="it-IT"/>
-        </w:rPr>
-        <w:t>js</w:t>
-      </w:r>
-      <w:proofErr w:type="spellEnd"/>
-      <w:r>
-        <w:rPr>
-          <w:lang w:val="it-IT"/>
-        </w:rPr>
-        <w:t>/resources.js – logica di raccolta, consumo, deterioramento (futuro)</w:t>
+      <w:r>
+        <w:rPr>
+          <w:lang w:val="it-IT"/>
+        </w:rPr>
+        <w:t>js/resources.js – logica di raccolta, consumo, deterioramento (futuro)</w:t>
       </w:r>
     </w:p>
     <w:p>
@@ -324,33 +205,11 @@
           <w:lang w:val="it-IT"/>
         </w:rPr>
       </w:pPr>
-      <w:proofErr w:type="spellStart"/>
-      <w:r>
-        <w:rPr>
-          <w:lang w:val="it-IT"/>
-        </w:rPr>
-        <w:t>js</w:t>
-      </w:r>
-      <w:proofErr w:type="spellEnd"/>
-      <w:r>
-        <w:rPr>
-          <w:lang w:val="it-IT"/>
-        </w:rPr>
-        <w:t xml:space="preserve">/ui.js – interfaccia utente, pannelli, </w:t>
-      </w:r>
-      <w:proofErr w:type="spellStart"/>
-      <w:r>
-        <w:rPr>
-          <w:lang w:val="it-IT"/>
-        </w:rPr>
-        <w:t>tooltip</w:t>
-      </w:r>
-      <w:proofErr w:type="spellEnd"/>
-      <w:r>
-        <w:rPr>
-          <w:lang w:val="it-IT"/>
-        </w:rPr>
-        <w:t xml:space="preserve"> (futuro)</w:t>
+      <w:r>
+        <w:rPr>
+          <w:lang w:val="it-IT"/>
+        </w:rPr>
+        <w:t>js/ui.js – interfaccia utente, pannelli, tooltip (futuro)</w:t>
       </w:r>
     </w:p>
     <w:p>
@@ -363,19 +222,11 @@
           <w:lang w:val="it-IT"/>
         </w:rPr>
       </w:pPr>
-      <w:proofErr w:type="spellStart"/>
-      <w:r>
-        <w:rPr>
-          <w:lang w:val="it-IT"/>
-        </w:rPr>
-        <w:t>js</w:t>
-      </w:r>
-      <w:proofErr w:type="spellEnd"/>
-      <w:r>
-        <w:rPr>
-          <w:lang w:val="it-IT"/>
-        </w:rPr>
-        <w:t>/time.js – gestione pausa/play/velocità (futuro)</w:t>
+      <w:r>
+        <w:rPr>
+          <w:lang w:val="it-IT"/>
+        </w:rPr>
+        <w:t>js/time.js – gestione pausa/play/velocità (futuro)</w:t>
       </w:r>
     </w:p>
     <w:p>
@@ -437,14 +288,12 @@
           <w:lang w:val="it-IT"/>
         </w:rPr>
       </w:pPr>
-      <w:proofErr w:type="spellStart"/>
       <w:r>
         <w:rPr>
           <w:lang w:val="it-IT"/>
         </w:rPr>
         <w:t>javascript</w:t>
       </w:r>
-      <w:proofErr w:type="spellEnd"/>
     </w:p>
     <w:p>
       <w:pPr>
@@ -469,21 +318,7 @@
         <w:rPr>
           <w:lang w:val="it-IT"/>
         </w:rPr>
-        <w:t xml:space="preserve">  cx, </w:t>
-      </w:r>
-      <w:proofErr w:type="spellStart"/>
-      <w:r>
-        <w:rPr>
-          <w:lang w:val="it-IT"/>
-        </w:rPr>
-        <w:t>cy</w:t>
-      </w:r>
-      <w:proofErr w:type="spellEnd"/>
-      <w:r>
-        <w:rPr>
-          <w:lang w:val="it-IT"/>
-        </w:rPr>
-        <w:t xml:space="preserve">,                   </w:t>
+        <w:t xml:space="preserve">  cx, cy,                   </w:t>
       </w:r>
       <w:r>
         <w:rPr>
@@ -504,21 +339,7 @@
         <w:rPr>
           <w:lang w:val="it-IT"/>
         </w:rPr>
-        <w:t xml:space="preserve">  </w:t>
-      </w:r>
-      <w:proofErr w:type="spellStart"/>
-      <w:r>
-        <w:rPr>
-          <w:lang w:val="it-IT"/>
-        </w:rPr>
-        <w:t>entities</w:t>
-      </w:r>
-      <w:proofErr w:type="spellEnd"/>
-      <w:r>
-        <w:rPr>
-          <w:lang w:val="it-IT"/>
-        </w:rPr>
-        <w:t xml:space="preserve">: [],             </w:t>
+        <w:t xml:space="preserve">  entities: [],             </w:t>
       </w:r>
       <w:r>
         <w:rPr>
@@ -540,21 +361,7 @@
           <w:lang w:val="it-IT"/>
         </w:rPr>
         <w:lastRenderedPageBreak/>
-        <w:t xml:space="preserve">  </w:t>
-      </w:r>
-      <w:proofErr w:type="spellStart"/>
-      <w:r>
-        <w:rPr>
-          <w:lang w:val="it-IT"/>
-        </w:rPr>
-        <w:t>forestDensity</w:t>
-      </w:r>
-      <w:proofErr w:type="spellEnd"/>
-      <w:r>
-        <w:rPr>
-          <w:lang w:val="it-IT"/>
-        </w:rPr>
-        <w:t xml:space="preserve">: 0.0,       </w:t>
+        <w:t xml:space="preserve">  forestDensity: 0.0,       </w:t>
       </w:r>
       <w:r>
         <w:rPr>
@@ -575,21 +382,7 @@
         <w:rPr>
           <w:lang w:val="it-IT"/>
         </w:rPr>
-        <w:t xml:space="preserve">  </w:t>
-      </w:r>
-      <w:proofErr w:type="spellStart"/>
-      <w:r>
-        <w:rPr>
-          <w:lang w:val="it-IT"/>
-        </w:rPr>
-        <w:t>forageDensity</w:t>
-      </w:r>
-      <w:proofErr w:type="spellEnd"/>
-      <w:r>
-        <w:rPr>
-          <w:lang w:val="it-IT"/>
-        </w:rPr>
-        <w:t xml:space="preserve">: 0.0,       </w:t>
+        <w:t xml:space="preserve">  forageDensity: 0.0,       </w:t>
       </w:r>
       <w:r>
         <w:rPr>
@@ -610,21 +403,7 @@
         <w:rPr>
           <w:lang w:val="it-IT"/>
         </w:rPr>
-        <w:t xml:space="preserve">  </w:t>
-      </w:r>
-      <w:proofErr w:type="spellStart"/>
-      <w:r>
-        <w:rPr>
-          <w:lang w:val="it-IT"/>
-        </w:rPr>
-        <w:t>smallGameDensity</w:t>
-      </w:r>
-      <w:proofErr w:type="spellEnd"/>
-      <w:r>
-        <w:rPr>
-          <w:lang w:val="it-IT"/>
-        </w:rPr>
-        <w:t xml:space="preserve">: 0.0,    </w:t>
+        <w:t xml:space="preserve">  smallGameDensity: 0.0,    </w:t>
       </w:r>
       <w:r>
         <w:rPr>
@@ -645,21 +424,7 @@
         <w:rPr>
           <w:lang w:val="it-IT"/>
         </w:rPr>
-        <w:t xml:space="preserve">  </w:t>
-      </w:r>
-      <w:proofErr w:type="spellStart"/>
-      <w:r>
-        <w:rPr>
-          <w:lang w:val="it-IT"/>
-        </w:rPr>
-        <w:t>fishDensity</w:t>
-      </w:r>
-      <w:proofErr w:type="spellEnd"/>
-      <w:r>
-        <w:rPr>
-          <w:lang w:val="it-IT"/>
-        </w:rPr>
-        <w:t xml:space="preserve">: 0.0,         </w:t>
+        <w:t xml:space="preserve">  fishDensity: 0.0,         </w:t>
       </w:r>
       <w:r>
         <w:rPr>
@@ -680,21 +445,7 @@
         <w:rPr>
           <w:lang w:val="it-IT"/>
         </w:rPr>
-        <w:t xml:space="preserve">  </w:t>
-      </w:r>
-      <w:proofErr w:type="spellStart"/>
-      <w:r>
-        <w:rPr>
-          <w:lang w:val="it-IT"/>
-        </w:rPr>
-        <w:t>fertility</w:t>
-      </w:r>
-      <w:proofErr w:type="spellEnd"/>
-      <w:r>
-        <w:rPr>
-          <w:lang w:val="it-IT"/>
-        </w:rPr>
-        <w:t xml:space="preserve">: 0.5            </w:t>
+        <w:t xml:space="preserve">  fertility: 0.5            </w:t>
       </w:r>
       <w:r>
         <w:rPr>
@@ -728,35 +479,7 @@
         <w:rPr>
           <w:lang w:val="it-IT"/>
         </w:rPr>
-        <w:t>La griglia è memorizzata in un array 2D o in una </w:t>
-      </w:r>
-      <w:proofErr w:type="spellStart"/>
-      <w:r>
-        <w:rPr>
-          <w:lang w:val="it-IT"/>
-        </w:rPr>
-        <w:t>Map</w:t>
-      </w:r>
-      <w:proofErr w:type="spellEnd"/>
-      <w:r>
-        <w:rPr>
-          <w:lang w:val="it-IT"/>
-        </w:rPr>
-        <w:t> con chiave "</w:t>
-      </w:r>
-      <w:proofErr w:type="spellStart"/>
-      <w:r>
-        <w:rPr>
-          <w:lang w:val="it-IT"/>
-        </w:rPr>
-        <w:t>cx,cy</w:t>
-      </w:r>
-      <w:proofErr w:type="spellEnd"/>
-      <w:r>
-        <w:rPr>
-          <w:lang w:val="it-IT"/>
-        </w:rPr>
-        <w:t>".</w:t>
+        <w:t>La griglia è memorizzata in un array 2D o in una Map con chiave "cx,cy".</w:t>
       </w:r>
     </w:p>
     <w:p>
@@ -777,33 +500,11 @@
           <w:lang w:val="it-IT"/>
         </w:rPr>
       </w:pPr>
-      <w:proofErr w:type="spellStart"/>
-      <w:r>
-        <w:rPr>
-          <w:lang w:val="it-IT"/>
-        </w:rPr>
-        <w:t>worldToCell</w:t>
-      </w:r>
-      <w:proofErr w:type="spellEnd"/>
-      <w:r>
-        <w:rPr>
-          <w:lang w:val="it-IT"/>
-        </w:rPr>
-        <w:t xml:space="preserve">(x, y) → {cx, </w:t>
-      </w:r>
-      <w:proofErr w:type="spellStart"/>
-      <w:r>
-        <w:rPr>
-          <w:lang w:val="it-IT"/>
-        </w:rPr>
-        <w:t>cy</w:t>
-      </w:r>
-      <w:proofErr w:type="spellEnd"/>
-      <w:r>
-        <w:rPr>
-          <w:lang w:val="it-IT"/>
-        </w:rPr>
-        <w:t>}: converte coordinate mondo in coordinate cella.</w:t>
+      <w:r>
+        <w:rPr>
+          <w:lang w:val="it-IT"/>
+        </w:rPr>
+        <w:t>worldToCell(x, y) → {cx, cy}: converte coordinate mondo in coordinate cella.</w:t>
       </w:r>
     </w:p>
     <w:p>
@@ -816,33 +517,11 @@
           <w:lang w:val="it-IT"/>
         </w:rPr>
       </w:pPr>
-      <w:proofErr w:type="spellStart"/>
-      <w:r>
-        <w:rPr>
-          <w:lang w:val="it-IT"/>
-        </w:rPr>
-        <w:t>getCell</w:t>
-      </w:r>
-      <w:proofErr w:type="spellEnd"/>
-      <w:r>
-        <w:rPr>
-          <w:lang w:val="it-IT"/>
-        </w:rPr>
-        <w:t xml:space="preserve">(cx, </w:t>
-      </w:r>
-      <w:proofErr w:type="spellStart"/>
-      <w:r>
-        <w:rPr>
-          <w:lang w:val="it-IT"/>
-        </w:rPr>
-        <w:t>cy</w:t>
-      </w:r>
-      <w:proofErr w:type="spellEnd"/>
-      <w:r>
-        <w:rPr>
-          <w:lang w:val="it-IT"/>
-        </w:rPr>
-        <w:t>) → oggetto cella (crea la cella se non esiste).</w:t>
+      <w:r>
+        <w:rPr>
+          <w:lang w:val="it-IT"/>
+        </w:rPr>
+        <w:t>getCell(cx, cy) → oggetto cella (crea la cella se non esiste).</w:t>
       </w:r>
     </w:p>
     <w:p>
@@ -855,33 +534,11 @@
           <w:lang w:val="it-IT"/>
         </w:rPr>
       </w:pPr>
-      <w:proofErr w:type="spellStart"/>
-      <w:r>
-        <w:rPr>
-          <w:lang w:val="it-IT"/>
-        </w:rPr>
-        <w:t>getEntitiesInRadius</w:t>
-      </w:r>
-      <w:proofErr w:type="spellEnd"/>
-      <w:r>
-        <w:rPr>
-          <w:lang w:val="it-IT"/>
-        </w:rPr>
-        <w:t xml:space="preserve">(x, y, </w:t>
-      </w:r>
-      <w:proofErr w:type="spellStart"/>
-      <w:r>
-        <w:rPr>
-          <w:lang w:val="it-IT"/>
-        </w:rPr>
-        <w:t>radius</w:t>
-      </w:r>
-      <w:proofErr w:type="spellEnd"/>
-      <w:r>
-        <w:rPr>
-          <w:lang w:val="it-IT"/>
-        </w:rPr>
-        <w:t>) → array di entità: interroga le celle nel raggio e filtra per distanza esatta.</w:t>
+      <w:r>
+        <w:rPr>
+          <w:lang w:val="it-IT"/>
+        </w:rPr>
+        <w:t>getEntitiesInRadius(x, y, radius) → array di entità: interroga le celle nel raggio e filtra per distanza esatta.</w:t>
       </w:r>
     </w:p>
     <w:p>
@@ -894,75 +551,11 @@
           <w:lang w:val="it-IT"/>
         </w:rPr>
       </w:pPr>
-      <w:proofErr w:type="spellStart"/>
-      <w:r>
-        <w:rPr>
-          <w:lang w:val="it-IT"/>
-        </w:rPr>
-        <w:t>modifyDensity</w:t>
-      </w:r>
-      <w:proofErr w:type="spellEnd"/>
-      <w:r>
-        <w:rPr>
-          <w:lang w:val="it-IT"/>
-        </w:rPr>
-        <w:t xml:space="preserve">(x, y, </w:t>
-      </w:r>
-      <w:proofErr w:type="spellStart"/>
-      <w:r>
-        <w:rPr>
-          <w:lang w:val="it-IT"/>
-        </w:rPr>
-        <w:t>layer</w:t>
-      </w:r>
-      <w:proofErr w:type="spellEnd"/>
-      <w:r>
-        <w:rPr>
-          <w:lang w:val="it-IT"/>
-        </w:rPr>
-        <w:t xml:space="preserve">, </w:t>
-      </w:r>
-      <w:proofErr w:type="spellStart"/>
-      <w:r>
-        <w:rPr>
-          <w:lang w:val="it-IT"/>
-        </w:rPr>
-        <w:t>amount</w:t>
-      </w:r>
-      <w:proofErr w:type="spellEnd"/>
-      <w:r>
-        <w:rPr>
-          <w:lang w:val="it-IT"/>
-        </w:rPr>
-        <w:t xml:space="preserve">, </w:t>
-      </w:r>
-      <w:proofErr w:type="spellStart"/>
-      <w:r>
-        <w:rPr>
-          <w:lang w:val="it-IT"/>
-        </w:rPr>
-        <w:t>impactRadius</w:t>
-      </w:r>
-      <w:proofErr w:type="spellEnd"/>
-      <w:r>
-        <w:rPr>
-          <w:lang w:val="it-IT"/>
-        </w:rPr>
-        <w:t xml:space="preserve">): modifica la densità del </w:t>
-      </w:r>
-      <w:proofErr w:type="spellStart"/>
-      <w:r>
-        <w:rPr>
-          <w:lang w:val="it-IT"/>
-        </w:rPr>
-        <w:t>layer</w:t>
-      </w:r>
-      <w:proofErr w:type="spellEnd"/>
-      <w:r>
-        <w:rPr>
-          <w:lang w:val="it-IT"/>
-        </w:rPr>
-        <w:t xml:space="preserve"> indicato nelle celle intorno alla posizione, con decadimento radiale.</w:t>
+      <w:r>
+        <w:rPr>
+          <w:lang w:val="it-IT"/>
+        </w:rPr>
+        <w:t>modifyDensity(x, y, layer, amount, impactRadius): modifica la densità del layer indicato nelle celle intorno alla posizione, con decadimento radiale.</w:t>
       </w:r>
     </w:p>
     <w:p>
@@ -1030,11 +623,9 @@
             <w:hideMark/>
           </w:tcPr>
           <w:p>
-            <w:proofErr w:type="spellStart"/>
             <w:r>
               <w:t>Proprietà</w:t>
             </w:r>
-            <w:proofErr w:type="spellEnd"/>
           </w:p>
         </w:tc>
         <w:tc>
@@ -1053,11 +644,9 @@
             <w:hideMark/>
           </w:tcPr>
           <w:p>
-            <w:proofErr w:type="spellStart"/>
             <w:r>
               <w:t>Descrizione</w:t>
             </w:r>
-            <w:proofErr w:type="spellEnd"/>
           </w:p>
         </w:tc>
       </w:tr>
@@ -1093,11 +682,9 @@
             <w:hideMark/>
           </w:tcPr>
           <w:p>
-            <w:proofErr w:type="spellStart"/>
             <w:r>
               <w:t>forestDensity</w:t>
             </w:r>
-            <w:proofErr w:type="spellEnd"/>
           </w:p>
         </w:tc>
         <w:tc>
@@ -1141,19 +728,9 @@
             <w:hideMark/>
           </w:tcPr>
           <w:p>
-            <w:proofErr w:type="spellStart"/>
             <w:r>
-              <w:t>Vegetazione</w:t>
+              <w:t>Vegetazione raccoglibile</w:t>
             </w:r>
-            <w:proofErr w:type="spellEnd"/>
-            <w:r>
-              <w:t xml:space="preserve"> </w:t>
-            </w:r>
-            <w:proofErr w:type="spellStart"/>
-            <w:r>
-              <w:t>raccoglibile</w:t>
-            </w:r>
-            <w:proofErr w:type="spellEnd"/>
           </w:p>
         </w:tc>
         <w:tc>
@@ -1169,11 +746,9 @@
             <w:hideMark/>
           </w:tcPr>
           <w:p>
-            <w:proofErr w:type="spellStart"/>
             <w:r>
               <w:t>forageDensity</w:t>
             </w:r>
-            <w:proofErr w:type="spellEnd"/>
           </w:p>
         </w:tc>
         <w:tc>
@@ -1218,13 +793,8 @@
           </w:tcPr>
           <w:p>
             <w:r>
-              <w:t xml:space="preserve">Piccola fauna </w:t>
+              <w:t>Piccola fauna terrestre</w:t>
             </w:r>
-            <w:proofErr w:type="spellStart"/>
-            <w:r>
-              <w:t>terrestre</w:t>
-            </w:r>
-            <w:proofErr w:type="spellEnd"/>
           </w:p>
         </w:tc>
         <w:tc>
@@ -1240,11 +810,9 @@
             <w:hideMark/>
           </w:tcPr>
           <w:p>
-            <w:proofErr w:type="spellStart"/>
             <w:r>
               <w:t>smallGameDensity</w:t>
             </w:r>
-            <w:proofErr w:type="spellEnd"/>
           </w:p>
         </w:tc>
         <w:tc>
@@ -1306,11 +874,9 @@
             <w:hideMark/>
           </w:tcPr>
           <w:p>
-            <w:proofErr w:type="spellStart"/>
             <w:r>
               <w:t>fishDensity</w:t>
             </w:r>
-            <w:proofErr w:type="spellEnd"/>
           </w:p>
         </w:tc>
         <w:tc>
@@ -1333,23 +899,7 @@
               <w:t xml:space="preserve">Disponibile solo in celle d'acqua. </w:t>
             </w:r>
             <w:r>
-              <w:t xml:space="preserve">Ridotto </w:t>
-            </w:r>
-            <w:proofErr w:type="spellStart"/>
-            <w:r>
-              <w:t>dalla</w:t>
-            </w:r>
-            <w:proofErr w:type="spellEnd"/>
-            <w:r>
-              <w:t xml:space="preserve"> </w:t>
-            </w:r>
-            <w:proofErr w:type="spellStart"/>
-            <w:r>
-              <w:t>pesca</w:t>
-            </w:r>
-            <w:proofErr w:type="spellEnd"/>
-            <w:r>
-              <w:t>.</w:t>
+              <w:t>Ridotto dalla pesca.</w:t>
             </w:r>
           </w:p>
         </w:tc>
@@ -1368,11 +918,9 @@
             <w:hideMark/>
           </w:tcPr>
           <w:p>
-            <w:proofErr w:type="spellStart"/>
             <w:r>
               <w:t>Fertilità</w:t>
             </w:r>
-            <w:proofErr w:type="spellEnd"/>
           </w:p>
         </w:tc>
         <w:tc>
@@ -1407,31 +955,7 @@
           </w:tcPr>
           <w:p>
             <w:r>
-              <w:t xml:space="preserve">Per </w:t>
-            </w:r>
-            <w:proofErr w:type="spellStart"/>
-            <w:r>
-              <w:t>uso</w:t>
-            </w:r>
-            <w:proofErr w:type="spellEnd"/>
-            <w:r>
-              <w:t xml:space="preserve"> </w:t>
-            </w:r>
-            <w:proofErr w:type="spellStart"/>
-            <w:r>
-              <w:t>futuro</w:t>
-            </w:r>
-            <w:proofErr w:type="spellEnd"/>
-            <w:r>
-              <w:t xml:space="preserve"> (</w:t>
-            </w:r>
-            <w:proofErr w:type="spellStart"/>
-            <w:r>
-              <w:t>agricoltura</w:t>
-            </w:r>
-            <w:proofErr w:type="spellEnd"/>
-            <w:r>
-              <w:t>).</w:t>
+              <w:t>Per uso futuro (agricoltura).</w:t>
             </w:r>
           </w:p>
         </w:tc>
@@ -1474,11 +998,9 @@
       </w:r>
     </w:p>
     <w:p>
-      <w:proofErr w:type="spellStart"/>
       <w:r>
         <w:t>javascript</w:t>
       </w:r>
-      <w:proofErr w:type="spellEnd"/>
     </w:p>
     <w:p>
       <w:r>
@@ -1529,35 +1051,7 @@
         <w:rPr>
           <w:lang w:val="it-IT"/>
         </w:rPr>
-        <w:t xml:space="preserve">  </w:t>
-      </w:r>
-      <w:proofErr w:type="spellStart"/>
-      <w:r>
-        <w:rPr>
-          <w:lang w:val="it-IT"/>
-        </w:rPr>
-        <w:t>targetX</w:t>
-      </w:r>
-      <w:proofErr w:type="spellEnd"/>
-      <w:r>
-        <w:rPr>
-          <w:lang w:val="it-IT"/>
-        </w:rPr>
-        <w:t xml:space="preserve">, </w:t>
-      </w:r>
-      <w:proofErr w:type="spellStart"/>
-      <w:r>
-        <w:rPr>
-          <w:lang w:val="it-IT"/>
-        </w:rPr>
-        <w:t>targetY</w:t>
-      </w:r>
-      <w:proofErr w:type="spellEnd"/>
-      <w:r>
-        <w:rPr>
-          <w:lang w:val="it-IT"/>
-        </w:rPr>
-        <w:t xml:space="preserve">,         </w:t>
+        <w:t xml:space="preserve">  targetX, targetY,         </w:t>
       </w:r>
       <w:r>
         <w:rPr>
@@ -1599,35 +1093,7 @@
         <w:rPr>
           <w:lang w:val="it-IT"/>
         </w:rPr>
-        <w:t xml:space="preserve">  state: '</w:t>
-      </w:r>
-      <w:proofErr w:type="spellStart"/>
-      <w:r>
-        <w:rPr>
-          <w:lang w:val="it-IT"/>
-        </w:rPr>
-        <w:t>idle</w:t>
-      </w:r>
-      <w:proofErr w:type="spellEnd"/>
-      <w:r>
-        <w:rPr>
-          <w:lang w:val="it-IT"/>
-        </w:rPr>
-        <w:t>' | '</w:t>
-      </w:r>
-      <w:proofErr w:type="spellStart"/>
-      <w:r>
-        <w:rPr>
-          <w:lang w:val="it-IT"/>
-        </w:rPr>
-        <w:t>moving</w:t>
-      </w:r>
-      <w:proofErr w:type="spellEnd"/>
-      <w:r>
-        <w:rPr>
-          <w:lang w:val="it-IT"/>
-        </w:rPr>
-        <w:t>' | 'working'</w:t>
+        <w:t xml:space="preserve">  state: 'idle' | 'moving' | 'working'</w:t>
       </w:r>
     </w:p>
     <w:p>
@@ -1652,29 +1118,8 @@
       </w:r>
     </w:p>
     <w:p>
-      <w:proofErr w:type="spellStart"/>
-      <w:r>
-        <w:t>Estende</w:t>
-      </w:r>
-      <w:proofErr w:type="spellEnd"/>
-      <w:r>
-        <w:t xml:space="preserve"> </w:t>
-      </w:r>
-      <w:proofErr w:type="spellStart"/>
-      <w:r>
-        <w:t>l'unità</w:t>
-      </w:r>
-      <w:proofErr w:type="spellEnd"/>
-      <w:r>
-        <w:t xml:space="preserve"> </w:t>
-      </w:r>
-      <w:proofErr w:type="spellStart"/>
-      <w:r>
-        <w:t>generica</w:t>
-      </w:r>
-      <w:proofErr w:type="spellEnd"/>
-      <w:r>
-        <w:t xml:space="preserve"> con:</w:t>
+      <w:r>
+        <w:t>Estende l'unità generica con:</w:t>
       </w:r>
     </w:p>
     <w:p>
@@ -1687,19 +1132,11 @@
           <w:lang w:val="it-IT"/>
         </w:rPr>
       </w:pPr>
-      <w:proofErr w:type="spellStart"/>
-      <w:r>
-        <w:rPr>
-          <w:lang w:val="it-IT"/>
-        </w:rPr>
-        <w:t>population</w:t>
-      </w:r>
-      <w:proofErr w:type="spellEnd"/>
-      <w:r>
-        <w:rPr>
-          <w:lang w:val="it-IT"/>
-        </w:rPr>
-        <w:t>: numero di individui nel gruppo</w:t>
+      <w:r>
+        <w:rPr>
+          <w:lang w:val="it-IT"/>
+        </w:rPr>
+        <w:t>population: numero di individui nel gruppo</w:t>
       </w:r>
     </w:p>
     <w:p>
@@ -1716,91 +1153,7 @@
         <w:rPr>
           <w:lang w:val="it-IT"/>
         </w:rPr>
-        <w:t xml:space="preserve">task: { </w:t>
-      </w:r>
-      <w:proofErr w:type="spellStart"/>
-      <w:r>
-        <w:rPr>
-          <w:lang w:val="it-IT"/>
-        </w:rPr>
-        <w:t>type</w:t>
-      </w:r>
-      <w:proofErr w:type="spellEnd"/>
-      <w:r>
-        <w:rPr>
-          <w:lang w:val="it-IT"/>
-        </w:rPr>
-        <w:t>: '</w:t>
-      </w:r>
-      <w:proofErr w:type="spellStart"/>
-      <w:r>
-        <w:rPr>
-          <w:lang w:val="it-IT"/>
-        </w:rPr>
-        <w:t>gatherWood</w:t>
-      </w:r>
-      <w:proofErr w:type="spellEnd"/>
-      <w:r>
-        <w:rPr>
-          <w:lang w:val="it-IT"/>
-        </w:rPr>
-        <w:t>' | '</w:t>
-      </w:r>
-      <w:proofErr w:type="spellStart"/>
-      <w:r>
-        <w:rPr>
-          <w:lang w:val="it-IT"/>
-        </w:rPr>
-        <w:t>hunt</w:t>
-      </w:r>
-      <w:proofErr w:type="spellEnd"/>
-      <w:r>
-        <w:rPr>
-          <w:lang w:val="it-IT"/>
-        </w:rPr>
-        <w:t>' | '</w:t>
-      </w:r>
-      <w:proofErr w:type="spellStart"/>
-      <w:r>
-        <w:rPr>
-          <w:lang w:val="it-IT"/>
-        </w:rPr>
-        <w:t>forage</w:t>
-      </w:r>
-      <w:proofErr w:type="spellEnd"/>
-      <w:r>
-        <w:rPr>
-          <w:lang w:val="it-IT"/>
-        </w:rPr>
-        <w:t>' | '</w:t>
-      </w:r>
-      <w:proofErr w:type="spellStart"/>
-      <w:r>
-        <w:rPr>
-          <w:lang w:val="it-IT"/>
-        </w:rPr>
-        <w:t>fish</w:t>
-      </w:r>
-      <w:proofErr w:type="spellEnd"/>
-      <w:r>
-        <w:rPr>
-          <w:lang w:val="it-IT"/>
-        </w:rPr>
-        <w:t>' | '</w:t>
-      </w:r>
-      <w:proofErr w:type="spellStart"/>
-      <w:r>
-        <w:rPr>
-          <w:lang w:val="it-IT"/>
-        </w:rPr>
-        <w:t>trapSmallGame</w:t>
-      </w:r>
-      <w:proofErr w:type="spellEnd"/>
-      <w:r>
-        <w:rPr>
-          <w:lang w:val="it-IT"/>
-        </w:rPr>
-        <w:t>', location: {x, y} }</w:t>
+        <w:t>task: { type: 'gatherWood' | 'hunt' | 'forage' | 'fish' | 'trapSmallGame', location: {x, y} }</w:t>
       </w:r>
     </w:p>
     <w:p>
@@ -1813,33 +1166,11 @@
           <w:lang w:val="it-IT"/>
         </w:rPr>
       </w:pPr>
-      <w:proofErr w:type="spellStart"/>
-      <w:r>
-        <w:rPr>
-          <w:lang w:val="it-IT"/>
-        </w:rPr>
-        <w:t>inventory</w:t>
-      </w:r>
-      <w:proofErr w:type="spellEnd"/>
-      <w:r>
-        <w:rPr>
-          <w:lang w:val="it-IT"/>
-        </w:rPr>
-        <w:t xml:space="preserve">: { </w:t>
-      </w:r>
-      <w:proofErr w:type="spellStart"/>
-      <w:r>
-        <w:rPr>
-          <w:lang w:val="it-IT"/>
-        </w:rPr>
-        <w:t>wood</w:t>
-      </w:r>
-      <w:proofErr w:type="spellEnd"/>
-      <w:r>
-        <w:rPr>
-          <w:lang w:val="it-IT"/>
-        </w:rPr>
-        <w:t>: 0, food: 0 } – risorse trasportate (in futuro potranno essere differenziate)</w:t>
+      <w:r>
+        <w:rPr>
+          <w:lang w:val="it-IT"/>
+        </w:rPr>
+        <w:t>inventory: { wood: 0, food: 0 } – risorse trasportate (in futuro potranno essere differenziate)</w:t>
       </w:r>
     </w:p>
     <w:p>
@@ -1852,19 +1183,11 @@
           <w:lang w:val="it-IT"/>
         </w:rPr>
       </w:pPr>
-      <w:proofErr w:type="spellStart"/>
-      <w:r>
-        <w:rPr>
-          <w:lang w:val="it-IT"/>
-        </w:rPr>
-        <w:t>rations</w:t>
-      </w:r>
-      <w:proofErr w:type="spellEnd"/>
-      <w:r>
-        <w:rPr>
-          <w:lang w:val="it-IT"/>
-        </w:rPr>
-        <w:t>: provviste di cibo portate per il viaggio</w:t>
+      <w:r>
+        <w:rPr>
+          <w:lang w:val="it-IT"/>
+        </w:rPr>
+        <w:t>rations: provviste di cibo portate per il viaggio</w:t>
       </w:r>
     </w:p>
     <w:p>
@@ -1893,27 +1216,9 @@
           <w:numId w:val="4"/>
         </w:numPr>
       </w:pPr>
-      <w:proofErr w:type="spellStart"/>
-      <w:r>
-        <w:t>herdSize</w:t>
-      </w:r>
-      <w:proofErr w:type="spellEnd"/>
-      <w:r>
-        <w:t xml:space="preserve">: </w:t>
-      </w:r>
-      <w:proofErr w:type="spellStart"/>
-      <w:r>
-        <w:t>numero</w:t>
-      </w:r>
-      <w:proofErr w:type="spellEnd"/>
-      <w:r>
-        <w:t xml:space="preserve"> di </w:t>
-      </w:r>
-      <w:proofErr w:type="spellStart"/>
-      <w:r>
-        <w:t>capi</w:t>
-      </w:r>
-      <w:proofErr w:type="spellEnd"/>
+      <w:r>
+        <w:t>herdSize: numero di capi</w:t>
+      </w:r>
     </w:p>
     <w:p>
       <w:pPr>
@@ -1923,29 +1228,8 @@
         </w:numPr>
       </w:pPr>
       <w:r>
-        <w:t xml:space="preserve">habitat: </w:t>
-      </w:r>
-      <w:proofErr w:type="spellStart"/>
-      <w:r>
-        <w:t>tipo</w:t>
-      </w:r>
-      <w:proofErr w:type="spellEnd"/>
-      <w:r>
-        <w:t xml:space="preserve"> di </w:t>
-      </w:r>
-      <w:proofErr w:type="spellStart"/>
-      <w:r>
-        <w:t>terreno</w:t>
-      </w:r>
-      <w:proofErr w:type="spellEnd"/>
-      <w:r>
-        <w:t xml:space="preserve"> </w:t>
-      </w:r>
-      <w:proofErr w:type="spellStart"/>
-      <w:r>
-        <w:t>preferito</w:t>
-      </w:r>
-      <w:proofErr w:type="spellEnd"/>
+        <w:t>habitat: tipo di terreno preferito</w:t>
+      </w:r>
     </w:p>
     <w:p>
       <w:pPr>
@@ -1985,19 +1269,11 @@
           <w:lang w:val="it-IT"/>
         </w:rPr>
       </w:pPr>
-      <w:proofErr w:type="spellStart"/>
-      <w:r>
-        <w:rPr>
-          <w:lang w:val="it-IT"/>
-        </w:rPr>
-        <w:t>Phaser</w:t>
-      </w:r>
-      <w:proofErr w:type="spellEnd"/>
-      <w:r>
-        <w:rPr>
-          <w:lang w:val="it-IT"/>
-        </w:rPr>
-        <w:t xml:space="preserve"> chiama update(time, delta) a ogni frame. La logica di gioco può essere disaccoppiata dal rendering per garantire coerenza temporale.</w:t>
+      <w:r>
+        <w:rPr>
+          <w:lang w:val="it-IT"/>
+        </w:rPr>
+        <w:t>Phaser chiama update(time, delta) a ogni frame. La logica di gioco può essere disaccoppiata dal rendering per garantire coerenza temporale.</w:t>
       </w:r>
     </w:p>
     <w:p>
@@ -2007,7 +1283,6 @@
           <w:numId w:val="5"/>
         </w:numPr>
       </w:pPr>
-      <w:proofErr w:type="spellStart"/>
       <w:r>
         <w:rPr>
           <w:b/>
@@ -2016,51 +1291,14 @@
         </w:rPr>
         <w:t>TimeManager</w:t>
       </w:r>
-      <w:proofErr w:type="spellEnd"/>
-      <w:r>
-        <w:rPr>
-          <w:lang w:val="it-IT"/>
-        </w:rPr>
-        <w:t> calcola il tempo di gioco effettivo (</w:t>
-      </w:r>
-      <w:proofErr w:type="spellStart"/>
-      <w:r>
-        <w:rPr>
-          <w:lang w:val="it-IT"/>
-        </w:rPr>
-        <w:t>gameDelta</w:t>
-      </w:r>
-      <w:proofErr w:type="spellEnd"/>
-      <w:r>
-        <w:rPr>
-          <w:lang w:val="it-IT"/>
-        </w:rPr>
-        <w:t xml:space="preserve"> = delta * </w:t>
-      </w:r>
-      <w:proofErr w:type="spellStart"/>
-      <w:r>
-        <w:rPr>
-          <w:lang w:val="it-IT"/>
-        </w:rPr>
-        <w:t>speedMultiplier</w:t>
-      </w:r>
-      <w:proofErr w:type="spellEnd"/>
-      <w:r>
-        <w:rPr>
-          <w:lang w:val="it-IT"/>
-        </w:rPr>
-        <w:t xml:space="preserve">). </w:t>
-      </w:r>
-      <w:r>
-        <w:t>Se in pausa, </w:t>
-      </w:r>
-      <w:proofErr w:type="spellStart"/>
-      <w:r>
-        <w:t>gameDelta</w:t>
-      </w:r>
-      <w:proofErr w:type="spellEnd"/>
-      <w:r>
-        <w:t xml:space="preserve"> = 0.</w:t>
+      <w:r>
+        <w:rPr>
+          <w:lang w:val="it-IT"/>
+        </w:rPr>
+        <w:t xml:space="preserve"> calcola il tempo di gioco effettivo (gameDelta = delta * speedMultiplier). </w:t>
+      </w:r>
+      <w:r>
+        <w:t>Se in pausa, gameDelta = 0.</w:t>
       </w:r>
     </w:p>
     <w:p>
@@ -2085,35 +1323,7 @@
         <w:rPr>
           <w:lang w:val="it-IT"/>
         </w:rPr>
-        <w:t> tutte le unità con stato '</w:t>
-      </w:r>
-      <w:proofErr w:type="spellStart"/>
-      <w:r>
-        <w:rPr>
-          <w:lang w:val="it-IT"/>
-        </w:rPr>
-        <w:t>moving</w:t>
-      </w:r>
-      <w:proofErr w:type="spellEnd"/>
-      <w:r>
-        <w:rPr>
-          <w:lang w:val="it-IT"/>
-        </w:rPr>
-        <w:t>' vengono spostate verso il target in base a speed e </w:t>
-      </w:r>
-      <w:proofErr w:type="spellStart"/>
-      <w:r>
-        <w:rPr>
-          <w:lang w:val="it-IT"/>
-        </w:rPr>
-        <w:t>gameDelta</w:t>
-      </w:r>
-      <w:proofErr w:type="spellEnd"/>
-      <w:r>
-        <w:rPr>
-          <w:lang w:val="it-IT"/>
-        </w:rPr>
-        <w:t>.</w:t>
+        <w:t> tutte le unità con stato 'moving' vengono spostate verso il target in base a speed e gameDelta.</w:t>
       </w:r>
     </w:p>
     <w:p>
@@ -2187,21 +1397,7 @@
         <w:rPr>
           <w:lang w:val="it-IT"/>
         </w:rPr>
-        <w:t> a intervalli regolari di tempo di gioco (es. ogni </w:t>
-      </w:r>
-      <w:proofErr w:type="spellStart"/>
-      <w:r>
-        <w:rPr>
-          <w:lang w:val="it-IT"/>
-        </w:rPr>
-        <w:t>dayLength</w:t>
-      </w:r>
-      <w:proofErr w:type="spellEnd"/>
-      <w:r>
-        <w:rPr>
-          <w:lang w:val="it-IT"/>
-        </w:rPr>
-        <w:t> secondi) tutti i pop consumano cibo dalle scorte dell'accampamento.</w:t>
+        <w:t> a intervalli regolari di tempo di gioco (es. ogni dayLength secondi) tutti i pop consumano cibo dalle scorte dell'accampamento.</w:t>
       </w:r>
     </w:p>
     <w:p>
@@ -2223,48 +1419,10 @@
         <w:rPr>
           <w:lang w:val="it-IT"/>
         </w:rPr>
-        <w:t xml:space="preserve"> a intervalli regolari, le celle della griglia rigenerano una frazione di densità per ogni </w:t>
-      </w:r>
-      <w:proofErr w:type="spellStart"/>
-      <w:r>
-        <w:rPr>
-          <w:lang w:val="it-IT"/>
-        </w:rPr>
-        <w:t>layer</w:t>
-      </w:r>
-      <w:proofErr w:type="spellEnd"/>
-      <w:r>
-        <w:rPr>
-          <w:lang w:val="it-IT"/>
-        </w:rPr>
-        <w:t xml:space="preserve"> (es. </w:t>
-      </w:r>
-      <w:r>
-        <w:t>+0.01 per </w:t>
-      </w:r>
-      <w:proofErr w:type="spellStart"/>
-      <w:r>
-        <w:t>forestDensity</w:t>
-      </w:r>
-      <w:proofErr w:type="spellEnd"/>
-      <w:r>
-        <w:t xml:space="preserve"> al </w:t>
-      </w:r>
-      <w:proofErr w:type="spellStart"/>
-      <w:r>
-        <w:t>giorno</w:t>
-      </w:r>
-      <w:proofErr w:type="spellEnd"/>
-      <w:r>
-        <w:t xml:space="preserve"> se non </w:t>
-      </w:r>
-      <w:proofErr w:type="spellStart"/>
-      <w:r>
-        <w:t>tagliata</w:t>
-      </w:r>
-      <w:proofErr w:type="spellEnd"/>
-      <w:r>
-        <w:t>).</w:t>
+        <w:t xml:space="preserve"> a intervalli regolari, le celle della griglia rigenerano una frazione di densità per ogni layer (es. </w:t>
+      </w:r>
+      <w:r>
+        <w:t>+0.01 per forestDensity al giorno se non tagliata).</w:t>
       </w:r>
     </w:p>
     <w:p>
@@ -2299,35 +1457,7 @@
         <w:rPr>
           <w:lang w:val="it-IT"/>
         </w:rPr>
-        <w:t xml:space="preserve">Il codice è ospitato su un repository </w:t>
-      </w:r>
-      <w:proofErr w:type="spellStart"/>
-      <w:r>
-        <w:rPr>
-          <w:lang w:val="it-IT"/>
-        </w:rPr>
-        <w:t>Git</w:t>
-      </w:r>
-      <w:proofErr w:type="spellEnd"/>
-      <w:r>
-        <w:rPr>
-          <w:lang w:val="it-IT"/>
-        </w:rPr>
-        <w:t xml:space="preserve"> (GitHub). La chat è usata per discutere, scrivere </w:t>
-      </w:r>
-      <w:proofErr w:type="spellStart"/>
-      <w:r>
-        <w:rPr>
-          <w:lang w:val="it-IT"/>
-        </w:rPr>
-        <w:t>snippet</w:t>
-      </w:r>
-      <w:proofErr w:type="spellEnd"/>
-      <w:r>
-        <w:rPr>
-          <w:lang w:val="it-IT"/>
-        </w:rPr>
-        <w:t xml:space="preserve"> e aggiornare la documentazione, </w:t>
+        <w:t>Il codice è ospitato su un repository Git (GitHub). La chat è usata per discutere, scrivere snippet e aggiornare la documentazione, </w:t>
       </w:r>
       <w:r>
         <w:rPr>
@@ -2402,13 +1532,8 @@
         </w:numPr>
       </w:pPr>
       <w:r>
-        <w:t xml:space="preserve">Roadmap del </w:t>
-      </w:r>
-      <w:proofErr w:type="spellStart"/>
-      <w:r>
-        <w:t>Prototipo</w:t>
-      </w:r>
-      <w:proofErr w:type="spellEnd"/>
+        <w:t>Roadmap del Prototipo</w:t>
+      </w:r>
     </w:p>
     <w:p>
       <w:pPr>
@@ -2429,23 +1554,7 @@
         </w:numPr>
       </w:pPr>
       <w:r>
-        <w:t xml:space="preserve">GDD </w:t>
-      </w:r>
-      <w:proofErr w:type="spellStart"/>
-      <w:r>
-        <w:t>Esteso</w:t>
-      </w:r>
-      <w:proofErr w:type="spellEnd"/>
-      <w:r>
-        <w:t xml:space="preserve"> (</w:t>
-      </w:r>
-      <w:proofErr w:type="spellStart"/>
-      <w:r>
-        <w:t>Bibbia</w:t>
-      </w:r>
-      <w:proofErr w:type="spellEnd"/>
-      <w:r>
-        <w:t xml:space="preserve"> completa)</w:t>
+        <w:t>GDD Esteso (Bibbia completa)</w:t>
       </w:r>
     </w:p>
     <w:p>
@@ -2455,21 +1564,8 @@
           <w:numId w:val="6"/>
         </w:numPr>
       </w:pPr>
-      <w:proofErr w:type="spellStart"/>
-      <w:r>
-        <w:t>Questo</w:t>
-      </w:r>
-      <w:proofErr w:type="spellEnd"/>
-      <w:r>
-        <w:t xml:space="preserve"> </w:t>
-      </w:r>
-      <w:proofErr w:type="spellStart"/>
-      <w:r>
-        <w:t>documento</w:t>
-      </w:r>
-      <w:proofErr w:type="spellEnd"/>
-      <w:r>
-        <w:t xml:space="preserve"> (TECHNICAL.md)</w:t>
+      <w:r>
+        <w:t>Questo documento (TECHNICAL.md)</w:t>
       </w:r>
     </w:p>
     <w:p>
@@ -2483,6 +1579,25 @@
           <w:lang w:val="it-IT"/>
         </w:rPr>
         <w:t>In questo modo l'assistente avrà piena conoscenza del progetto e potrà continuare a lavorare senza perdita di contesto.</w:t>
+      </w:r>
+    </w:p>
+    <w:p>
+      <w:pPr>
+        <w:rPr>
+          <w:lang w:val="it-IT"/>
+        </w:rPr>
+      </w:pPr>
+      <w:r>
+        <w:rPr>
+          <w:lang w:val="it-IT"/>
+        </w:rPr>
+        <w:t>All’inizio di ogni nuovo batch di lavoro, per mantere il contesto aggiornato della chat</w:t>
+      </w:r>
+      <w:r>
+        <w:rPr>
+          <w:lang w:val="it-IT"/>
+        </w:rPr>
+        <w:t>, l'utente eseguirà bundle_context.py e incollerà il contenuto di project_context.txt come primo messaggio, insieme al SYNC corrente e al batch su cui si sta lavorando. L'assistente leggerà il bundle per ricostruire il contesto completo.</w:t>
       </w:r>
     </w:p>
     <w:p>
@@ -2708,35 +1823,7 @@
         <w:rPr>
           <w:lang w:val="it-IT"/>
         </w:rPr>
-        <w:t xml:space="preserve">L'utente applica le modifiche localmente, testa il codice, e poi </w:t>
-      </w:r>
-      <w:proofErr w:type="spellStart"/>
-      <w:r>
-        <w:rPr>
-          <w:lang w:val="it-IT"/>
-        </w:rPr>
-        <w:t>committa</w:t>
-      </w:r>
-      <w:proofErr w:type="spellEnd"/>
-      <w:r>
-        <w:rPr>
-          <w:lang w:val="it-IT"/>
-        </w:rPr>
-        <w:t xml:space="preserve"> e </w:t>
-      </w:r>
-      <w:proofErr w:type="spellStart"/>
-      <w:r>
-        <w:rPr>
-          <w:lang w:val="it-IT"/>
-        </w:rPr>
-        <w:t>pusha</w:t>
-      </w:r>
-      <w:proofErr w:type="spellEnd"/>
-      <w:r>
-        <w:rPr>
-          <w:lang w:val="it-IT"/>
-        </w:rPr>
-        <w:t xml:space="preserve"> sul repository.</w:t>
+        <w:t>L'utente applica le modifiche localmente, testa il codice, e poi committa e pusha sul repository.</w:t>
       </w:r>
     </w:p>
     <w:p>
@@ -2755,6 +1842,7 @@
           <w:bCs/>
           <w:lang w:val="it-IT"/>
         </w:rPr>
+        <w:lastRenderedPageBreak/>
         <w:t>Principio di non-assunzione:</w:t>
       </w:r>
       <w:r>
@@ -2806,22 +1894,7 @@
         <w:rPr>
           <w:lang w:val="it-IT"/>
         </w:rPr>
-        <w:lastRenderedPageBreak/>
-        <w:t xml:space="preserve">Alla fine di ogni batch, prima di procedere con il </w:t>
-      </w:r>
-      <w:proofErr w:type="spellStart"/>
-      <w:r>
-        <w:rPr>
-          <w:lang w:val="it-IT"/>
-        </w:rPr>
-        <w:t>commit</w:t>
-      </w:r>
-      <w:proofErr w:type="spellEnd"/>
-      <w:r>
-        <w:rPr>
-          <w:lang w:val="it-IT"/>
-        </w:rPr>
-        <w:t>, l'assistente seguirà questa procedura:</w:t>
+        <w:t>Alla fine di ogni batch, prima di procedere con il commit, l'assistente seguirà questa procedura:</w:t>
       </w:r>
     </w:p>
     <w:p>
@@ -2947,35 +2020,7 @@
         <w:rPr>
           <w:lang w:val="it-IT"/>
         </w:rPr>
-        <w:t xml:space="preserve">L'assistente non scriverà la descrizione del </w:t>
-      </w:r>
-      <w:proofErr w:type="spellStart"/>
-      <w:r>
-        <w:rPr>
-          <w:lang w:val="it-IT"/>
-        </w:rPr>
-        <w:t>commit</w:t>
-      </w:r>
-      <w:proofErr w:type="spellEnd"/>
-      <w:r>
-        <w:rPr>
-          <w:lang w:val="it-IT"/>
-        </w:rPr>
-        <w:t xml:space="preserve"> né darà istruzioni per il </w:t>
-      </w:r>
-      <w:proofErr w:type="spellStart"/>
-      <w:r>
-        <w:rPr>
-          <w:lang w:val="it-IT"/>
-        </w:rPr>
-        <w:t>push</w:t>
-      </w:r>
-      <w:proofErr w:type="spellEnd"/>
-      <w:r>
-        <w:rPr>
-          <w:lang w:val="it-IT"/>
-        </w:rPr>
-        <w:t xml:space="preserve"> fino a quando l'utente non avrà confermato che il lavoro sul batch è soddisfacente e che gli aggiornamenti ai documenti sono corretti.</w:t>
+        <w:t>L'assistente non scriverà la descrizione del commit né darà istruzioni per il push fino a quando l'utente non avrà confermato che il lavoro sul batch è soddisfacente e che gli aggiornamenti ai documenti sono corretti.</w:t>
       </w:r>
     </w:p>
     <w:p>
@@ -2993,35 +2038,7 @@
         <w:rPr>
           <w:lang w:val="it-IT"/>
         </w:rPr>
-        <w:t xml:space="preserve">Solo dopo la conferma, l'assistente produrrà il messaggio di </w:t>
-      </w:r>
-      <w:proofErr w:type="spellStart"/>
-      <w:r>
-        <w:rPr>
-          <w:lang w:val="it-IT"/>
-        </w:rPr>
-        <w:t>commit</w:t>
-      </w:r>
-      <w:proofErr w:type="spellEnd"/>
-      <w:r>
-        <w:rPr>
-          <w:lang w:val="it-IT"/>
-        </w:rPr>
-        <w:t xml:space="preserve"> (titolo e descrizione) basato su tutte le modifiche effettivamente apportate dall'ultimo </w:t>
-      </w:r>
-      <w:proofErr w:type="spellStart"/>
-      <w:r>
-        <w:rPr>
-          <w:lang w:val="it-IT"/>
-        </w:rPr>
-        <w:t>commit</w:t>
-      </w:r>
-      <w:proofErr w:type="spellEnd"/>
-      <w:r>
-        <w:rPr>
-          <w:lang w:val="it-IT"/>
-        </w:rPr>
-        <w:t>, inclusi aggiornamenti ai documenti.</w:t>
+        <w:t>Solo dopo la conferma, l'assistente produrrà il messaggio di commit (titolo e descrizione) basato su tutte le modifiche effettivamente apportate dall'ultimo commit, inclusi aggiornamenti ai documenti.</w:t>
       </w:r>
     </w:p>
     <w:p>
@@ -3156,36 +2173,8 @@
           <w:bCs/>
           <w:lang w:val="it-IT"/>
         </w:rPr>
-        <w:t xml:space="preserve">Eseguire </w:t>
-      </w:r>
-      <w:proofErr w:type="spellStart"/>
-      <w:r>
-        <w:rPr>
-          <w:b/>
-          <w:bCs/>
-          <w:lang w:val="it-IT"/>
-        </w:rPr>
-        <w:t>commit</w:t>
-      </w:r>
-      <w:proofErr w:type="spellEnd"/>
-      <w:r>
-        <w:rPr>
-          <w:b/>
-          <w:bCs/>
-          <w:lang w:val="it-IT"/>
-        </w:rPr>
-        <w:t xml:space="preserve"> e </w:t>
-      </w:r>
-      <w:proofErr w:type="spellStart"/>
-      <w:r>
-        <w:rPr>
-          <w:b/>
-          <w:bCs/>
-          <w:lang w:val="it-IT"/>
-        </w:rPr>
-        <w:t>push</w:t>
-      </w:r>
-      <w:proofErr w:type="spellEnd"/>
+        <w:t>Eseguire commit e push</w:t>
+      </w:r>
       <w:r>
         <w:rPr>
           <w:lang w:val="it-IT"/>
@@ -3211,21 +2200,7 @@
         <w:rPr>
           <w:lang w:val="it-IT"/>
         </w:rPr>
-        <w:t xml:space="preserve">Per garantire che l'assistente stia leggendo il contenuto reale del repository e non basandosi solo sulla cronologia della chat, in fondo al file TECHNICAL.md è presente un numero progressivo (es. `SYNC: 1`). Dopo ogni </w:t>
-      </w:r>
-      <w:proofErr w:type="spellStart"/>
-      <w:r>
-        <w:rPr>
-          <w:lang w:val="it-IT"/>
-        </w:rPr>
-        <w:t>push</w:t>
-      </w:r>
-      <w:proofErr w:type="spellEnd"/>
-      <w:r>
-        <w:rPr>
-          <w:lang w:val="it-IT"/>
-        </w:rPr>
-        <w:t xml:space="preserve">, l'utente </w:t>
+        <w:t xml:space="preserve">Per garantire che l'assistente stia leggendo il contenuto reale del repository e non basandosi solo sulla cronologia della chat, in fondo al file TECHNICAL.md è presente un numero progressivo (es. `SYNC: 1`). Dopo ogni push, l'utente </w:t>
       </w:r>
       <w:r>
         <w:rPr>
@@ -3237,7 +2212,14 @@
         <w:rPr>
           <w:lang w:val="it-IT"/>
         </w:rPr>
-        <w:t xml:space="preserve"> questo numero. All'inizio di ogni risposta che richiede accesso al repository, l'assistente dovrà riportare il numero SYNC che ha letto, confermando così di aver effettivamente consultato i file su GitHub.</w:t>
+        <w:t xml:space="preserve"> questo numero. All'inizio di ogni risposta che </w:t>
+      </w:r>
+      <w:r>
+        <w:rPr>
+          <w:lang w:val="it-IT"/>
+        </w:rPr>
+        <w:lastRenderedPageBreak/>
+        <w:t>richiede accesso al repository, l'assistente dovrà riportare il numero SYNC che ha letto, confermando così di aver effettivamente consultato i file su GitHub.</w:t>
       </w:r>
     </w:p>
     <w:p>
@@ -3252,7 +2234,6 @@
         <w:pStyle w:val="Heading2"/>
       </w:pPr>
       <w:r>
-        <w:lastRenderedPageBreak/>
         <w:t>Commenti e auto-documentazione</w:t>
       </w:r>
     </w:p>
@@ -3266,21 +2247,7 @@
         <w:rPr>
           <w:lang w:val="it-IT"/>
         </w:rPr>
-        <w:t xml:space="preserve">Il codice è scritto con nomi di variabili e funzioni chiari ed esplicativi. Ogni file ha un'intestazione che ne descrive lo scopo. Le funzioni complesse hanno commenti in stile </w:t>
-      </w:r>
-      <w:proofErr w:type="spellStart"/>
-      <w:r>
-        <w:rPr>
-          <w:lang w:val="it-IT"/>
-        </w:rPr>
-        <w:t>JSDoc</w:t>
-      </w:r>
-      <w:proofErr w:type="spellEnd"/>
-      <w:r>
-        <w:rPr>
-          <w:lang w:val="it-IT"/>
-        </w:rPr>
-        <w:t>.</w:t>
+        <w:t>Il codice è scritto con nomi di variabili e funzioni chiari ed esplicativi. Ogni file ha un'intestazione che ne descrive lo scopo. Le funzioni complesse hanno commenti in stile JSDoc.</w:t>
       </w:r>
     </w:p>
     <w:p>
@@ -3330,21 +2297,7 @@
         <w:rPr>
           <w:lang w:val="it-IT"/>
         </w:rPr>
-        <w:t xml:space="preserve">. Questo include nomi di variabili, funzioni, classi, messaggi di </w:t>
-      </w:r>
-      <w:proofErr w:type="spellStart"/>
-      <w:r>
-        <w:rPr>
-          <w:lang w:val="it-IT"/>
-        </w:rPr>
-        <w:t>commit</w:t>
-      </w:r>
-      <w:proofErr w:type="spellEnd"/>
-      <w:r>
-        <w:rPr>
-          <w:lang w:val="it-IT"/>
-        </w:rPr>
-        <w:t xml:space="preserve"> e documentazione tecnica interna al codice.</w:t>
+        <w:t>. Questo include nomi di variabili, funzioni, classi, messaggi di commit e documentazione tecnica interna al codice.</w:t>
       </w:r>
     </w:p>
     <w:p>
@@ -3416,21 +2369,7 @@
         <w:rPr>
           <w:lang w:val="it-IT"/>
         </w:rPr>
-        <w:t xml:space="preserve">Tutte le funzioni di update che modificano posizioni, timer o valori nel tempo devono utilizzare il delta time (differenza temporale dal frame precedente) per garantire la frame-rate </w:t>
-      </w:r>
-      <w:proofErr w:type="spellStart"/>
-      <w:r>
-        <w:rPr>
-          <w:lang w:val="it-IT"/>
-        </w:rPr>
-        <w:t>independence</w:t>
-      </w:r>
-      <w:proofErr w:type="spellEnd"/>
-      <w:r>
-        <w:rPr>
-          <w:lang w:val="it-IT"/>
-        </w:rPr>
-        <w:t>. Non si devono usare valori fissi per frame.</w:t>
+        <w:t>Tutte le funzioni di update che modificano posizioni, timer o valori nel tempo devono utilizzare il delta time (differenza temporale dal frame precedente) per garantire la frame-rate independence. Non si devono usare valori fissi per frame.</w:t>
       </w:r>
     </w:p>
     <w:p>
@@ -3580,21 +2519,7 @@
         <w:rPr>
           <w:lang w:val="it-IT"/>
         </w:rPr>
-        <w:t xml:space="preserve">: anche gli strumenti di debug (visualizzazioni temporanee, </w:t>
-      </w:r>
-      <w:proofErr w:type="spellStart"/>
-      <w:r>
-        <w:rPr>
-          <w:lang w:val="it-IT"/>
-        </w:rPr>
-        <w:t>tooltip</w:t>
-      </w:r>
-      <w:proofErr w:type="spellEnd"/>
-      <w:r>
-        <w:rPr>
-          <w:lang w:val="it-IT"/>
-        </w:rPr>
-        <w:t xml:space="preserve"> di test, overlay informativi) vengono descritti con il loro impatto attuale e il potenziale riutilizzo futuro come meccaniche di gioco, mantenendo sempre un chiaro distinguo tra "debug" e "gameplay".</w:t>
+        <w:t>: anche gli strumenti di debug (visualizzazioni temporanee, tooltip di test, overlay informativi) vengono descritti con il loro impatto attuale e il potenziale riutilizzo futuro come meccaniche di gioco, mantenendo sempre un chiaro distinguo tra "debug" e "gameplay".</w:t>
       </w:r>
     </w:p>
     <w:p>
@@ -3614,6 +2539,7 @@
           <w:bCs/>
           <w:lang w:val="it-IT"/>
         </w:rPr>
+        <w:lastRenderedPageBreak/>
         <w:t>Spiegazione del codice fornito</w:t>
       </w:r>
       <w:r>
@@ -3639,7 +2565,6 @@
         <w:rPr>
           <w:lang w:val="it-IT" w:eastAsia="en-GB"/>
         </w:rPr>
-        <w:lastRenderedPageBreak/>
         <w:t>Questo approccio garantisce che ogni decisione implementativa sia consapevole e allineata ai pilastri del design, e che il prototipo evolva in modo coerente.</w:t>
       </w:r>
     </w:p>
@@ -3661,18 +2586,8 @@
           <w:bCs/>
           <w:lang w:val="it-IT" w:eastAsia="en-GB"/>
         </w:rPr>
-        <w:t xml:space="preserve">istruzioni passo </w:t>
-      </w:r>
-      <w:proofErr w:type="spellStart"/>
-      <w:r>
-        <w:rPr>
-          <w:b/>
-          <w:bCs/>
-          <w:lang w:val="it-IT" w:eastAsia="en-GB"/>
-        </w:rPr>
-        <w:t>passo</w:t>
-      </w:r>
-      <w:proofErr w:type="spellEnd"/>
+        <w:t>istruzioni passo passo</w:t>
+      </w:r>
       <w:r>
         <w:rPr>
           <w:lang w:val="it-IT" w:eastAsia="en-GB"/>
@@ -3737,21 +2652,7 @@
         <w:rPr>
           <w:lang w:val="it-IT" w:eastAsia="en-GB"/>
         </w:rPr>
-        <w:t xml:space="preserve">Quali tasti premere (es. </w:t>
-      </w:r>
-      <w:proofErr w:type="spellStart"/>
-      <w:r>
-        <w:rPr>
-          <w:lang w:val="it-IT" w:eastAsia="en-GB"/>
-        </w:rPr>
-        <w:t>Ctrl+S</w:t>
-      </w:r>
-      <w:proofErr w:type="spellEnd"/>
-      <w:r>
-        <w:rPr>
-          <w:lang w:val="it-IT" w:eastAsia="en-GB"/>
-        </w:rPr>
-        <w:t xml:space="preserve"> per salvare).</w:t>
+        <w:t>Quali tasti premere (es. Ctrl+S per salvare).</w:t>
       </w:r>
     </w:p>
     <w:p>
@@ -3870,21 +2771,7 @@
         <w:rPr>
           <w:lang w:val="it-IT"/>
         </w:rPr>
-        <w:t xml:space="preserve">L'utente eseguirà i test e segnalerà eventuali anomalie prima di procedere al </w:t>
-      </w:r>
-      <w:proofErr w:type="spellStart"/>
-      <w:r>
-        <w:rPr>
-          <w:lang w:val="it-IT"/>
-        </w:rPr>
-        <w:t>commit</w:t>
-      </w:r>
-      <w:proofErr w:type="spellEnd"/>
-      <w:r>
-        <w:rPr>
-          <w:lang w:val="it-IT"/>
-        </w:rPr>
-        <w:t>.</w:t>
+        <w:t>L'utente eseguirà i test e segnalerà eventuali anomalie prima di procedere al commit.</w:t>
       </w:r>
     </w:p>
     <w:p>
@@ -3959,55 +2846,17 @@
         <w:rPr>
           <w:lang w:val="it-IT"/>
         </w:rPr>
-        <w:t xml:space="preserve">Fare </w:t>
-      </w:r>
-      <w:proofErr w:type="spellStart"/>
-      <w:r>
-        <w:rPr>
-          <w:lang w:val="it-IT"/>
-        </w:rPr>
-        <w:t>commit</w:t>
-      </w:r>
-      <w:proofErr w:type="spellEnd"/>
-      <w:r>
-        <w:rPr>
-          <w:lang w:val="it-IT"/>
-        </w:rPr>
-        <w:t xml:space="preserve"> e </w:t>
-      </w:r>
-      <w:proofErr w:type="spellStart"/>
-      <w:r>
-        <w:rPr>
-          <w:lang w:val="it-IT"/>
-        </w:rPr>
-        <w:t>push</w:t>
-      </w:r>
-      <w:proofErr w:type="spellEnd"/>
-      <w:r>
-        <w:rPr>
-          <w:lang w:val="it-IT"/>
-        </w:rPr>
-        <w:t xml:space="preserve"> di tutti i file modificati (codice e documentazione) con un messaggio chiaro.</w:t>
+        <w:t>Fare commit e push di tutti i file modificati (codice e documentazione) con un messaggio chiaro.</w:t>
       </w:r>
     </w:p>
     <w:p>
       <w:pPr>
         <w:pStyle w:val="Heading1"/>
       </w:pPr>
-      <w:proofErr w:type="spellStart"/>
       <w:r>
         <w:lastRenderedPageBreak/>
-        <w:t>Riferimenti</w:t>
-      </w:r>
-      <w:proofErr w:type="spellEnd"/>
-      <w:r>
-        <w:t xml:space="preserve"> </w:t>
-      </w:r>
-      <w:proofErr w:type="spellStart"/>
-      <w:r>
-        <w:t>incrociati</w:t>
-      </w:r>
-      <w:proofErr w:type="spellEnd"/>
+        <w:t>Riferimenti incrociati</w:t>
+      </w:r>
     </w:p>
     <w:p>
       <w:pPr>
@@ -4060,7 +2909,13 @@
         <w:rPr>
           <w:lang w:val="it-IT"/>
         </w:rPr>
-        <w:t>SYNC: 4</w:t>
+        <w:t xml:space="preserve">SYNC: </w:t>
+      </w:r>
+      <w:r>
+        <w:rPr>
+          <w:lang w:val="it-IT"/>
+        </w:rPr>
+        <w:t>112</w:t>
       </w:r>
     </w:p>
     <w:p>

</xml_diff>

<commit_message>
0.0.5A Batch 5: Complete expedition system with auto/forced modes, camp UI, and bug fixes
- Added automatic expedition creation via right-click on camp.
- Auto expeditions search for best cell in radius and calculate provisions based on target distance.
- Forced mode (Shift+right-click) ignores provision limits; toggle with F key.
- Auto/assigned area toggle with A key; visual indicators (blue dashed = auto, red ring = forced).
- Fixed resting state: auto expeditions now properly restart after cooldown.
- Fixed provisions calculation: auto expeditions no longer get 0 provisions on restart.
- Added camp info text real-time update for better food stock readability.
- Expeditions now correctly deposit food and enter resting when returning to camp.
- Improved cell switching logic with score threshold (10%) and distance weighting.
- Shift+left-click cell inspection restored.
- Updated TECHNICAL.md with workflow rules and code explanation guidelines.
</commit_message>
<xml_diff>
--- a/Docs/Technical.docx
+++ b/Docs/Technical.docx
@@ -5474,6 +5474,84 @@
     </w:p>
     <w:p>
       <w:pPr>
+        <w:pStyle w:val="ListParagraph"/>
+        <w:numPr>
+          <w:ilvl w:val="0"/>
+          <w:numId w:val="14"/>
+        </w:numPr>
+        <w:rPr>
+          <w:lang w:val="it-IT"/>
+        </w:rPr>
+      </w:pPr>
+      <w:r>
+        <w:rPr>
+          <w:rStyle w:val="token"/>
+          <w:rFonts w:ascii="Consolas" w:hAnsi="Consolas"/>
+          <w:b/>
+          <w:bCs/>
+          <w:color w:val="0F1115"/>
+          <w:lang w:val="it-IT"/>
+        </w:rPr>
+        <w:t>Ordine e completezza del codice:</w:t>
+      </w:r>
+      <w:r>
+        <w:rPr>
+          <w:lang w:val="it-IT"/>
+        </w:rPr>
+        <w:t xml:space="preserve"> le spiegazioni relative a un blocco di codice devono sempre </w:t>
+      </w:r>
+      <w:r>
+        <w:rPr>
+          <w:rStyle w:val="token"/>
+          <w:rFonts w:ascii="Consolas" w:hAnsi="Consolas"/>
+          <w:b/>
+          <w:bCs/>
+          <w:color w:val="0F1115"/>
+          <w:lang w:val="it-IT"/>
+        </w:rPr>
+        <w:t>precedere</w:t>
+      </w:r>
+      <w:r>
+        <w:rPr>
+          <w:lang w:val="it-IT"/>
+        </w:rPr>
+        <w:t xml:space="preserve"> il blocco stesso, mai seguirlo. Se per brevità si omette una parte di codice (es. con commenti come </w:t>
+      </w:r>
+      <w:r>
+        <w:rPr>
+          <w:rStyle w:val="token"/>
+          <w:rFonts w:ascii="Consolas" w:hAnsi="Consolas"/>
+          <w:color w:val="A626A4"/>
+          <w:lang w:val="it-IT"/>
+        </w:rPr>
+        <w:t>`// ...`</w:t>
+      </w:r>
+      <w:r>
+        <w:rPr>
+          <w:lang w:val="it-IT"/>
+        </w:rPr>
+        <w:t xml:space="preserve">), l'assistente deve segnalarlo esplicitamente </w:t>
+      </w:r>
+      <w:r>
+        <w:rPr>
+          <w:rStyle w:val="token"/>
+          <w:rFonts w:ascii="Consolas" w:hAnsi="Consolas"/>
+          <w:b/>
+          <w:bCs/>
+          <w:color w:val="0F1115"/>
+          <w:lang w:val="it-IT"/>
+        </w:rPr>
+        <w:t>prima</w:t>
+      </w:r>
+      <w:r>
+        <w:rPr>
+          <w:lang w:val="it-IT"/>
+        </w:rPr>
+        <w:t xml:space="preserve"> del blocco con un avviso chiaro (es. "Attenzione: il codice seguente contiene una parte omessa, sostituisci solo la porzione indicata"). Non si devono mai usare commenti ambigui che lascino intendere "codice identico a prima", perché l'utente potrebbe copiare l'intero blocco e perdere funzionalità.</w:t>
+      </w:r>
+    </w:p>
+    <w:p>
+      <w:pPr>
         <w:rPr>
           <w:lang w:val="it-IT" w:eastAsia="en-GB"/>
         </w:rPr>
@@ -5765,6 +5843,7 @@
         <w:rPr>
           <w:lang w:val="it-IT"/>
         </w:rPr>
+        <w:lastRenderedPageBreak/>
         <w:t>Verificare se i documenti di design (GDD, roadmap, concept) devono essere aggiornati per riflettere le nuove meccaniche implementate o le decisioni prese durante la sessione.</w:t>
       </w:r>
     </w:p>
@@ -5838,7 +5917,6 @@
       </w:pPr>
       <w:proofErr w:type="spellStart"/>
       <w:r>
-        <w:lastRenderedPageBreak/>
         <w:t>Riferimenti</w:t>
       </w:r>
       <w:proofErr w:type="spellEnd"/>
@@ -9156,7 +9234,7 @@
   <w:abstractNum w:abstractNumId="28" w15:restartNumberingAfterBreak="0">
     <w:nsid w:val="52BF2B4F"/>
     <w:multiLevelType w:val="hybridMultilevel"/>
-    <w:tmpl w:val="2FC29594"/>
+    <w:tmpl w:val="2ED4F01A"/>
     <w:lvl w:ilvl="0" w:tplc="08090001">
       <w:start w:val="1"/>
       <w:numFmt w:val="bullet"/>
@@ -11042,6 +11120,7 @@
   <w:style w:type="character" w:default="1" w:styleId="DefaultParagraphFont">
     <w:name w:val="Default Paragraph Font"/>
     <w:uiPriority w:val="1"/>
+    <w:semiHidden/>
     <w:unhideWhenUsed/>
   </w:style>
   <w:style w:type="table" w:default="1" w:styleId="TableNormal">

</xml_diff>

<commit_message>
0.0.6.1 - Batch 6.1: Time Manager with extended speed controls and day counter
- Added time.js with TimeManager controlling simulation speed (0, 0.5x, 1x, 2x, 4x, 8x).
- Integrated game delta into main update loop via TimeManager.getGameDelta().
- Added keyboard controls: Space (toggle pause), 1-4 (direct speed), +/- (cycle speed).
- Added speed indicator text in UI, updated every frame.
- Added simple day counter advancing with day cycle, shown in camp info text.
- Fixed resume from pause to restore last non-zero speed.
- Updated TECHNICAL.md with "brief before code" workflow rule.
</commit_message>
<xml_diff>
--- a/Docs/Technical.docx
+++ b/Docs/Technical.docx
@@ -1,6 +1,6 @@
 
 <file path=word/document.xml><?xml version="1.0" encoding="utf-8"?>
-<w:document xmlns:wpc="http://schemas.microsoft.com/office/word/2010/wordprocessingCanvas" xmlns:cx="http://schemas.microsoft.com/office/drawing/2014/chartex" xmlns:cx1="http://schemas.microsoft.com/office/drawing/2015/9/8/chartex" xmlns:cx2="http://schemas.microsoft.com/office/drawing/2015/10/21/chartex" xmlns:cx3="http://schemas.microsoft.com/office/drawing/2016/5/9/chartex" xmlns:cx4="http://schemas.microsoft.com/office/drawing/2016/5/10/chartex" xmlns:cx5="http://schemas.microsoft.com/office/drawing/2016/5/11/chartex" xmlns:cx6="http://schemas.microsoft.com/office/drawing/2016/5/12/chartex" xmlns:cx7="http://schemas.microsoft.com/office/drawing/2016/5/13/chartex" xmlns:cx8="http://schemas.microsoft.com/office/drawing/2016/5/14/chartex" xmlns:mc="http://schemas.openxmlformats.org/markup-compatibility/2006" xmlns:aink="http://schemas.microsoft.com/office/drawing/2016/ink" xmlns:am3d="http://schemas.microsoft.com/office/drawing/2017/model3d" xmlns:o="urn:schemas-microsoft-com:office:office" xmlns:oel="http://schemas.microsoft.com/office/2019/extlst" xmlns:r="http://schemas.openxmlformats.org/officeDocument/2006/relationships" xmlns:m="http://schemas.openxmlformats.org/officeDocument/2006/math" xmlns:v="urn:schemas-microsoft-com:vml" xmlns:wp14="http://schemas.microsoft.com/office/word/2010/wordprocessingDrawing" xmlns:wp="http://schemas.openxmlformats.org/drawingml/2006/wordprocessingDrawing" xmlns:w10="urn:schemas-microsoft-com:office:word" xmlns:w="http://schemas.openxmlformats.org/wordprocessingml/2006/main" xmlns:w14="http://schemas.microsoft.com/office/word/2010/wordml" xmlns:w15="http://schemas.microsoft.com/office/word/2012/wordml" xmlns:w16cex="http://schemas.microsoft.com/office/word/2018/wordml/cex" xmlns:w16cid="http://schemas.microsoft.com/office/word/2016/wordml/cid" xmlns:w16="http://schemas.microsoft.com/office/word/2018/wordml" xmlns:w16du="http://schemas.microsoft.com/office/word/2023/wordml/word16du" xmlns:w16sdtdh="http://schemas.microsoft.com/office/word/2020/wordml/sdtdatahash" xmlns:w16sdtfl="http://schemas.microsoft.com/office/word/2024/wordml/sdtformatlock" xmlns:w16se="http://schemas.microsoft.com/office/word/2015/wordml/symex" xmlns:wpg="http://schemas.microsoft.com/office/word/2010/wordprocessingGroup" xmlns:wpi="http://schemas.microsoft.com/office/word/2010/wordprocessingInk" xmlns:wne="http://schemas.microsoft.com/office/word/2006/wordml" xmlns:wps="http://schemas.microsoft.com/office/word/2010/wordprocessingShape" mc:Ignorable="w14 w15 w16se w16cid w16 w16cex w16sdtdh w16sdtfl w16du wp14">
+<w:document xmlns:wpc="http://schemas.microsoft.com/office/word/2010/wordprocessingCanvas" xmlns:cx="http://schemas.microsoft.com/office/drawing/2014/chartex" xmlns:cx1="http://schemas.microsoft.com/office/drawing/2015/9/8/chartex" xmlns:cx2="http://schemas.microsoft.com/office/drawing/2015/10/21/chartex" xmlns:cx3="http://schemas.microsoft.com/office/drawing/2016/5/9/chartex" xmlns:cx4="http://schemas.microsoft.com/office/drawing/2016/5/10/chartex" xmlns:cx5="http://schemas.microsoft.com/office/drawing/2016/5/11/chartex" xmlns:cx6="http://schemas.microsoft.com/office/drawing/2016/5/12/chartex" xmlns:cx7="http://schemas.microsoft.com/office/drawing/2016/5/13/chartex" xmlns:cx8="http://schemas.microsoft.com/office/drawing/2016/5/14/chartex" xmlns:mc="http://schemas.openxmlformats.org/markup-compatibility/2006" xmlns:aink="http://schemas.microsoft.com/office/drawing/2016/ink" xmlns:am3d="http://schemas.microsoft.com/office/drawing/2017/model3d" xmlns:o="urn:schemas-microsoft-com:office:office" xmlns:oel="http://schemas.microsoft.com/office/2019/extlst" xmlns:r="http://schemas.openxmlformats.org/officeDocument/2006/relationships" xmlns:m="http://schemas.openxmlformats.org/officeDocument/2006/math" xmlns:v="urn:schemas-microsoft-com:vml" xmlns:wp14="http://schemas.microsoft.com/office/word/2010/wordprocessingDrawing" xmlns:wp="http://schemas.openxmlformats.org/drawingml/2006/wordprocessingDrawing" xmlns:w10="urn:schemas-microsoft-com:office:word" xmlns:w="http://schemas.openxmlformats.org/wordprocessingml/2006/main" xmlns:w14="http://schemas.microsoft.com/office/word/2010/wordml" xmlns:w15="http://schemas.microsoft.com/office/word/2012/wordml" xmlns:w16cei="http://schemas.microsoft.com/office/word/2026/wordml/cei" xmlns:w16cex="http://schemas.microsoft.com/office/word/2018/wordml/cex" xmlns:w16cid="http://schemas.microsoft.com/office/word/2016/wordml/cid" xmlns:w16="http://schemas.microsoft.com/office/word/2018/wordml" xmlns:w16du="http://schemas.microsoft.com/office/word/2023/wordml/word16du" xmlns:w16sdtdh="http://schemas.microsoft.com/office/word/2020/wordml/sdtdatahash" xmlns:w16sdtfl="http://schemas.microsoft.com/office/word/2024/wordml/sdtformatlock" xmlns:w16se="http://schemas.microsoft.com/office/word/2015/wordml/symex" xmlns:wpg="http://schemas.microsoft.com/office/word/2010/wordprocessingGroup" xmlns:wpi="http://schemas.microsoft.com/office/word/2010/wordprocessingInk" xmlns:wne="http://schemas.microsoft.com/office/word/2006/wordml" xmlns:wps="http://schemas.microsoft.com/office/word/2010/wordprocessingShape" mc:Ignorable="w14 w15 w16se w16cid w16 w16cex w16sdtdh w16sdtfl w16du wp14">
   <w:body>
     <w:p>
       <w:pPr>
@@ -4452,6 +4452,44 @@
     </w:p>
     <w:p>
       <w:pPr>
+        <w:pStyle w:val="ListParagraph"/>
+        <w:numPr>
+          <w:ilvl w:val="0"/>
+          <w:numId w:val="26"/>
+        </w:numPr>
+        <w:rPr>
+          <w:lang w:val="it-IT"/>
+        </w:rPr>
+      </w:pPr>
+      <w:r>
+        <w:rPr>
+          <w:b/>
+          <w:bCs/>
+          <w:lang w:val="it-IT"/>
+        </w:rPr>
+        <w:t>Brief prima del codice</w:t>
+      </w:r>
+      <w:r>
+        <w:rPr>
+          <w:lang w:val="it-IT"/>
+        </w:rPr>
+        <w:t>: prima di fornire qualsiasi blocco di codice, l'assistente farà un breve riepilogo di ciò che sta per proporre, spiegando le modifiche in linguaggio semplice e chiedendo conferma esplicita all'utente. Solo dopo la conferma, mostrerà il codice. Questo evita di dover cancellare o riscrivere codice non desiderato e mantiene il flusso di lavoro ordinato.</w:t>
+      </w:r>
+    </w:p>
+    <w:p>
+      <w:pPr>
+        <w:pStyle w:val="ListParagraph"/>
+        <w:numPr>
+          <w:ilvl w:val="0"/>
+          <w:numId w:val="26"/>
+        </w:numPr>
+        <w:rPr>
+          <w:lang w:val="it-IT"/>
+        </w:rPr>
+      </w:pPr>
+    </w:p>
+    <w:p>
+      <w:pPr>
         <w:rPr>
           <w:lang w:val="it-IT"/>
         </w:rPr>
@@ -4527,6 +4565,7 @@
         <w:rPr>
           <w:lang w:val="it-IT"/>
         </w:rPr>
+        <w:lastRenderedPageBreak/>
         <w:t>Ogni modifica è accompagnata da un breve commento che spiega cosa fa e perché.</w:t>
       </w:r>
     </w:p>
@@ -4591,7 +4630,6 @@
           <w:bCs/>
           <w:lang w:val="it-IT"/>
         </w:rPr>
-        <w:lastRenderedPageBreak/>
         <w:t>Principio di non-assunzione:</w:t>
       </w:r>
       <w:r>
@@ -5047,6 +5085,7 @@
         <w:rPr>
           <w:lang w:val="it-IT"/>
         </w:rPr>
+        <w:lastRenderedPageBreak/>
         <w:t xml:space="preserve">Per garantire che l'assistente stia leggendo il contenuto reale del repository e non basandosi solo sulla cronologia della chat, in fondo al file TECHNICAL.md è presente un numero progressivo (es. `SYNC: 1`). Dopo ogni </w:t>
       </w:r>
       <w:proofErr w:type="spellStart"/>
@@ -5073,14 +5112,7 @@
         <w:rPr>
           <w:lang w:val="it-IT"/>
         </w:rPr>
-        <w:t xml:space="preserve"> questo numero. All'inizio di ogni risposta che </w:t>
-      </w:r>
-      <w:r>
-        <w:rPr>
-          <w:lang w:val="it-IT"/>
-        </w:rPr>
-        <w:lastRenderedPageBreak/>
-        <w:t>richiede accesso al repository, l'assistente dovrà riportare il numero SYNC che ha letto, confermando così di aver effettivamente consultato i file su GitHub.</w:t>
+        <w:t xml:space="preserve"> questo numero. All'inizio di ogni risposta che richiede accesso al repository, l'assistente dovrà riportare il numero SYNC che ha letto, confermando così di aver effettivamente consultato i file su GitHub.</w:t>
       </w:r>
     </w:p>
     <w:p>
@@ -5436,7 +5468,14 @@
         <w:rPr>
           <w:lang w:val="it-IT"/>
         </w:rPr>
-        <w:t xml:space="preserve"> di test, overlay informativi) vengono descritti con il loro impatto attuale e il potenziale riutilizzo futuro come meccaniche di gioco, mantenendo sempre un chiaro distinguo tra "debug" e "gameplay".</w:t>
+        <w:t xml:space="preserve"> di test, overlay informativi) vengono descritti con il loro impatto attuale e il potenziale </w:t>
+      </w:r>
+      <w:r>
+        <w:rPr>
+          <w:lang w:val="it-IT"/>
+        </w:rPr>
+        <w:lastRenderedPageBreak/>
+        <w:t>riutilizzo futuro come meccaniche di gioco, mantenendo sempre un chiaro distinguo tra "debug" e "gameplay".</w:t>
       </w:r>
     </w:p>
     <w:p>
@@ -5456,7 +5495,6 @@
           <w:bCs/>
           <w:lang w:val="it-IT"/>
         </w:rPr>
-        <w:lastRenderedPageBreak/>
         <w:t>Spiegazione del codice fornito</w:t>
       </w:r>
       <w:r>
@@ -5825,6 +5863,7 @@
         <w:rPr>
           <w:lang w:val="it-IT"/>
         </w:rPr>
+        <w:lastRenderedPageBreak/>
         <w:t>Alla fine di ogni sessione, l'assistente ricorderà all'utente di:</w:t>
       </w:r>
     </w:p>
@@ -5843,7 +5882,6 @@
         <w:rPr>
           <w:lang w:val="it-IT"/>
         </w:rPr>
-        <w:lastRenderedPageBreak/>
         <w:t>Verificare se i documenti di design (GDD, roadmap, concept) devono essere aggiornati per riflettere le nuove meccaniche implementate o le decisioni prese durante la sessione.</w:t>
       </w:r>
     </w:p>
@@ -6007,7 +6045,7 @@
 </file>
 
 <file path=word/numbering.xml><?xml version="1.0" encoding="utf-8"?>
-<w:numbering xmlns:wpc="http://schemas.microsoft.com/office/word/2010/wordprocessingCanvas" xmlns:cx="http://schemas.microsoft.com/office/drawing/2014/chartex" xmlns:cx1="http://schemas.microsoft.com/office/drawing/2015/9/8/chartex" xmlns:cx2="http://schemas.microsoft.com/office/drawing/2015/10/21/chartex" xmlns:cx3="http://schemas.microsoft.com/office/drawing/2016/5/9/chartex" xmlns:cx4="http://schemas.microsoft.com/office/drawing/2016/5/10/chartex" xmlns:cx5="http://schemas.microsoft.com/office/drawing/2016/5/11/chartex" xmlns:cx6="http://schemas.microsoft.com/office/drawing/2016/5/12/chartex" xmlns:cx7="http://schemas.microsoft.com/office/drawing/2016/5/13/chartex" xmlns:cx8="http://schemas.microsoft.com/office/drawing/2016/5/14/chartex" xmlns:mc="http://schemas.openxmlformats.org/markup-compatibility/2006" xmlns:aink="http://schemas.microsoft.com/office/drawing/2016/ink" xmlns:am3d="http://schemas.microsoft.com/office/drawing/2017/model3d" xmlns:o="urn:schemas-microsoft-com:office:office" xmlns:oel="http://schemas.microsoft.com/office/2019/extlst" xmlns:r="http://schemas.openxmlformats.org/officeDocument/2006/relationships" xmlns:m="http://schemas.openxmlformats.org/officeDocument/2006/math" xmlns:v="urn:schemas-microsoft-com:vml" xmlns:wp14="http://schemas.microsoft.com/office/word/2010/wordprocessingDrawing" xmlns:wp="http://schemas.openxmlformats.org/drawingml/2006/wordprocessingDrawing" xmlns:w10="urn:schemas-microsoft-com:office:word" xmlns:w="http://schemas.openxmlformats.org/wordprocessingml/2006/main" xmlns:w14="http://schemas.microsoft.com/office/word/2010/wordml" xmlns:w15="http://schemas.microsoft.com/office/word/2012/wordml" xmlns:w16cex="http://schemas.microsoft.com/office/word/2018/wordml/cex" xmlns:w16cid="http://schemas.microsoft.com/office/word/2016/wordml/cid" xmlns:w16="http://schemas.microsoft.com/office/word/2018/wordml" xmlns:w16du="http://schemas.microsoft.com/office/word/2023/wordml/word16du" xmlns:w16sdtdh="http://schemas.microsoft.com/office/word/2020/wordml/sdtdatahash" xmlns:w16sdtfl="http://schemas.microsoft.com/office/word/2024/wordml/sdtformatlock" xmlns:w16se="http://schemas.microsoft.com/office/word/2015/wordml/symex" xmlns:wpg="http://schemas.microsoft.com/office/word/2010/wordprocessingGroup" xmlns:wpi="http://schemas.microsoft.com/office/word/2010/wordprocessingInk" xmlns:wne="http://schemas.microsoft.com/office/word/2006/wordml" xmlns:wps="http://schemas.microsoft.com/office/word/2010/wordprocessingShape" mc:Ignorable="w14 w15 w16se w16cid w16 w16cex w16sdtdh w16sdtfl w16du wp14">
+<w:numbering xmlns:wpc="http://schemas.microsoft.com/office/word/2010/wordprocessingCanvas" xmlns:cx="http://schemas.microsoft.com/office/drawing/2014/chartex" xmlns:cx1="http://schemas.microsoft.com/office/drawing/2015/9/8/chartex" xmlns:cx2="http://schemas.microsoft.com/office/drawing/2015/10/21/chartex" xmlns:cx3="http://schemas.microsoft.com/office/drawing/2016/5/9/chartex" xmlns:cx4="http://schemas.microsoft.com/office/drawing/2016/5/10/chartex" xmlns:cx5="http://schemas.microsoft.com/office/drawing/2016/5/11/chartex" xmlns:cx6="http://schemas.microsoft.com/office/drawing/2016/5/12/chartex" xmlns:cx7="http://schemas.microsoft.com/office/drawing/2016/5/13/chartex" xmlns:cx8="http://schemas.microsoft.com/office/drawing/2016/5/14/chartex" xmlns:mc="http://schemas.openxmlformats.org/markup-compatibility/2006" xmlns:aink="http://schemas.microsoft.com/office/drawing/2016/ink" xmlns:am3d="http://schemas.microsoft.com/office/drawing/2017/model3d" xmlns:o="urn:schemas-microsoft-com:office:office" xmlns:oel="http://schemas.microsoft.com/office/2019/extlst" xmlns:r="http://schemas.openxmlformats.org/officeDocument/2006/relationships" xmlns:m="http://schemas.openxmlformats.org/officeDocument/2006/math" xmlns:v="urn:schemas-microsoft-com:vml" xmlns:wp14="http://schemas.microsoft.com/office/word/2010/wordprocessingDrawing" xmlns:wp="http://schemas.openxmlformats.org/drawingml/2006/wordprocessingDrawing" xmlns:w10="urn:schemas-microsoft-com:office:word" xmlns:w="http://schemas.openxmlformats.org/wordprocessingml/2006/main" xmlns:w14="http://schemas.microsoft.com/office/word/2010/wordml" xmlns:w15="http://schemas.microsoft.com/office/word/2012/wordml" xmlns:w16cei="http://schemas.microsoft.com/office/word/2026/wordml/cei" xmlns:w16cex="http://schemas.microsoft.com/office/word/2018/wordml/cex" xmlns:w16cid="http://schemas.microsoft.com/office/word/2016/wordml/cid" xmlns:w16="http://schemas.microsoft.com/office/word/2018/wordml" xmlns:w16du="http://schemas.microsoft.com/office/word/2023/wordml/word16du" xmlns:w16sdtdh="http://schemas.microsoft.com/office/word/2020/wordml/sdtdatahash" xmlns:w16sdtfl="http://schemas.microsoft.com/office/word/2024/wordml/sdtformatlock" xmlns:w16se="http://schemas.microsoft.com/office/word/2015/wordml/symex" xmlns:wpg="http://schemas.microsoft.com/office/word/2010/wordprocessingGroup" xmlns:wpi="http://schemas.microsoft.com/office/word/2010/wordprocessingInk" xmlns:wne="http://schemas.microsoft.com/office/word/2006/wordml" xmlns:wps="http://schemas.microsoft.com/office/word/2010/wordprocessingShape" mc:Ignorable="w14 w15 w16se w16cid w16 w16cex w16sdtdh w16sdtfl w16du wp14">
   <w:abstractNum w:abstractNumId="0" w15:restartNumberingAfterBreak="0">
     <w:nsid w:val="02082034"/>
     <w:multiLevelType w:val="hybridMultilevel"/>

</xml_diff>

<commit_message>
0.0.6.6.1 - Batch 6.6.1 - Add local gathering radius visualization and fixes to debug panel loading and expeditions logic
- Move debug.js script after local-worker-panel in index.html to fix null reference error.
- Add local gathering radius circle when camp is selected.
- Add selected local cell highlight border.
- Update local worker panel visibility and numbers in game loop.
- Update Technical.md with instructions for code explanation in step-by-step guides.
- Fixes bugs to expeditions logic
</commit_message>
<xml_diff>
--- a/Docs/Technical.docx
+++ b/Docs/Technical.docx
@@ -5193,8 +5193,13 @@
         </w:numPr>
       </w:pPr>
       <w:r>
-        <w:t>Concept Semplificato</w:t>
-      </w:r>
+        <w:t xml:space="preserve">Concept </w:t>
+      </w:r>
+      <w:proofErr w:type="spellStart"/>
+      <w:r>
+        <w:t>Semplificato</w:t>
+      </w:r>
+      <w:proofErr w:type="spellEnd"/>
     </w:p>
     <w:p>
       <w:pPr>
@@ -5492,18 +5497,86 @@
         </w:rPr>
         <w:t>: prima di fornire qualsiasi blocco di codice, l'assistente farà un breve riepilogo di ciò che sta per proporre, spiegando le modifiche in linguaggio semplice e chiedendo conferma esplicita all'utente. Solo dopo la conferma, mostrerà il codice. Questo evita di dover cancellare o riscrivere codice non desiderato e mantiene il flusso di lavoro ordinato.</w:t>
       </w:r>
-    </w:p>
-    <w:p>
-      <w:pPr>
-        <w:pStyle w:val="ListParagraph"/>
+      <w:r>
+        <w:rPr>
+          <w:lang w:val="it-IT"/>
+        </w:rPr>
+        <w:t xml:space="preserve"> </w:t>
+      </w:r>
+      <w:r>
+        <w:rPr>
+          <w:rFonts w:ascii="Consolas" w:hAnsi="Consolas"/>
+          <w:color w:val="0F1115"/>
+          <w:lang w:val="it-IT"/>
+        </w:rPr>
+        <w:t>Nessun blocco di codice verrà fornito se prima non è stato approvato il relativo brief.</w:t>
+      </w:r>
+    </w:p>
+    <w:p>
+      <w:pPr>
+        <w:pStyle w:val="HTMLPreformatted"/>
         <w:numPr>
           <w:ilvl w:val="0"/>
           <w:numId w:val="26"/>
         </w:numPr>
-        <w:rPr>
-          <w:lang w:val="it-IT"/>
-        </w:rPr>
-      </w:pPr>
+        <w:wordWrap w:val="0"/>
+        <w:spacing w:line="330" w:lineRule="atLeast"/>
+        <w:rPr>
+          <w:rFonts w:ascii="Consolas" w:hAnsi="Consolas"/>
+          <w:color w:val="0F1115"/>
+          <w:lang w:val="it-IT"/>
+        </w:rPr>
+      </w:pPr>
+      <w:r>
+        <w:rPr>
+          <w:rFonts w:ascii="Consolas" w:hAnsi="Consolas"/>
+          <w:color w:val="0F1115"/>
+          <w:lang w:val="it-IT"/>
+        </w:rPr>
+        <w:t xml:space="preserve">- **Brief prima del codice**: l'assistente fornirà sempre un breve riepilogo delle modifiche proposte e attenderà l'approvazione esplicita dell'utente prima di mostrare il codice. </w:t>
+      </w:r>
+    </w:p>
+    <w:p>
+      <w:pPr>
+        <w:pStyle w:val="HTMLPreformatted"/>
+        <w:numPr>
+          <w:ilvl w:val="0"/>
+          <w:numId w:val="26"/>
+        </w:numPr>
+        <w:wordWrap w:val="0"/>
+        <w:spacing w:line="330" w:lineRule="atLeast"/>
+        <w:rPr>
+          <w:rFonts w:ascii="Consolas" w:hAnsi="Consolas"/>
+          <w:color w:val="0F1115"/>
+          <w:lang w:val="it-IT"/>
+        </w:rPr>
+      </w:pPr>
+      <w:r>
+        <w:rPr>
+          <w:rFonts w:ascii="Consolas" w:hAnsi="Consolas"/>
+          <w:color w:val="0F1115"/>
+          <w:lang w:val="it-IT"/>
+        </w:rPr>
+        <w:t>**</w:t>
+      </w:r>
+      <w:r>
+        <w:rPr>
+          <w:rFonts w:ascii="Consolas" w:hAnsi="Consolas"/>
+          <w:b/>
+          <w:bCs/>
+          <w:color w:val="0F1115"/>
+          <w:lang w:val="it-IT"/>
+        </w:rPr>
+        <w:t>Input condivisi</w:t>
+      </w:r>
+      <w:r>
+        <w:rPr>
+          <w:rFonts w:ascii="Consolas" w:hAnsi="Consolas"/>
+          <w:color w:val="0F1115"/>
+          <w:lang w:val="it-IT"/>
+        </w:rPr>
+        <w:t>:** ogni scorciatoia o interazione va discussa prima dell'implementazione, specificando scopo e possibili conflitti.</w:t>
+      </w:r>
     </w:p>
     <w:p>
       <w:pPr>
@@ -5792,6 +5865,7 @@
         <w:rPr>
           <w:lang w:val="it-IT"/>
         </w:rPr>
+        <w:lastRenderedPageBreak/>
         <w:t>Specificare se il TECHNICAL.md richiede aggiornamenti per nuove strutture dati, funzioni o regole di workflow.</w:t>
       </w:r>
     </w:p>
@@ -5837,7 +5911,6 @@
         <w:rPr>
           <w:lang w:val="it-IT"/>
         </w:rPr>
-        <w:lastRenderedPageBreak/>
         <w:t xml:space="preserve">L'assistente non scriverà la descrizione del </w:t>
       </w:r>
       <w:proofErr w:type="spellStart"/>
@@ -6089,60 +6162,6 @@
         <w:pStyle w:val="Heading2"/>
       </w:pPr>
       <w:r>
-        <w:t>Verifica dell’accesso al repository</w:t>
-      </w:r>
-    </w:p>
-    <w:p>
-      <w:pPr>
-        <w:rPr>
-          <w:lang w:val="it-IT"/>
-        </w:rPr>
-      </w:pPr>
-      <w:r>
-        <w:rPr>
-          <w:lang w:val="it-IT"/>
-        </w:rPr>
-        <w:t xml:space="preserve">Per garantire che l'assistente stia leggendo il contenuto reale del repository e non basandosi solo sulla cronologia della chat, in fondo al file TECHNICAL.md è presente un numero progressivo (es. `SYNC: 1`). Dopo ogni </w:t>
-      </w:r>
-      <w:proofErr w:type="spellStart"/>
-      <w:r>
-        <w:rPr>
-          <w:lang w:val="it-IT"/>
-        </w:rPr>
-        <w:t>push</w:t>
-      </w:r>
-      <w:proofErr w:type="spellEnd"/>
-      <w:r>
-        <w:rPr>
-          <w:lang w:val="it-IT"/>
-        </w:rPr>
-        <w:t xml:space="preserve">, l'utente </w:t>
-      </w:r>
-      <w:r>
-        <w:rPr>
-          <w:lang w:val="it-IT"/>
-        </w:rPr>
-        <w:t>cambierà</w:t>
-      </w:r>
-      <w:r>
-        <w:rPr>
-          <w:lang w:val="it-IT"/>
-        </w:rPr>
-        <w:t xml:space="preserve"> questo numero. All'inizio di ogni risposta che richiede accesso al repository, l'assistente dovrà riportare il numero SYNC che ha letto, confermando così di aver effettivamente consultato i file su GitHub.</w:t>
-      </w:r>
-    </w:p>
-    <w:p>
-      <w:pPr>
-        <w:rPr>
-          <w:lang w:val="it-IT"/>
-        </w:rPr>
-      </w:pPr>
-    </w:p>
-    <w:p>
-      <w:pPr>
-        <w:pStyle w:val="Heading2"/>
-      </w:pPr>
-      <w:r>
         <w:t>Commenti e auto-documentazione</w:t>
       </w:r>
     </w:p>
@@ -6270,7 +6289,6 @@
         <w:rPr>
           <w:lang w:val="it-IT"/>
         </w:rPr>
-        <w:lastRenderedPageBreak/>
         <w:t>Questa scelta facilita la coerenza, la ricerca di aiuto online e la portabilità del progetto.</w:t>
       </w:r>
     </w:p>
@@ -6326,16 +6344,141 @@
     </w:p>
     <w:p>
       <w:pPr>
-        <w:pStyle w:val="ds-markdown-paragraph"/>
-        <w:shd w:val="clear" w:color="auto" w:fill="FFFFFF"/>
-        <w:spacing w:before="0" w:beforeAutospacing="0" w:after="0" w:afterAutospacing="0"/>
-        <w:ind w:left="720"/>
-        <w:rPr>
-          <w:rFonts w:ascii="Segoe UI" w:hAnsi="Segoe UI" w:cs="Segoe UI"/>
+        <w:pStyle w:val="ListParagraph"/>
+        <w:numPr>
+          <w:ilvl w:val="0"/>
+          <w:numId w:val="13"/>
+        </w:numPr>
+        <w:rPr>
+          <w:lang w:val="it-IT"/>
+        </w:rPr>
+      </w:pPr>
+      <w:r>
+        <w:rPr>
+          <w:b/>
+          <w:bCs/>
+          <w:lang w:val="it-IT"/>
+        </w:rPr>
+        <w:lastRenderedPageBreak/>
+        <w:t>Ricerca spaziale e raggi:</w:t>
+      </w:r>
+      <w:r>
+        <w:rPr>
+          <w:lang w:val="it-IT"/>
+        </w:rPr>
+        <w:t> quando si definisce un raggio (es. </w:t>
+      </w:r>
+      <w:proofErr w:type="spellStart"/>
+      <w:r>
+        <w:rPr>
+          <w:lang w:val="it-IT"/>
+        </w:rPr>
+        <w:t>areaRadius</w:t>
+      </w:r>
+      <w:proofErr w:type="spellEnd"/>
+      <w:r>
+        <w:rPr>
+          <w:lang w:val="it-IT"/>
+        </w:rPr>
+        <w:t>, </w:t>
+      </w:r>
+      <w:proofErr w:type="spellStart"/>
+      <w:r>
+        <w:rPr>
+          <w:lang w:val="it-IT"/>
+        </w:rPr>
+        <w:t>localGatherRadius</w:t>
+      </w:r>
+      <w:proofErr w:type="spellEnd"/>
+      <w:r>
+        <w:rPr>
+          <w:lang w:val="it-IT"/>
+        </w:rPr>
+        <w:t>), la selezione delle celle deve essere sempre limitata da una distanza circolare dal centro, non da una griglia quadrata. Il loop può iterare su un rettangolo di celle, ma ogni cella deve essere testata con </w:t>
+      </w:r>
+      <w:proofErr w:type="spellStart"/>
+      <w:r>
+        <w:rPr>
+          <w:lang w:val="it-IT"/>
+        </w:rPr>
+        <w:t>Phaser.Math.Distance.Between</w:t>
+      </w:r>
+      <w:proofErr w:type="spellEnd"/>
+      <w:r>
+        <w:rPr>
+          <w:lang w:val="it-IT"/>
+        </w:rPr>
+        <w:t xml:space="preserve">(...) </w:t>
+      </w:r>
+      <w:r>
+        <w:t xml:space="preserve">&lt;= </w:t>
+      </w:r>
+      <w:proofErr w:type="spellStart"/>
+      <w:r>
+        <w:t>raggio</w:t>
+      </w:r>
+      <w:proofErr w:type="spellEnd"/>
+      <w:r>
+        <w:t>.</w:t>
+      </w:r>
+    </w:p>
+    <w:p>
+      <w:pPr>
+        <w:pStyle w:val="HTMLPreformatted"/>
+        <w:numPr>
+          <w:ilvl w:val="0"/>
+          <w:numId w:val="13"/>
+        </w:numPr>
+        <w:wordWrap w:val="0"/>
+        <w:spacing w:line="330" w:lineRule="atLeast"/>
+        <w:rPr>
+          <w:rFonts w:ascii="Consolas" w:hAnsi="Consolas"/>
           <w:color w:val="0F1115"/>
           <w:lang w:val="it-IT"/>
         </w:rPr>
       </w:pPr>
+      <w:r>
+        <w:rPr>
+          <w:rFonts w:ascii="Consolas" w:hAnsi="Consolas"/>
+          <w:color w:val="0F1115"/>
+          <w:lang w:val="it-IT"/>
+        </w:rPr>
+        <w:t>**</w:t>
+      </w:r>
+      <w:r>
+        <w:rPr>
+          <w:rFonts w:ascii="Consolas" w:hAnsi="Consolas"/>
+          <w:b/>
+          <w:bCs/>
+          <w:color w:val="0F1115"/>
+          <w:lang w:val="it-IT"/>
+        </w:rPr>
+        <w:t>Game state</w:t>
+      </w:r>
+      <w:r>
+        <w:rPr>
+          <w:rFonts w:ascii="Consolas" w:hAnsi="Consolas"/>
+          <w:color w:val="0F1115"/>
+          <w:lang w:val="it-IT"/>
+        </w:rPr>
+        <w:t xml:space="preserve">:** le modalità di gioco devono essere separate. </w:t>
+      </w:r>
+      <w:r>
+        <w:rPr>
+          <w:rFonts w:ascii="Consolas" w:hAnsi="Consolas"/>
+          <w:color w:val="0F1115"/>
+          <w:lang w:val="it-IT"/>
+        </w:rPr>
+        <w:t>Esempio: l</w:t>
+      </w:r>
+      <w:r>
+        <w:rPr>
+          <w:rFonts w:ascii="Consolas" w:hAnsi="Consolas"/>
+          <w:color w:val="0F1115"/>
+          <w:lang w:val="it-IT"/>
+        </w:rPr>
+        <w:t>a selezione del campo attiva lo stato "gestione campo", in cui i click sulla mappa hanno significato diverso. Non si devono mischiare input di stati diversi.</w:t>
+      </w:r>
     </w:p>
     <w:p>
       <w:pPr>
@@ -6840,6 +6983,224 @@
     </w:p>
     <w:p>
       <w:pPr>
+        <w:pStyle w:val="Heading3"/>
+        <w:rPr>
+          <w:lang w:eastAsia="en-GB"/>
+        </w:rPr>
+      </w:pPr>
+      <w:r>
+        <w:rPr>
+          <w:lang w:eastAsia="en-GB"/>
+        </w:rPr>
+        <w:t xml:space="preserve">Spiegazione del codice nelle istruzioni passo </w:t>
+      </w:r>
+      <w:proofErr w:type="spellStart"/>
+      <w:r>
+        <w:rPr>
+          <w:lang w:eastAsia="en-GB"/>
+        </w:rPr>
+        <w:t>passo</w:t>
+      </w:r>
+      <w:proofErr w:type="spellEnd"/>
+    </w:p>
+    <w:p>
+      <w:pPr>
+        <w:rPr>
+          <w:lang w:eastAsia="en-GB"/>
+        </w:rPr>
+      </w:pPr>
+      <w:r>
+        <w:rPr>
+          <w:lang w:val="it-IT" w:eastAsia="en-GB"/>
+        </w:rPr>
+        <w:t>Quando vengono fornite istruzioni operative (</w:t>
+      </w:r>
+      <w:proofErr w:type="spellStart"/>
+      <w:r>
+        <w:rPr>
+          <w:lang w:val="it-IT" w:eastAsia="en-GB"/>
+        </w:rPr>
+        <w:t>step-by-step</w:t>
+      </w:r>
+      <w:proofErr w:type="spellEnd"/>
+      <w:r>
+        <w:rPr>
+          <w:lang w:val="it-IT" w:eastAsia="en-GB"/>
+        </w:rPr>
+        <w:t>) che includono blocchi di codice da incollare, </w:t>
+      </w:r>
+      <w:r>
+        <w:rPr>
+          <w:b/>
+          <w:bCs/>
+          <w:lang w:val="it-IT" w:eastAsia="en-GB"/>
+        </w:rPr>
+        <w:t>ogni blocco di codice deve essere accompagnato da una spiegazione immediatamente precedente o successiva</w:t>
+      </w:r>
+      <w:r>
+        <w:rPr>
+          <w:lang w:val="it-IT" w:eastAsia="en-GB"/>
+        </w:rPr>
+        <w:t xml:space="preserve">, scritta in linguaggio semplice. </w:t>
+      </w:r>
+      <w:r>
+        <w:rPr>
+          <w:lang w:eastAsia="en-GB"/>
+        </w:rPr>
+        <w:t xml:space="preserve">La </w:t>
+      </w:r>
+      <w:proofErr w:type="spellStart"/>
+      <w:r>
+        <w:rPr>
+          <w:lang w:eastAsia="en-GB"/>
+        </w:rPr>
+        <w:t>spiegazione</w:t>
+      </w:r>
+      <w:proofErr w:type="spellEnd"/>
+      <w:r>
+        <w:rPr>
+          <w:lang w:eastAsia="en-GB"/>
+        </w:rPr>
+        <w:t xml:space="preserve"> </w:t>
+      </w:r>
+      <w:proofErr w:type="spellStart"/>
+      <w:r>
+        <w:rPr>
+          <w:lang w:eastAsia="en-GB"/>
+        </w:rPr>
+        <w:t>deve</w:t>
+      </w:r>
+      <w:proofErr w:type="spellEnd"/>
+      <w:r>
+        <w:rPr>
+          <w:lang w:eastAsia="en-GB"/>
+        </w:rPr>
+        <w:t xml:space="preserve"> </w:t>
+      </w:r>
+      <w:proofErr w:type="spellStart"/>
+      <w:r>
+        <w:rPr>
+          <w:lang w:eastAsia="en-GB"/>
+        </w:rPr>
+        <w:t>chiarire</w:t>
+      </w:r>
+      <w:proofErr w:type="spellEnd"/>
+      <w:r>
+        <w:rPr>
+          <w:lang w:eastAsia="en-GB"/>
+        </w:rPr>
+        <w:t>:</w:t>
+      </w:r>
+    </w:p>
+    <w:p>
+      <w:pPr>
+        <w:numPr>
+          <w:ilvl w:val="0"/>
+          <w:numId w:val="44"/>
+        </w:numPr>
+        <w:rPr>
+          <w:lang w:eastAsia="en-GB"/>
+        </w:rPr>
+      </w:pPr>
+      <w:proofErr w:type="spellStart"/>
+      <w:r>
+        <w:rPr>
+          <w:lang w:eastAsia="en-GB"/>
+        </w:rPr>
+        <w:t>cosa</w:t>
+      </w:r>
+      <w:proofErr w:type="spellEnd"/>
+      <w:r>
+        <w:rPr>
+          <w:lang w:eastAsia="en-GB"/>
+        </w:rPr>
+        <w:t xml:space="preserve"> fa </w:t>
+      </w:r>
+      <w:proofErr w:type="spellStart"/>
+      <w:r>
+        <w:rPr>
+          <w:lang w:eastAsia="en-GB"/>
+        </w:rPr>
+        <w:t>quel</w:t>
+      </w:r>
+      <w:proofErr w:type="spellEnd"/>
+      <w:r>
+        <w:rPr>
+          <w:lang w:eastAsia="en-GB"/>
+        </w:rPr>
+        <w:t xml:space="preserve"> </w:t>
+      </w:r>
+      <w:proofErr w:type="spellStart"/>
+      <w:r>
+        <w:rPr>
+          <w:lang w:eastAsia="en-GB"/>
+        </w:rPr>
+        <w:t>codice</w:t>
+      </w:r>
+      <w:proofErr w:type="spellEnd"/>
+      <w:r>
+        <w:rPr>
+          <w:lang w:eastAsia="en-GB"/>
+        </w:rPr>
+        <w:t>,</w:t>
+      </w:r>
+    </w:p>
+    <w:p>
+      <w:pPr>
+        <w:numPr>
+          <w:ilvl w:val="0"/>
+          <w:numId w:val="44"/>
+        </w:numPr>
+        <w:rPr>
+          <w:lang w:val="it-IT" w:eastAsia="en-GB"/>
+        </w:rPr>
+      </w:pPr>
+      <w:r>
+        <w:rPr>
+          <w:lang w:val="it-IT" w:eastAsia="en-GB"/>
+        </w:rPr>
+        <w:t>perché è necessario in quel punto,</w:t>
+      </w:r>
+    </w:p>
+    <w:p>
+      <w:pPr>
+        <w:numPr>
+          <w:ilvl w:val="0"/>
+          <w:numId w:val="44"/>
+        </w:numPr>
+        <w:rPr>
+          <w:lang w:val="it-IT" w:eastAsia="en-GB"/>
+        </w:rPr>
+      </w:pPr>
+      <w:r>
+        <w:rPr>
+          <w:lang w:val="it-IT" w:eastAsia="en-GB"/>
+        </w:rPr>
+        <w:t>come si collega alle funzioni o variabili già esistenti.</w:t>
+      </w:r>
+    </w:p>
+    <w:p>
+      <w:pPr>
+        <w:rPr>
+          <w:lang w:val="it-IT" w:eastAsia="en-GB"/>
+        </w:rPr>
+      </w:pPr>
+      <w:r>
+        <w:rPr>
+          <w:lang w:val="it-IT" w:eastAsia="en-GB"/>
+        </w:rPr>
+        <w:t>Le istruzioni non devono limitarsi a dire “incolla questo”, ma devono permettere all’utente di comprendere l’effetto della modifica anche senza rileggere l’intera conversazione.</w:t>
+      </w:r>
+    </w:p>
+    <w:p>
+      <w:pPr>
+        <w:rPr>
+          <w:lang w:val="it-IT" w:eastAsia="en-GB"/>
+        </w:rPr>
+      </w:pPr>
+    </w:p>
+    <w:p>
+      <w:pPr>
         <w:pStyle w:val="Heading2"/>
       </w:pPr>
       <w:r>
@@ -6945,6 +7306,7 @@
         <w:pStyle w:val="Heading2"/>
       </w:pPr>
       <w:r>
+        <w:lastRenderedPageBreak/>
         <w:t>Aggiornamento della documentazione al termine di ogni sessione</w:t>
       </w:r>
     </w:p>
@@ -7049,7 +7411,6 @@
       </w:pPr>
       <w:proofErr w:type="spellStart"/>
       <w:r>
-        <w:lastRenderedPageBreak/>
         <w:t>Pannello</w:t>
       </w:r>
       <w:proofErr w:type="spellEnd"/>
@@ -12089,6 +12450,155 @@
     </w:lvl>
   </w:abstractNum>
   <w:abstractNum w:abstractNumId="41" w15:restartNumberingAfterBreak="0">
+    <w:nsid w:val="73FE17CE"/>
+    <w:multiLevelType w:val="multilevel"/>
+    <w:tmpl w:val="FD2288FC"/>
+    <w:lvl w:ilvl="0">
+      <w:start w:val="1"/>
+      <w:numFmt w:val="bullet"/>
+      <w:lvlText w:val=""/>
+      <w:lvlJc w:val="left"/>
+      <w:pPr>
+        <w:tabs>
+          <w:tab w:val="num" w:pos="720"/>
+        </w:tabs>
+        <w:ind w:left="720" w:hanging="360"/>
+      </w:pPr>
+      <w:rPr>
+        <w:rFonts w:ascii="Symbol" w:hAnsi="Symbol" w:hint="default"/>
+        <w:sz w:val="20"/>
+      </w:rPr>
+    </w:lvl>
+    <w:lvl w:ilvl="1" w:tentative="1">
+      <w:start w:val="1"/>
+      <w:numFmt w:val="bullet"/>
+      <w:lvlText w:val="o"/>
+      <w:lvlJc w:val="left"/>
+      <w:pPr>
+        <w:tabs>
+          <w:tab w:val="num" w:pos="1440"/>
+        </w:tabs>
+        <w:ind w:left="1440" w:hanging="360"/>
+      </w:pPr>
+      <w:rPr>
+        <w:rFonts w:ascii="Courier New" w:hAnsi="Courier New" w:hint="default"/>
+        <w:sz w:val="20"/>
+      </w:rPr>
+    </w:lvl>
+    <w:lvl w:ilvl="2" w:tentative="1">
+      <w:start w:val="1"/>
+      <w:numFmt w:val="bullet"/>
+      <w:lvlText w:val=""/>
+      <w:lvlJc w:val="left"/>
+      <w:pPr>
+        <w:tabs>
+          <w:tab w:val="num" w:pos="2160"/>
+        </w:tabs>
+        <w:ind w:left="2160" w:hanging="360"/>
+      </w:pPr>
+      <w:rPr>
+        <w:rFonts w:ascii="Wingdings" w:hAnsi="Wingdings" w:hint="default"/>
+        <w:sz w:val="20"/>
+      </w:rPr>
+    </w:lvl>
+    <w:lvl w:ilvl="3" w:tentative="1">
+      <w:start w:val="1"/>
+      <w:numFmt w:val="bullet"/>
+      <w:lvlText w:val=""/>
+      <w:lvlJc w:val="left"/>
+      <w:pPr>
+        <w:tabs>
+          <w:tab w:val="num" w:pos="2880"/>
+        </w:tabs>
+        <w:ind w:left="2880" w:hanging="360"/>
+      </w:pPr>
+      <w:rPr>
+        <w:rFonts w:ascii="Wingdings" w:hAnsi="Wingdings" w:hint="default"/>
+        <w:sz w:val="20"/>
+      </w:rPr>
+    </w:lvl>
+    <w:lvl w:ilvl="4" w:tentative="1">
+      <w:start w:val="1"/>
+      <w:numFmt w:val="bullet"/>
+      <w:lvlText w:val=""/>
+      <w:lvlJc w:val="left"/>
+      <w:pPr>
+        <w:tabs>
+          <w:tab w:val="num" w:pos="3600"/>
+        </w:tabs>
+        <w:ind w:left="3600" w:hanging="360"/>
+      </w:pPr>
+      <w:rPr>
+        <w:rFonts w:ascii="Wingdings" w:hAnsi="Wingdings" w:hint="default"/>
+        <w:sz w:val="20"/>
+      </w:rPr>
+    </w:lvl>
+    <w:lvl w:ilvl="5" w:tentative="1">
+      <w:start w:val="1"/>
+      <w:numFmt w:val="bullet"/>
+      <w:lvlText w:val=""/>
+      <w:lvlJc w:val="left"/>
+      <w:pPr>
+        <w:tabs>
+          <w:tab w:val="num" w:pos="4320"/>
+        </w:tabs>
+        <w:ind w:left="4320" w:hanging="360"/>
+      </w:pPr>
+      <w:rPr>
+        <w:rFonts w:ascii="Wingdings" w:hAnsi="Wingdings" w:hint="default"/>
+        <w:sz w:val="20"/>
+      </w:rPr>
+    </w:lvl>
+    <w:lvl w:ilvl="6" w:tentative="1">
+      <w:start w:val="1"/>
+      <w:numFmt w:val="bullet"/>
+      <w:lvlText w:val=""/>
+      <w:lvlJc w:val="left"/>
+      <w:pPr>
+        <w:tabs>
+          <w:tab w:val="num" w:pos="5040"/>
+        </w:tabs>
+        <w:ind w:left="5040" w:hanging="360"/>
+      </w:pPr>
+      <w:rPr>
+        <w:rFonts w:ascii="Wingdings" w:hAnsi="Wingdings" w:hint="default"/>
+        <w:sz w:val="20"/>
+      </w:rPr>
+    </w:lvl>
+    <w:lvl w:ilvl="7" w:tentative="1">
+      <w:start w:val="1"/>
+      <w:numFmt w:val="bullet"/>
+      <w:lvlText w:val=""/>
+      <w:lvlJc w:val="left"/>
+      <w:pPr>
+        <w:tabs>
+          <w:tab w:val="num" w:pos="5760"/>
+        </w:tabs>
+        <w:ind w:left="5760" w:hanging="360"/>
+      </w:pPr>
+      <w:rPr>
+        <w:rFonts w:ascii="Wingdings" w:hAnsi="Wingdings" w:hint="default"/>
+        <w:sz w:val="20"/>
+      </w:rPr>
+    </w:lvl>
+    <w:lvl w:ilvl="8" w:tentative="1">
+      <w:start w:val="1"/>
+      <w:numFmt w:val="bullet"/>
+      <w:lvlText w:val=""/>
+      <w:lvlJc w:val="left"/>
+      <w:pPr>
+        <w:tabs>
+          <w:tab w:val="num" w:pos="6480"/>
+        </w:tabs>
+        <w:ind w:left="6480" w:hanging="360"/>
+      </w:pPr>
+      <w:rPr>
+        <w:rFonts w:ascii="Wingdings" w:hAnsi="Wingdings" w:hint="default"/>
+        <w:sz w:val="20"/>
+      </w:rPr>
+    </w:lvl>
+  </w:abstractNum>
+  <w:abstractNum w:abstractNumId="42" w15:restartNumberingAfterBreak="0">
     <w:nsid w:val="78B87E11"/>
     <w:multiLevelType w:val="hybridMultilevel"/>
     <w:tmpl w:val="34BEB166"/>
@@ -12201,7 +12711,7 @@
       </w:rPr>
     </w:lvl>
   </w:abstractNum>
-  <w:abstractNum w:abstractNumId="42" w15:restartNumberingAfterBreak="0">
+  <w:abstractNum w:abstractNumId="43" w15:restartNumberingAfterBreak="0">
     <w:nsid w:val="7A057021"/>
     <w:multiLevelType w:val="hybridMultilevel"/>
     <w:tmpl w:val="D0F02678"/>
@@ -12396,7 +12906,7 @@
     <w:abstractNumId w:val="27"/>
   </w:num>
   <w:num w:numId="28" w16cid:durableId="123037925">
-    <w:abstractNumId w:val="42"/>
+    <w:abstractNumId w:val="43"/>
   </w:num>
   <w:num w:numId="29" w16cid:durableId="132869381">
     <w:abstractNumId w:val="6"/>
@@ -12426,7 +12936,7 @@
     <w:abstractNumId w:val="16"/>
   </w:num>
   <w:num w:numId="38" w16cid:durableId="86267498">
-    <w:abstractNumId w:val="41"/>
+    <w:abstractNumId w:val="42"/>
   </w:num>
   <w:num w:numId="39" w16cid:durableId="153689867">
     <w:abstractNumId w:val="30"/>
@@ -12442,6 +12952,9 @@
   </w:num>
   <w:num w:numId="43" w16cid:durableId="1288900058">
     <w:abstractNumId w:val="4"/>
+  </w:num>
+  <w:num w:numId="44" w16cid:durableId="1564757590">
+    <w:abstractNumId w:val="41"/>
   </w:num>
 </w:numbering>
 </file>

</xml_diff>